<commit_message>
Deploying to gh-pages from @ Morrison-Lab/sds@c5a11753a08157ca997aea95e02540d97fb083b8 🚀
</commit_message>
<xml_diff>
--- a/bayesian-examples-handout.docx
+++ b/bayesian-examples-handout.docx
@@ -15,7 +15,7 @@
         <w:pStyle w:val="Date"/>
       </w:pPr>
       <w:r>
-        <w:t xml:space="preserve">Last modified: 2026-10-05 21:00:14 (PDT)</w:t>
+        <w:t xml:space="preserve">Last modified: 2026-10-05 23:57:11 (PDT)</w:t>
       </w:r>
     </w:p>
     <w:p>
@@ -1716,37 +1716,31 @@
           </m:rPr>
           <m:t>=</m:t>
         </m:r>
-        <m:sSup>
+        <m:sSub>
           <m:e>
-            <m:sSub>
+            <m:acc>
+              <m:accPr>
+                <m:chr m:val="̃"/>
+              </m:accPr>
               <m:e>
-                <m:acc>
-                  <m:accPr>
-                    <m:chr m:val="̃"/>
-                  </m:accPr>
-                  <m:e>
-                    <m:r>
-                      <m:t>x</m:t>
-                    </m:r>
-                  </m:e>
-                </m:acc>
+                <m:r>
+                  <m:t>x</m:t>
+                </m:r>
               </m:e>
-              <m:sub>
-                <m:r>
-                  <m:t>i</m:t>
-                </m:r>
-              </m:sub>
-            </m:sSub>
+            </m:acc>
           </m:e>
-          <m:sup>
+          <m:sub>
             <m:r>
-              <m:rPr>
-                <m:sty m:val="p"/>
-              </m:rPr>
-              <m:t>⊤</m:t>
+              <m:t>i</m:t>
             </m:r>
-          </m:sup>
-        </m:sSup>
+          </m:sub>
+        </m:sSub>
+        <m:r>
+          <m:rPr>
+            <m:sty m:val="p"/>
+          </m:rPr>
+          <m:t>⋅</m:t>
+        </m:r>
         <m:acc>
           <m:accPr>
             <m:chr m:val="̃"/>
@@ -1892,9 +1886,18 @@
             </m:r>
           </m:e>
           <m:sub>
-            <m:r>
-              <m:t>j</m:t>
-            </m:r>
+            <m:sSub>
+              <m:e>
+                <m:r>
+                  <m:t>x</m:t>
+                </m:r>
+              </m:e>
+              <m:sub>
+                <m:r>
+                  <m:t>j</m:t>
+                </m:r>
+              </m:sub>
+            </m:sSub>
           </m:sub>
         </m:sSub>
       </m:oMath>
@@ -1940,9 +1943,18 @@
                 </m:r>
               </m:e>
               <m:sub>
-                <m:r>
-                  <m:t>j</m:t>
-                </m:r>
+                <m:sSub>
+                  <m:e>
+                    <m:r>
+                      <m:t>x</m:t>
+                    </m:r>
+                  </m:e>
+                  <m:sub>
+                    <m:r>
+                      <m:t>j</m:t>
+                    </m:r>
+                  </m:sub>
+                </m:sSub>
               </m:sub>
             </m:sSub>
           </m:sup>
@@ -2085,7 +2097,7 @@
           </m:e>
           <m:sub>
             <m:r>
-              <m:t>1</m:t>
+              <m:t>x</m:t>
             </m:r>
           </m:sub>
         </m:sSub>
@@ -2207,7 +2219,7 @@
               </m:e>
               <m:sub>
                 <m:r>
-                  <m:t>1</m:t>
+                  <m:t>x</m:t>
                 </m:r>
               </m:sub>
             </m:sSub>
@@ -2227,6 +2239,85 @@
         <m:r>
           <m:t>x</m:t>
         </m:r>
+      </m:oMath>
+      <w:r>
+        <w:t xml:space="preserve">.</w:t>
+      </w:r>
+      <w:r>
+        <w:t xml:space="preserve"> </w:t>
+      </w:r>
+      <w:r>
+        <w:t xml:space="preserve">In the code,</w:t>
+      </w:r>
+      <w:r>
+        <w:t xml:space="preserve"> </w:t>
+      </w:r>
+      <w:r>
+        <w:rPr>
+          <w:rStyle w:val="VerbatimChar"/>
+        </w:rPr>
+        <w:t xml:space="preserve">beta0</w:t>
+      </w:r>
+      <w:r>
+        <w:t xml:space="preserve"> </w:t>
+      </w:r>
+      <w:r>
+        <w:t xml:space="preserve">and</w:t>
+      </w:r>
+      <w:r>
+        <w:t xml:space="preserve"> </w:t>
+      </w:r>
+      <w:r>
+        <w:rPr>
+          <w:rStyle w:val="VerbatimChar"/>
+        </w:rPr>
+        <w:t xml:space="preserve">beta1</w:t>
+      </w:r>
+      <w:r>
+        <w:t xml:space="preserve"> </w:t>
+      </w:r>
+      <w:r>
+        <w:t xml:space="preserve">are</w:t>
+      </w:r>
+      <w:r>
+        <w:t xml:space="preserve"> </w:t>
+      </w:r>
+      <m:oMath>
+        <m:sSub>
+          <m:e>
+            <m:r>
+              <m:t>β</m:t>
+            </m:r>
+          </m:e>
+          <m:sub>
+            <m:r>
+              <m:t>0</m:t>
+            </m:r>
+          </m:sub>
+        </m:sSub>
+      </m:oMath>
+      <w:r>
+        <w:t xml:space="preserve"> </w:t>
+      </w:r>
+      <w:r>
+        <w:t xml:space="preserve">and</w:t>
+      </w:r>
+      <w:r>
+        <w:t xml:space="preserve"> </w:t>
+      </w:r>
+      <m:oMath>
+        <m:sSub>
+          <m:e>
+            <m:r>
+              <m:t>β</m:t>
+            </m:r>
+          </m:e>
+          <m:sub>
+            <m:r>
+              <m:t>x</m:t>
+            </m:r>
+          </m:sub>
+        </m:sSub>
       </m:oMath>
       <w:r>
         <w:t xml:space="preserve">.</w:t>
@@ -4811,7 +4902,7 @@
               </m:e>
               <m:sub>
                 <m:r>
-                  <m:t>1</m:t>
+                  <m:t>x</m:t>
                 </m:r>
               </m:sub>
             </m:sSub>
@@ -4892,7 +4983,7 @@
           </m:e>
           <m:sub>
             <m:r>
-              <m:t>1</m:t>
+              <m:t>x</m:t>
             </m:r>
           </m:sub>
         </m:sSub>
@@ -5210,1662 +5301,41 @@
       <w:r>
         <w:t xml:space="preserve">so we fit it with the zeros trick.</w:t>
       </w:r>
-    </w:p>
-    <w:p>
-      <w:pPr>
-        <w:pStyle w:val="SourceCode"/>
-      </w:pPr>
-      <w:r>
-        <w:rPr>
-          <w:rStyle w:val="FunctionTok"/>
-        </w:rPr>
-        <w:t xml:space="preserve">set.seed</w:t>
-      </w:r>
-      <w:r>
-        <w:rPr>
-          <w:rStyle w:val="NormalTok"/>
-        </w:rPr>
-        <w:t xml:space="preserve">(</w:t>
-      </w:r>
-      <w:r>
-        <w:rPr>
-          <w:rStyle w:val="DecValTok"/>
-        </w:rPr>
-        <w:t xml:space="preserve">2026</w:t>
-      </w:r>
-      <w:r>
-        <w:rPr>
-          <w:rStyle w:val="NormalTok"/>
-        </w:rPr>
-        <w:t xml:space="preserve">)</w:t>
-      </w:r>
-      <w:r>
-        <w:br/>
-      </w:r>
-      <w:r>
-        <w:rPr>
-          <w:rStyle w:val="NormalTok"/>
-        </w:rPr>
-        <w:t xml:space="preserve">n_obs </w:t>
-      </w:r>
-      <w:r>
-        <w:rPr>
-          <w:rStyle w:val="OtherTok"/>
-        </w:rPr>
-        <w:t xml:space="preserve">&lt;-</w:t>
-      </w:r>
-      <w:r>
-        <w:rPr>
-          <w:rStyle w:val="NormalTok"/>
-        </w:rPr>
-        <w:t xml:space="preserve"> </w:t>
-      </w:r>
-      <w:r>
-        <w:rPr>
-          <w:rStyle w:val="DecValTok"/>
-        </w:rPr>
-        <w:t xml:space="preserve">200</w:t>
-      </w:r>
-      <w:r>
-        <w:rPr>
-          <w:rStyle w:val="NormalTok"/>
-        </w:rPr>
-        <w:t xml:space="preserve">L</w:t>
-      </w:r>
-      <w:r>
-        <w:br/>
-      </w:r>
-      <w:r>
-        <w:rPr>
-          <w:rStyle w:val="NormalTok"/>
-        </w:rPr>
-        <w:t xml:space="preserve">x </w:t>
-      </w:r>
-      <w:r>
-        <w:rPr>
-          <w:rStyle w:val="OtherTok"/>
-        </w:rPr>
-        <w:t xml:space="preserve">&lt;-</w:t>
-      </w:r>
-      <w:r>
-        <w:rPr>
-          <w:rStyle w:val="NormalTok"/>
-        </w:rPr>
-        <w:t xml:space="preserve"> stats</w:t>
-      </w:r>
-      <w:r>
-        <w:rPr>
-          <w:rStyle w:val="SpecialCharTok"/>
-        </w:rPr>
-        <w:t xml:space="preserve">::</w:t>
-      </w:r>
-      <w:r>
-        <w:rPr>
-          <w:rStyle w:val="FunctionTok"/>
-        </w:rPr>
-        <w:t xml:space="preserve">rbinom</w:t>
-      </w:r>
-      <w:r>
-        <w:rPr>
-          <w:rStyle w:val="NormalTok"/>
-        </w:rPr>
-        <w:t xml:space="preserve">(n_obs, </w:t>
-      </w:r>
-      <w:r>
-        <w:rPr>
-          <w:rStyle w:val="AttributeTok"/>
-        </w:rPr>
-        <w:t xml:space="preserve">size =</w:t>
-      </w:r>
-      <w:r>
-        <w:rPr>
-          <w:rStyle w:val="NormalTok"/>
-        </w:rPr>
-        <w:t xml:space="preserve"> </w:t>
-      </w:r>
-      <w:r>
-        <w:rPr>
-          <w:rStyle w:val="DecValTok"/>
-        </w:rPr>
-        <w:t xml:space="preserve">1</w:t>
-      </w:r>
-      <w:r>
-        <w:rPr>
-          <w:rStyle w:val="NormalTok"/>
-        </w:rPr>
-        <w:t xml:space="preserve">, </w:t>
-      </w:r>
-      <w:r>
-        <w:rPr>
-          <w:rStyle w:val="AttributeTok"/>
-        </w:rPr>
-        <w:t xml:space="preserve">prob =</w:t>
-      </w:r>
-      <w:r>
-        <w:rPr>
-          <w:rStyle w:val="NormalTok"/>
-        </w:rPr>
-        <w:t xml:space="preserve"> </w:t>
-      </w:r>
-      <w:r>
-        <w:rPr>
-          <w:rStyle w:val="FloatTok"/>
-        </w:rPr>
-        <w:t xml:space="preserve">0.5</w:t>
-      </w:r>
-      <w:r>
-        <w:rPr>
-          <w:rStyle w:val="NormalTok"/>
-        </w:rPr>
-        <w:t xml:space="preserve">)</w:t>
-      </w:r>
-      <w:r>
-        <w:br/>
-      </w:r>
-      <w:r>
-        <w:rPr>
-          <w:rStyle w:val="NormalTok"/>
-        </w:rPr>
-        <w:t xml:space="preserve">event_time </w:t>
-      </w:r>
-      <w:r>
-        <w:rPr>
-          <w:rStyle w:val="OtherTok"/>
-        </w:rPr>
-        <w:t xml:space="preserve">&lt;-</w:t>
-      </w:r>
-      <w:r>
-        <w:rPr>
-          <w:rStyle w:val="NormalTok"/>
-        </w:rPr>
-        <w:t xml:space="preserve"> stats</w:t>
-      </w:r>
-      <w:r>
-        <w:rPr>
-          <w:rStyle w:val="SpecialCharTok"/>
-        </w:rPr>
-        <w:t xml:space="preserve">::</w:t>
-      </w:r>
-      <w:r>
-        <w:rPr>
-          <w:rStyle w:val="FunctionTok"/>
-        </w:rPr>
-        <w:t xml:space="preserve">rexp</w:t>
-      </w:r>
-      <w:r>
-        <w:rPr>
-          <w:rStyle w:val="NormalTok"/>
-        </w:rPr>
-        <w:t xml:space="preserve">(n_obs, </w:t>
-      </w:r>
-      <w:r>
-        <w:rPr>
-          <w:rStyle w:val="AttributeTok"/>
-        </w:rPr>
-        <w:t xml:space="preserve">rate =</w:t>
-      </w:r>
-      <w:r>
-        <w:rPr>
-          <w:rStyle w:val="NormalTok"/>
-        </w:rPr>
-        <w:t xml:space="preserve"> </w:t>
-      </w:r>
-      <w:r>
-        <w:rPr>
-          <w:rStyle w:val="FunctionTok"/>
-        </w:rPr>
-        <w:t xml:space="preserve">exp</w:t>
-      </w:r>
-      <w:r>
-        <w:rPr>
-          <w:rStyle w:val="NormalTok"/>
-        </w:rPr>
-        <w:t xml:space="preserve">(</w:t>
-      </w:r>
-      <w:r>
-        <w:rPr>
-          <w:rStyle w:val="FunctionTok"/>
-        </w:rPr>
-        <w:t xml:space="preserve">log</w:t>
-      </w:r>
-      <w:r>
-        <w:rPr>
-          <w:rStyle w:val="NormalTok"/>
-        </w:rPr>
-        <w:t xml:space="preserve">(</w:t>
-      </w:r>
-      <w:r>
-        <w:rPr>
-          <w:rStyle w:val="FloatTok"/>
-        </w:rPr>
-        <w:t xml:space="preserve">0.05</w:t>
-      </w:r>
-      <w:r>
-        <w:rPr>
-          <w:rStyle w:val="NormalTok"/>
-        </w:rPr>
-        <w:t xml:space="preserve">) </w:t>
-      </w:r>
-      <w:r>
-        <w:rPr>
-          <w:rStyle w:val="SpecialCharTok"/>
-        </w:rPr>
-        <w:t xml:space="preserve">-</w:t>
-      </w:r>
-      <w:r>
-        <w:rPr>
-          <w:rStyle w:val="NormalTok"/>
-        </w:rPr>
-        <w:t xml:space="preserve"> </w:t>
-      </w:r>
-      <w:r>
-        <w:rPr>
-          <w:rStyle w:val="FloatTok"/>
-        </w:rPr>
-        <w:t xml:space="preserve">0.7</w:t>
-      </w:r>
-      <w:r>
-        <w:rPr>
-          <w:rStyle w:val="NormalTok"/>
-        </w:rPr>
-        <w:t xml:space="preserve"> </w:t>
-      </w:r>
-      <w:r>
-        <w:rPr>
-          <w:rStyle w:val="SpecialCharTok"/>
-        </w:rPr>
-        <w:t xml:space="preserve">*</w:t>
-      </w:r>
-      <w:r>
-        <w:rPr>
-          <w:rStyle w:val="NormalTok"/>
-        </w:rPr>
-        <w:t xml:space="preserve"> x))</w:t>
-      </w:r>
-      <w:r>
-        <w:br/>
-      </w:r>
-      <w:r>
-        <w:rPr>
-          <w:rStyle w:val="NormalTok"/>
-        </w:rPr>
-        <w:t xml:space="preserve">censor_time </w:t>
-      </w:r>
-      <w:r>
-        <w:rPr>
-          <w:rStyle w:val="OtherTok"/>
-        </w:rPr>
-        <w:t xml:space="preserve">&lt;-</w:t>
-      </w:r>
-      <w:r>
-        <w:rPr>
-          <w:rStyle w:val="NormalTok"/>
-        </w:rPr>
-        <w:t xml:space="preserve"> stats</w:t>
-      </w:r>
-      <w:r>
-        <w:rPr>
-          <w:rStyle w:val="SpecialCharTok"/>
-        </w:rPr>
-        <w:t xml:space="preserve">::</w:t>
-      </w:r>
-      <w:r>
-        <w:rPr>
-          <w:rStyle w:val="FunctionTok"/>
-        </w:rPr>
-        <w:t xml:space="preserve">rexp</w:t>
-      </w:r>
-      <w:r>
-        <w:rPr>
-          <w:rStyle w:val="NormalTok"/>
-        </w:rPr>
-        <w:t xml:space="preserve">(n_obs, </w:t>
-      </w:r>
-      <w:r>
-        <w:rPr>
-          <w:rStyle w:val="AttributeTok"/>
-        </w:rPr>
-        <w:t xml:space="preserve">rate =</w:t>
-      </w:r>
-      <w:r>
-        <w:rPr>
-          <w:rStyle w:val="NormalTok"/>
-        </w:rPr>
-        <w:t xml:space="preserve"> </w:t>
-      </w:r>
-      <w:r>
-        <w:rPr>
-          <w:rStyle w:val="FloatTok"/>
-        </w:rPr>
-        <w:t xml:space="preserve">0.03</w:t>
-      </w:r>
-      <w:r>
-        <w:rPr>
-          <w:rStyle w:val="NormalTok"/>
-        </w:rPr>
-        <w:t xml:space="preserve">)</w:t>
-      </w:r>
-      <w:r>
-        <w:br/>
-      </w:r>
-      <w:r>
-        <w:rPr>
-          <w:rStyle w:val="NormalTok"/>
-        </w:rPr>
-        <w:t xml:space="preserve">follow_up </w:t>
-      </w:r>
-      <w:r>
-        <w:rPr>
-          <w:rStyle w:val="OtherTok"/>
-        </w:rPr>
-        <w:t xml:space="preserve">&lt;-</w:t>
-      </w:r>
-      <w:r>
-        <w:rPr>
-          <w:rStyle w:val="NormalTok"/>
-        </w:rPr>
-        <w:t xml:space="preserve"> </w:t>
-      </w:r>
-      <w:r>
-        <w:rPr>
-          <w:rStyle w:val="FunctionTok"/>
-        </w:rPr>
-        <w:t xml:space="preserve">pmin</w:t>
-      </w:r>
-      <w:r>
-        <w:rPr>
-          <w:rStyle w:val="NormalTok"/>
-        </w:rPr>
-        <w:t xml:space="preserve">(event_time, censor_time)</w:t>
-      </w:r>
-      <w:r>
-        <w:br/>
-      </w:r>
-      <w:r>
-        <w:rPr>
-          <w:rStyle w:val="NormalTok"/>
-        </w:rPr>
-        <w:t xml:space="preserve">event </w:t>
-      </w:r>
-      <w:r>
-        <w:rPr>
-          <w:rStyle w:val="OtherTok"/>
-        </w:rPr>
-        <w:t xml:space="preserve">&lt;-</w:t>
-      </w:r>
-      <w:r>
-        <w:rPr>
-          <w:rStyle w:val="NormalTok"/>
-        </w:rPr>
-        <w:t xml:space="preserve"> </w:t>
-      </w:r>
-      <w:r>
-        <w:rPr>
-          <w:rStyle w:val="FunctionTok"/>
-        </w:rPr>
-        <w:t xml:space="preserve">as.integer</w:t>
-      </w:r>
-      <w:r>
-        <w:rPr>
-          <w:rStyle w:val="NormalTok"/>
-        </w:rPr>
-        <w:t xml:space="preserve">(event_time </w:t>
-      </w:r>
-      <w:r>
-        <w:rPr>
-          <w:rStyle w:val="SpecialCharTok"/>
-        </w:rPr>
-        <w:t xml:space="preserve">&lt;=</w:t>
-      </w:r>
-      <w:r>
-        <w:rPr>
-          <w:rStyle w:val="NormalTok"/>
-        </w:rPr>
-        <w:t xml:space="preserve"> censor_time)</w:t>
-      </w:r>
-      <w:r>
-        <w:br/>
-      </w:r>
-      <w:r>
-        <w:br/>
-      </w:r>
-      <w:r>
-        <w:rPr>
-          <w:rStyle w:val="NormalTok"/>
-        </w:rPr>
-        <w:t xml:space="preserve">survival_model </w:t>
-      </w:r>
-      <w:r>
-        <w:rPr>
-          <w:rStyle w:val="OtherTok"/>
-        </w:rPr>
-        <w:t xml:space="preserve">&lt;-</w:t>
-      </w:r>
-      <w:r>
-        <w:rPr>
-          <w:rStyle w:val="NormalTok"/>
-        </w:rPr>
-        <w:t xml:space="preserve"> </w:t>
-      </w:r>
-      <w:r>
-        <w:rPr>
-          <w:rStyle w:val="StringTok"/>
-        </w:rPr>
-        <w:t xml:space="preserve">"</w:t>
-      </w:r>
-      <w:r>
-        <w:br/>
-      </w:r>
-      <w:r>
-        <w:rPr>
-          <w:rStyle w:val="StringTok"/>
-        </w:rPr>
-        <w:t xml:space="preserve">model {</w:t>
-      </w:r>
-      <w:r>
-        <w:br/>
-      </w:r>
-      <w:r>
-        <w:rPr>
-          <w:rStyle w:val="StringTok"/>
-        </w:rPr>
-        <w:t xml:space="preserve">  C &lt;- 10000</w:t>
-      </w:r>
-      <w:r>
-        <w:br/>
-      </w:r>
-      <w:r>
-        <w:rPr>
-          <w:rStyle w:val="StringTok"/>
-        </w:rPr>
-        <w:t xml:space="preserve">  for (i in 1:N) {</w:t>
-      </w:r>
-      <w:r>
-        <w:br/>
-      </w:r>
-      <w:r>
-        <w:rPr>
-          <w:rStyle w:val="StringTok"/>
-        </w:rPr>
-        <w:t xml:space="preserve">    log(lambda[i]) &lt;- beta0 + beta1 * x[i]</w:t>
-      </w:r>
-      <w:r>
-        <w:br/>
-      </w:r>
-      <w:r>
-        <w:rPr>
-          <w:rStyle w:val="StringTok"/>
-        </w:rPr>
-        <w:t xml:space="preserve">    loglik[i] &lt;- event[i] * log(lambda[i]) - lambda[i] * follow_up[i]</w:t>
-      </w:r>
-      <w:r>
-        <w:br/>
-      </w:r>
-      <w:r>
-        <w:rPr>
-          <w:rStyle w:val="StringTok"/>
-        </w:rPr>
-        <w:t xml:space="preserve">    zeros[i] ~ dpois(C - loglik[i])</w:t>
-      </w:r>
-      <w:r>
-        <w:br/>
-      </w:r>
-      <w:r>
-        <w:rPr>
-          <w:rStyle w:val="StringTok"/>
-        </w:rPr>
-        <w:t xml:space="preserve">  }</w:t>
-      </w:r>
-      <w:r>
-        <w:br/>
-      </w:r>
-      <w:r>
-        <w:rPr>
-          <w:rStyle w:val="StringTok"/>
-        </w:rPr>
-        <w:t xml:space="preserve">  beta0 ~ dnorm(0, 0.01)</w:t>
-      </w:r>
-      <w:r>
-        <w:br/>
-      </w:r>
-      <w:r>
-        <w:rPr>
-          <w:rStyle w:val="StringTok"/>
-        </w:rPr>
-        <w:t xml:space="preserve">  beta1 ~ dnorm(0, 0.01)</w:t>
-      </w:r>
-      <w:r>
-        <w:br/>
-      </w:r>
-      <w:r>
-        <w:rPr>
-          <w:rStyle w:val="StringTok"/>
-        </w:rPr>
-        <w:t xml:space="preserve">  HR &lt;- exp(beta1)</w:t>
-      </w:r>
-      <w:r>
-        <w:br/>
-      </w:r>
-      <w:r>
-        <w:rPr>
-          <w:rStyle w:val="StringTok"/>
-        </w:rPr>
-        <w:t xml:space="preserve">}</w:t>
-      </w:r>
-      <w:r>
-        <w:br/>
-      </w:r>
-      <w:r>
-        <w:rPr>
-          <w:rStyle w:val="StringTok"/>
-        </w:rPr>
-        <w:t xml:space="preserve">"</w:t>
-      </w:r>
-      <w:r>
-        <w:br/>
-      </w:r>
-      <w:r>
-        <w:rPr>
-          <w:rStyle w:val="NormalTok"/>
-        </w:rPr>
-        <w:t xml:space="preserve">inits </w:t>
-      </w:r>
-      <w:r>
-        <w:rPr>
-          <w:rStyle w:val="OtherTok"/>
-        </w:rPr>
-        <w:t xml:space="preserve">&lt;-</w:t>
-      </w:r>
-      <w:r>
-        <w:rPr>
-          <w:rStyle w:val="NormalTok"/>
-        </w:rPr>
-        <w:t xml:space="preserve"> </w:t>
-      </w:r>
-      <w:r>
-        <w:rPr>
-          <w:rStyle w:val="FunctionTok"/>
-        </w:rPr>
-        <w:t xml:space="preserve">list</w:t>
-      </w:r>
-      <w:r>
-        <w:rPr>
-          <w:rStyle w:val="NormalTok"/>
-        </w:rPr>
-        <w:t xml:space="preserve">(</w:t>
-      </w:r>
-      <w:r>
-        <w:br/>
-      </w:r>
-      <w:r>
-        <w:rPr>
-          <w:rStyle w:val="NormalTok"/>
-        </w:rPr>
-        <w:t xml:space="preserve">  </w:t>
-      </w:r>
-      <w:r>
-        <w:rPr>
-          <w:rStyle w:val="FunctionTok"/>
-        </w:rPr>
-        <w:t xml:space="preserve">list</w:t>
-      </w:r>
-      <w:r>
-        <w:rPr>
-          <w:rStyle w:val="NormalTok"/>
-        </w:rPr>
-        <w:t xml:space="preserve">(</w:t>
-      </w:r>
-      <w:r>
-        <w:rPr>
-          <w:rStyle w:val="AttributeTok"/>
-        </w:rPr>
-        <w:t xml:space="preserve">.RNG.name =</w:t>
-      </w:r>
-      <w:r>
-        <w:rPr>
-          <w:rStyle w:val="NormalTok"/>
-        </w:rPr>
-        <w:t xml:space="preserve"> </w:t>
-      </w:r>
-      <w:r>
-        <w:rPr>
-          <w:rStyle w:val="StringTok"/>
-        </w:rPr>
-        <w:t xml:space="preserve">"base::Mersenne-Twister"</w:t>
-      </w:r>
-      <w:r>
-        <w:rPr>
-          <w:rStyle w:val="NormalTok"/>
-        </w:rPr>
-        <w:t xml:space="preserve">, </w:t>
-      </w:r>
-      <w:r>
-        <w:rPr>
-          <w:rStyle w:val="AttributeTok"/>
-        </w:rPr>
-        <w:t xml:space="preserve">.RNG.seed =</w:t>
-      </w:r>
-      <w:r>
-        <w:rPr>
-          <w:rStyle w:val="NormalTok"/>
-        </w:rPr>
-        <w:t xml:space="preserve"> </w:t>
-      </w:r>
-      <w:r>
-        <w:rPr>
-          <w:rStyle w:val="DecValTok"/>
-        </w:rPr>
-        <w:t xml:space="preserve">1</w:t>
-      </w:r>
-      <w:r>
-        <w:rPr>
-          <w:rStyle w:val="NormalTok"/>
-        </w:rPr>
-        <w:t xml:space="preserve">),</w:t>
-      </w:r>
-      <w:r>
-        <w:br/>
-      </w:r>
-      <w:r>
-        <w:rPr>
-          <w:rStyle w:val="NormalTok"/>
-        </w:rPr>
-        <w:t xml:space="preserve">  </w:t>
-      </w:r>
-      <w:r>
-        <w:rPr>
-          <w:rStyle w:val="FunctionTok"/>
-        </w:rPr>
-        <w:t xml:space="preserve">list</w:t>
-      </w:r>
-      <w:r>
-        <w:rPr>
-          <w:rStyle w:val="NormalTok"/>
-        </w:rPr>
-        <w:t xml:space="preserve">(</w:t>
-      </w:r>
-      <w:r>
-        <w:rPr>
-          <w:rStyle w:val="AttributeTok"/>
-        </w:rPr>
-        <w:t xml:space="preserve">.RNG.name =</w:t>
-      </w:r>
-      <w:r>
-        <w:rPr>
-          <w:rStyle w:val="NormalTok"/>
-        </w:rPr>
-        <w:t xml:space="preserve"> </w:t>
-      </w:r>
-      <w:r>
-        <w:rPr>
-          <w:rStyle w:val="StringTok"/>
-        </w:rPr>
-        <w:t xml:space="preserve">"base::Mersenne-Twister"</w:t>
-      </w:r>
-      <w:r>
-        <w:rPr>
-          <w:rStyle w:val="NormalTok"/>
-        </w:rPr>
-        <w:t xml:space="preserve">, </w:t>
-      </w:r>
-      <w:r>
-        <w:rPr>
-          <w:rStyle w:val="AttributeTok"/>
-        </w:rPr>
-        <w:t xml:space="preserve">.RNG.seed =</w:t>
-      </w:r>
-      <w:r>
-        <w:rPr>
-          <w:rStyle w:val="NormalTok"/>
-        </w:rPr>
-        <w:t xml:space="preserve"> </w:t>
-      </w:r>
-      <w:r>
-        <w:rPr>
-          <w:rStyle w:val="DecValTok"/>
-        </w:rPr>
-        <w:t xml:space="preserve">2</w:t>
-      </w:r>
-      <w:r>
-        <w:rPr>
-          <w:rStyle w:val="NormalTok"/>
-        </w:rPr>
-        <w:t xml:space="preserve">)</w:t>
-      </w:r>
-      <w:r>
-        <w:br/>
-      </w:r>
-      <w:r>
-        <w:rPr>
-          <w:rStyle w:val="NormalTok"/>
-        </w:rPr>
-        <w:t xml:space="preserve">)</w:t>
-      </w:r>
-      <w:r>
-        <w:br/>
-      </w:r>
-      <w:r>
-        <w:rPr>
-          <w:rStyle w:val="NormalTok"/>
-        </w:rPr>
-        <w:t xml:space="preserve">fit </w:t>
-      </w:r>
-      <w:r>
-        <w:rPr>
-          <w:rStyle w:val="OtherTok"/>
-        </w:rPr>
-        <w:t xml:space="preserve">&lt;-</w:t>
-      </w:r>
-      <w:r>
-        <w:rPr>
-          <w:rStyle w:val="NormalTok"/>
-        </w:rPr>
-        <w:t xml:space="preserve"> rjags</w:t>
-      </w:r>
-      <w:r>
-        <w:rPr>
-          <w:rStyle w:val="SpecialCharTok"/>
-        </w:rPr>
-        <w:t xml:space="preserve">::</w:t>
-      </w:r>
-      <w:r>
-        <w:rPr>
-          <w:rStyle w:val="FunctionTok"/>
-        </w:rPr>
-        <w:t xml:space="preserve">jags.model</w:t>
-      </w:r>
-      <w:r>
-        <w:rPr>
-          <w:rStyle w:val="NormalTok"/>
-        </w:rPr>
-        <w:t xml:space="preserve">(</w:t>
-      </w:r>
-      <w:r>
-        <w:br/>
-      </w:r>
-      <w:r>
-        <w:rPr>
-          <w:rStyle w:val="NormalTok"/>
-        </w:rPr>
-        <w:t xml:space="preserve">  </w:t>
-      </w:r>
-      <w:r>
-        <w:rPr>
-          <w:rStyle w:val="FunctionTok"/>
-        </w:rPr>
-        <w:t xml:space="preserve">textConnection</w:t>
-      </w:r>
-      <w:r>
-        <w:rPr>
-          <w:rStyle w:val="NormalTok"/>
-        </w:rPr>
-        <w:t xml:space="preserve">(survival_model),</w:t>
-      </w:r>
-      <w:r>
-        <w:br/>
-      </w:r>
-      <w:r>
-        <w:rPr>
-          <w:rStyle w:val="NormalTok"/>
-        </w:rPr>
-        <w:t xml:space="preserve">  </w:t>
-      </w:r>
-      <w:r>
-        <w:rPr>
-          <w:rStyle w:val="AttributeTok"/>
-        </w:rPr>
-        <w:t xml:space="preserve">data =</w:t>
-      </w:r>
-      <w:r>
-        <w:rPr>
-          <w:rStyle w:val="NormalTok"/>
-        </w:rPr>
-        <w:t xml:space="preserve"> </w:t>
-      </w:r>
-      <w:r>
-        <w:rPr>
-          <w:rStyle w:val="FunctionTok"/>
-        </w:rPr>
-        <w:t xml:space="preserve">list</w:t>
-      </w:r>
-      <w:r>
-        <w:rPr>
-          <w:rStyle w:val="NormalTok"/>
-        </w:rPr>
-        <w:t xml:space="preserve">(</w:t>
-      </w:r>
-      <w:r>
-        <w:br/>
-      </w:r>
-      <w:r>
-        <w:rPr>
-          <w:rStyle w:val="NormalTok"/>
-        </w:rPr>
-        <w:t xml:space="preserve">    </w:t>
-      </w:r>
-      <w:r>
-        <w:rPr>
-          <w:rStyle w:val="AttributeTok"/>
-        </w:rPr>
-        <w:t xml:space="preserve">follow_up =</w:t>
-      </w:r>
-      <w:r>
-        <w:rPr>
-          <w:rStyle w:val="NormalTok"/>
-        </w:rPr>
-        <w:t xml:space="preserve"> follow_up, </w:t>
-      </w:r>
-      <w:r>
-        <w:rPr>
-          <w:rStyle w:val="AttributeTok"/>
-        </w:rPr>
-        <w:t xml:space="preserve">x =</w:t>
-      </w:r>
-      <w:r>
-        <w:rPr>
-          <w:rStyle w:val="NormalTok"/>
-        </w:rPr>
-        <w:t xml:space="preserve"> x, </w:t>
-      </w:r>
-      <w:r>
-        <w:rPr>
-          <w:rStyle w:val="AttributeTok"/>
-        </w:rPr>
-        <w:t xml:space="preserve">event =</w:t>
-      </w:r>
-      <w:r>
-        <w:rPr>
-          <w:rStyle w:val="NormalTok"/>
-        </w:rPr>
-        <w:t xml:space="preserve"> event,</w:t>
-      </w:r>
-      <w:r>
-        <w:br/>
-      </w:r>
-      <w:r>
-        <w:rPr>
-          <w:rStyle w:val="NormalTok"/>
-        </w:rPr>
-        <w:t xml:space="preserve">    </w:t>
-      </w:r>
-      <w:r>
-        <w:rPr>
-          <w:rStyle w:val="AttributeTok"/>
-        </w:rPr>
-        <w:t xml:space="preserve">N =</w:t>
-      </w:r>
-      <w:r>
-        <w:rPr>
-          <w:rStyle w:val="NormalTok"/>
-        </w:rPr>
-        <w:t xml:space="preserve"> n_obs, </w:t>
-      </w:r>
-      <w:r>
-        <w:rPr>
-          <w:rStyle w:val="AttributeTok"/>
-        </w:rPr>
-        <w:t xml:space="preserve">zeros =</w:t>
-      </w:r>
-      <w:r>
-        <w:rPr>
-          <w:rStyle w:val="NormalTok"/>
-        </w:rPr>
-        <w:t xml:space="preserve"> </w:t>
-      </w:r>
-      <w:r>
-        <w:rPr>
-          <w:rStyle w:val="FunctionTok"/>
-        </w:rPr>
-        <w:t xml:space="preserve">rep</w:t>
-      </w:r>
-      <w:r>
-        <w:rPr>
-          <w:rStyle w:val="NormalTok"/>
-        </w:rPr>
-        <w:t xml:space="preserve">(</w:t>
-      </w:r>
-      <w:r>
-        <w:rPr>
-          <w:rStyle w:val="DecValTok"/>
-        </w:rPr>
-        <w:t xml:space="preserve">0</w:t>
-      </w:r>
-      <w:r>
-        <w:rPr>
-          <w:rStyle w:val="NormalTok"/>
-        </w:rPr>
-        <w:t xml:space="preserve">, n_obs)</w:t>
-      </w:r>
-      <w:r>
-        <w:br/>
-      </w:r>
-      <w:r>
-        <w:rPr>
-          <w:rStyle w:val="NormalTok"/>
-        </w:rPr>
-        <w:t xml:space="preserve">  ),</w:t>
-      </w:r>
-      <w:r>
-        <w:br/>
-      </w:r>
-      <w:r>
-        <w:rPr>
-          <w:rStyle w:val="NormalTok"/>
-        </w:rPr>
-        <w:t xml:space="preserve">  </w:t>
-      </w:r>
-      <w:r>
-        <w:rPr>
-          <w:rStyle w:val="AttributeTok"/>
-        </w:rPr>
-        <w:t xml:space="preserve">inits =</w:t>
-      </w:r>
-      <w:r>
-        <w:rPr>
-          <w:rStyle w:val="NormalTok"/>
-        </w:rPr>
-        <w:t xml:space="preserve"> inits,</w:t>
-      </w:r>
-      <w:r>
-        <w:br/>
-      </w:r>
-      <w:r>
-        <w:rPr>
-          <w:rStyle w:val="NormalTok"/>
-        </w:rPr>
-        <w:t xml:space="preserve">  </w:t>
-      </w:r>
-      <w:r>
-        <w:rPr>
-          <w:rStyle w:val="AttributeTok"/>
-        </w:rPr>
-        <w:t xml:space="preserve">n.chains =</w:t>
-      </w:r>
-      <w:r>
-        <w:rPr>
-          <w:rStyle w:val="NormalTok"/>
-        </w:rPr>
-        <w:t xml:space="preserve"> </w:t>
-      </w:r>
-      <w:r>
-        <w:rPr>
-          <w:rStyle w:val="DecValTok"/>
-        </w:rPr>
-        <w:t xml:space="preserve">2</w:t>
-      </w:r>
-      <w:r>
-        <w:rPr>
-          <w:rStyle w:val="NormalTok"/>
-        </w:rPr>
-        <w:t xml:space="preserve">,</w:t>
-      </w:r>
-      <w:r>
-        <w:br/>
-      </w:r>
-      <w:r>
-        <w:rPr>
-          <w:rStyle w:val="NormalTok"/>
-        </w:rPr>
-        <w:t xml:space="preserve">  </w:t>
-      </w:r>
-      <w:r>
-        <w:rPr>
-          <w:rStyle w:val="AttributeTok"/>
-        </w:rPr>
-        <w:t xml:space="preserve">quiet =</w:t>
-      </w:r>
-      <w:r>
-        <w:rPr>
-          <w:rStyle w:val="NormalTok"/>
-        </w:rPr>
-        <w:t xml:space="preserve"> </w:t>
-      </w:r>
-      <w:r>
-        <w:rPr>
-          <w:rStyle w:val="ConstantTok"/>
-        </w:rPr>
-        <w:t xml:space="preserve">TRUE</w:t>
-      </w:r>
-      <w:r>
-        <w:br/>
-      </w:r>
-      <w:r>
-        <w:rPr>
-          <w:rStyle w:val="NormalTok"/>
-        </w:rPr>
-        <w:t xml:space="preserve">)</w:t>
-      </w:r>
-      <w:r>
-        <w:br/>
-      </w:r>
-      <w:r>
-        <w:rPr>
-          <w:rStyle w:val="NormalTok"/>
-        </w:rPr>
-        <w:t xml:space="preserve">stats</w:t>
-      </w:r>
-      <w:r>
-        <w:rPr>
-          <w:rStyle w:val="SpecialCharTok"/>
-        </w:rPr>
-        <w:t xml:space="preserve">::</w:t>
-      </w:r>
-      <w:r>
-        <w:rPr>
-          <w:rStyle w:val="FunctionTok"/>
-        </w:rPr>
-        <w:t xml:space="preserve">update</w:t>
-      </w:r>
-      <w:r>
-        <w:rPr>
-          <w:rStyle w:val="NormalTok"/>
-        </w:rPr>
-        <w:t xml:space="preserve">(fit, </w:t>
-      </w:r>
-      <w:r>
-        <w:rPr>
-          <w:rStyle w:val="AttributeTok"/>
-        </w:rPr>
-        <w:t xml:space="preserve">n.iter =</w:t>
-      </w:r>
-      <w:r>
-        <w:rPr>
-          <w:rStyle w:val="NormalTok"/>
-        </w:rPr>
-        <w:t xml:space="preserve"> </w:t>
-      </w:r>
-      <w:r>
-        <w:rPr>
-          <w:rStyle w:val="DecValTok"/>
-        </w:rPr>
-        <w:t xml:space="preserve">1000</w:t>
-      </w:r>
-      <w:r>
-        <w:rPr>
-          <w:rStyle w:val="NormalTok"/>
-        </w:rPr>
-        <w:t xml:space="preserve">, </w:t>
-      </w:r>
-      <w:r>
-        <w:rPr>
-          <w:rStyle w:val="AttributeTok"/>
-        </w:rPr>
-        <w:t xml:space="preserve">progress.bar =</w:t>
-      </w:r>
-      <w:r>
-        <w:rPr>
-          <w:rStyle w:val="NormalTok"/>
-        </w:rPr>
-        <w:t xml:space="preserve"> </w:t>
-      </w:r>
-      <w:r>
-        <w:rPr>
-          <w:rStyle w:val="StringTok"/>
-        </w:rPr>
-        <w:t xml:space="preserve">"none"</w:t>
-      </w:r>
-      <w:r>
-        <w:rPr>
-          <w:rStyle w:val="NormalTok"/>
-        </w:rPr>
-        <w:t xml:space="preserve">)</w:t>
-      </w:r>
-      <w:r>
-        <w:br/>
-      </w:r>
-      <w:r>
-        <w:rPr>
-          <w:rStyle w:val="NormalTok"/>
-        </w:rPr>
-        <w:t xml:space="preserve">draws </w:t>
-      </w:r>
-      <w:r>
-        <w:rPr>
-          <w:rStyle w:val="OtherTok"/>
-        </w:rPr>
-        <w:t xml:space="preserve">&lt;-</w:t>
-      </w:r>
-      <w:r>
-        <w:rPr>
-          <w:rStyle w:val="NormalTok"/>
-        </w:rPr>
-        <w:t xml:space="preserve"> rjags</w:t>
-      </w:r>
-      <w:r>
-        <w:rPr>
-          <w:rStyle w:val="SpecialCharTok"/>
-        </w:rPr>
-        <w:t xml:space="preserve">::</w:t>
-      </w:r>
-      <w:r>
-        <w:rPr>
-          <w:rStyle w:val="FunctionTok"/>
-        </w:rPr>
-        <w:t xml:space="preserve">coda.samples</w:t>
-      </w:r>
-      <w:r>
-        <w:rPr>
-          <w:rStyle w:val="NormalTok"/>
-        </w:rPr>
-        <w:t xml:space="preserve">(</w:t>
-      </w:r>
-      <w:r>
-        <w:br/>
-      </w:r>
-      <w:r>
-        <w:rPr>
-          <w:rStyle w:val="NormalTok"/>
-        </w:rPr>
-        <w:t xml:space="preserve">  fit,</w:t>
-      </w:r>
-      <w:r>
-        <w:br/>
-      </w:r>
-      <w:r>
-        <w:rPr>
-          <w:rStyle w:val="NormalTok"/>
-        </w:rPr>
-        <w:t xml:space="preserve">  </w:t>
-      </w:r>
-      <w:r>
-        <w:rPr>
-          <w:rStyle w:val="AttributeTok"/>
-        </w:rPr>
-        <w:t xml:space="preserve">variable.names =</w:t>
-      </w:r>
-      <w:r>
-        <w:rPr>
-          <w:rStyle w:val="NormalTok"/>
-        </w:rPr>
-        <w:t xml:space="preserve"> </w:t>
-      </w:r>
-      <w:r>
-        <w:rPr>
-          <w:rStyle w:val="FunctionTok"/>
-        </w:rPr>
-        <w:t xml:space="preserve">c</w:t>
-      </w:r>
-      <w:r>
-        <w:rPr>
-          <w:rStyle w:val="NormalTok"/>
-        </w:rPr>
-        <w:t xml:space="preserve">(</w:t>
-      </w:r>
-      <w:r>
-        <w:rPr>
-          <w:rStyle w:val="StringTok"/>
-        </w:rPr>
-        <w:t xml:space="preserve">"beta0"</w:t>
-      </w:r>
-      <w:r>
-        <w:rPr>
-          <w:rStyle w:val="NormalTok"/>
-        </w:rPr>
-        <w:t xml:space="preserve">, </w:t>
-      </w:r>
-      <w:r>
-        <w:rPr>
-          <w:rStyle w:val="StringTok"/>
-        </w:rPr>
-        <w:t xml:space="preserve">"beta1"</w:t>
-      </w:r>
-      <w:r>
-        <w:rPr>
-          <w:rStyle w:val="NormalTok"/>
-        </w:rPr>
-        <w:t xml:space="preserve">, </w:t>
-      </w:r>
-      <w:r>
-        <w:rPr>
-          <w:rStyle w:val="StringTok"/>
-        </w:rPr>
-        <w:t xml:space="preserve">"HR"</w:t>
-      </w:r>
-      <w:r>
-        <w:rPr>
-          <w:rStyle w:val="NormalTok"/>
-        </w:rPr>
-        <w:t xml:space="preserve">),</w:t>
-      </w:r>
-      <w:r>
-        <w:br/>
-      </w:r>
-      <w:r>
-        <w:rPr>
-          <w:rStyle w:val="NormalTok"/>
-        </w:rPr>
-        <w:t xml:space="preserve">  </w:t>
-      </w:r>
-      <w:r>
-        <w:rPr>
-          <w:rStyle w:val="AttributeTok"/>
-        </w:rPr>
-        <w:t xml:space="preserve">n.iter =</w:t>
-      </w:r>
-      <w:r>
-        <w:rPr>
-          <w:rStyle w:val="NormalTok"/>
-        </w:rPr>
-        <w:t xml:space="preserve"> </w:t>
-      </w:r>
-      <w:r>
-        <w:rPr>
-          <w:rStyle w:val="DecValTok"/>
-        </w:rPr>
-        <w:t xml:space="preserve">4000</w:t>
-      </w:r>
-      <w:r>
-        <w:rPr>
-          <w:rStyle w:val="NormalTok"/>
-        </w:rPr>
-        <w:t xml:space="preserve">,</w:t>
-      </w:r>
-      <w:r>
-        <w:br/>
-      </w:r>
-      <w:r>
-        <w:rPr>
-          <w:rStyle w:val="NormalTok"/>
-        </w:rPr>
-        <w:t xml:space="preserve">  </w:t>
-      </w:r>
-      <w:r>
-        <w:rPr>
-          <w:rStyle w:val="AttributeTok"/>
-        </w:rPr>
-        <w:t xml:space="preserve">progress.bar =</w:t>
-      </w:r>
-      <w:r>
-        <w:rPr>
-          <w:rStyle w:val="NormalTok"/>
-        </w:rPr>
-        <w:t xml:space="preserve"> </w:t>
-      </w:r>
-      <w:r>
-        <w:rPr>
-          <w:rStyle w:val="StringTok"/>
-        </w:rPr>
-        <w:t xml:space="preserve">"none"</w:t>
-      </w:r>
-      <w:r>
-        <w:br/>
-      </w:r>
-      <w:r>
-        <w:rPr>
-          <w:rStyle w:val="NormalTok"/>
-        </w:rPr>
-        <w:t xml:space="preserve">)</w:t>
-      </w:r>
-      <w:r>
-        <w:br/>
-      </w:r>
-      <w:r>
-        <w:rPr>
-          <w:rStyle w:val="NormalTok"/>
-        </w:rPr>
-        <w:t xml:space="preserve">draws_matrix </w:t>
-      </w:r>
-      <w:r>
-        <w:rPr>
-          <w:rStyle w:val="OtherTok"/>
-        </w:rPr>
-        <w:t xml:space="preserve">&lt;-</w:t>
-      </w:r>
-      <w:r>
-        <w:rPr>
-          <w:rStyle w:val="NormalTok"/>
-        </w:rPr>
-        <w:t xml:space="preserve"> </w:t>
-      </w:r>
-      <w:r>
-        <w:rPr>
-          <w:rStyle w:val="FunctionTok"/>
-        </w:rPr>
-        <w:t xml:space="preserve">as.matrix</w:t>
-      </w:r>
-      <w:r>
-        <w:rPr>
-          <w:rStyle w:val="NormalTok"/>
-        </w:rPr>
-        <w:t xml:space="preserve">(draws)</w:t>
-      </w:r>
-      <w:r>
-        <w:br/>
-      </w:r>
-      <w:r>
-        <w:rPr>
-          <w:rStyle w:val="FunctionTok"/>
-        </w:rPr>
-        <w:t xml:space="preserve">cbind</w:t>
-      </w:r>
-      <w:r>
-        <w:rPr>
-          <w:rStyle w:val="NormalTok"/>
-        </w:rPr>
-        <w:t xml:space="preserve">(</w:t>
-      </w:r>
-      <w:r>
-        <w:br/>
-      </w:r>
-      <w:r>
-        <w:rPr>
-          <w:rStyle w:val="NormalTok"/>
-        </w:rPr>
-        <w:t xml:space="preserve">  </w:t>
-      </w:r>
-      <w:r>
-        <w:rPr>
-          <w:rStyle w:val="AttributeTok"/>
-        </w:rPr>
-        <w:t xml:space="preserve">mean =</w:t>
-      </w:r>
-      <w:r>
-        <w:rPr>
-          <w:rStyle w:val="NormalTok"/>
-        </w:rPr>
-        <w:t xml:space="preserve"> </w:t>
-      </w:r>
-      <w:r>
-        <w:rPr>
-          <w:rStyle w:val="FunctionTok"/>
-        </w:rPr>
-        <w:t xml:space="preserve">colMeans</w:t>
-      </w:r>
-      <w:r>
-        <w:rPr>
-          <w:rStyle w:val="NormalTok"/>
-        </w:rPr>
-        <w:t xml:space="preserve">(draws_matrix),</w:t>
-      </w:r>
-      <w:r>
-        <w:br/>
-      </w:r>
-      <w:r>
-        <w:rPr>
-          <w:rStyle w:val="NormalTok"/>
-        </w:rPr>
-        <w:t xml:space="preserve">  </w:t>
-      </w:r>
-      <w:r>
-        <w:rPr>
-          <w:rStyle w:val="FunctionTok"/>
-        </w:rPr>
-        <w:t xml:space="preserve">t</w:t>
-      </w:r>
-      <w:r>
-        <w:rPr>
-          <w:rStyle w:val="NormalTok"/>
-        </w:rPr>
-        <w:t xml:space="preserve">(</w:t>
-      </w:r>
-      <w:r>
-        <w:rPr>
-          <w:rStyle w:val="FunctionTok"/>
-        </w:rPr>
-        <w:t xml:space="preserve">apply</w:t>
-      </w:r>
-      <w:r>
-        <w:rPr>
-          <w:rStyle w:val="NormalTok"/>
-        </w:rPr>
-        <w:t xml:space="preserve">(draws_matrix, </w:t>
-      </w:r>
-      <w:r>
-        <w:rPr>
-          <w:rStyle w:val="DecValTok"/>
-        </w:rPr>
-        <w:t xml:space="preserve">2</w:t>
-      </w:r>
-      <w:r>
-        <w:rPr>
-          <w:rStyle w:val="NormalTok"/>
-        </w:rPr>
-        <w:t xml:space="preserve">, stats</w:t>
-      </w:r>
-      <w:r>
-        <w:rPr>
-          <w:rStyle w:val="SpecialCharTok"/>
-        </w:rPr>
-        <w:t xml:space="preserve">::</w:t>
-      </w:r>
-      <w:r>
-        <w:rPr>
-          <w:rStyle w:val="NormalTok"/>
-        </w:rPr>
-        <w:t xml:space="preserve">quantile, </w:t>
-      </w:r>
-      <w:r>
-        <w:rPr>
-          <w:rStyle w:val="AttributeTok"/>
-        </w:rPr>
-        <w:t xml:space="preserve">probs =</w:t>
-      </w:r>
-      <w:r>
-        <w:rPr>
-          <w:rStyle w:val="NormalTok"/>
-        </w:rPr>
-        <w:t xml:space="preserve"> </w:t>
-      </w:r>
-      <w:r>
-        <w:rPr>
-          <w:rStyle w:val="FunctionTok"/>
-        </w:rPr>
-        <w:t xml:space="preserve">c</w:t>
-      </w:r>
-      <w:r>
-        <w:rPr>
-          <w:rStyle w:val="NormalTok"/>
-        </w:rPr>
-        <w:t xml:space="preserve">(</w:t>
-      </w:r>
-      <w:r>
-        <w:rPr>
-          <w:rStyle w:val="FloatTok"/>
-        </w:rPr>
-        <w:t xml:space="preserve">0.025</w:t>
-      </w:r>
-      <w:r>
-        <w:rPr>
-          <w:rStyle w:val="NormalTok"/>
-        </w:rPr>
-        <w:t xml:space="preserve">, </w:t>
-      </w:r>
-      <w:r>
-        <w:rPr>
-          <w:rStyle w:val="FloatTok"/>
-        </w:rPr>
-        <w:t xml:space="preserve">0.975</w:t>
-      </w:r>
-      <w:r>
-        <w:rPr>
-          <w:rStyle w:val="NormalTok"/>
-        </w:rPr>
-        <w:t xml:space="preserve">))),</w:t>
-      </w:r>
-      <w:r>
-        <w:br/>
-      </w:r>
-      <w:r>
-        <w:rPr>
-          <w:rStyle w:val="NormalTok"/>
-        </w:rPr>
-        <w:t xml:space="preserve">  </w:t>
-      </w:r>
-      <w:r>
-        <w:rPr>
-          <w:rStyle w:val="AttributeTok"/>
-        </w:rPr>
-        <w:t xml:space="preserve">Rhat =</w:t>
-      </w:r>
-      <w:r>
-        <w:rPr>
-          <w:rStyle w:val="NormalTok"/>
-        </w:rPr>
-        <w:t xml:space="preserve"> coda</w:t>
-      </w:r>
-      <w:r>
-        <w:rPr>
-          <w:rStyle w:val="SpecialCharTok"/>
-        </w:rPr>
-        <w:t xml:space="preserve">::</w:t>
-      </w:r>
-      <w:r>
-        <w:rPr>
-          <w:rStyle w:val="FunctionTok"/>
-        </w:rPr>
-        <w:t xml:space="preserve">gelman.diag</w:t>
-      </w:r>
-      <w:r>
-        <w:rPr>
-          <w:rStyle w:val="NormalTok"/>
-        </w:rPr>
-        <w:t xml:space="preserve">(draws, </w:t>
-      </w:r>
-      <w:r>
-        <w:rPr>
-          <w:rStyle w:val="AttributeTok"/>
-        </w:rPr>
-        <w:t xml:space="preserve">multivariate =</w:t>
-      </w:r>
-      <w:r>
-        <w:rPr>
-          <w:rStyle w:val="NormalTok"/>
-        </w:rPr>
-        <w:t xml:space="preserve"> </w:t>
-      </w:r>
-      <w:r>
-        <w:rPr>
-          <w:rStyle w:val="ConstantTok"/>
-        </w:rPr>
-        <w:t xml:space="preserve">FALSE</w:t>
-      </w:r>
-      <w:r>
-        <w:rPr>
-          <w:rStyle w:val="NormalTok"/>
-        </w:rPr>
-        <w:t xml:space="preserve">)</w:t>
-      </w:r>
-      <w:r>
-        <w:rPr>
-          <w:rStyle w:val="SpecialCharTok"/>
-        </w:rPr>
-        <w:t xml:space="preserve">$</w:t>
-      </w:r>
-      <w:r>
-        <w:rPr>
-          <w:rStyle w:val="NormalTok"/>
-        </w:rPr>
-        <w:t xml:space="preserve">psrf[, </w:t>
-      </w:r>
-      <w:r>
-        <w:rPr>
-          <w:rStyle w:val="StringTok"/>
-        </w:rPr>
-        <w:t xml:space="preserve">"Point est."</w:t>
-      </w:r>
-      <w:r>
-        <w:rPr>
-          <w:rStyle w:val="NormalTok"/>
-        </w:rPr>
-        <w:t xml:space="preserve">]</w:t>
-      </w:r>
-      <w:r>
-        <w:br/>
-      </w:r>
-      <w:r>
-        <w:rPr>
-          <w:rStyle w:val="NormalTok"/>
-        </w:rPr>
-        <w:t xml:space="preserve">) </w:t>
-      </w:r>
-      <w:r>
-        <w:rPr>
-          <w:rStyle w:val="SpecialCharTok"/>
-        </w:rPr>
-        <w:t xml:space="preserve">|&gt;</w:t>
-      </w:r>
-      <w:r>
-        <w:br/>
-      </w:r>
-      <w:r>
-        <w:rPr>
-          <w:rStyle w:val="NormalTok"/>
-        </w:rPr>
-        <w:t xml:space="preserve">  </w:t>
-      </w:r>
-      <w:r>
-        <w:rPr>
-          <w:rStyle w:val="FunctionTok"/>
-        </w:rPr>
-        <w:t xml:space="preserve">round</w:t>
-      </w:r>
-      <w:r>
-        <w:rPr>
-          <w:rStyle w:val="NormalTok"/>
-        </w:rPr>
-        <w:t xml:space="preserve">(</w:t>
-      </w:r>
-      <w:r>
-        <w:rPr>
-          <w:rStyle w:val="DecValTok"/>
-        </w:rPr>
-        <w:t xml:space="preserve">3</w:t>
-      </w:r>
-      <w:r>
-        <w:rPr>
-          <w:rStyle w:val="NormalTok"/>
-        </w:rPr>
-        <w:t xml:space="preserve">)</w:t>
-      </w:r>
-      <w:r>
-        <w:br/>
-      </w:r>
-      <w:r>
-        <w:rPr>
-          <w:rStyle w:val="CommentTok"/>
-        </w:rPr>
-        <w:t xml:space="preserve">#&gt;         mean   2.5%  97.5% Rhat</w:t>
-      </w:r>
-      <w:r>
-        <w:br/>
-      </w:r>
-      <w:r>
-        <w:rPr>
-          <w:rStyle w:val="CommentTok"/>
-        </w:rPr>
-        <w:t xml:space="preserve">#&gt; HR     0.602  0.390  0.875    1</w:t>
-      </w:r>
-      <w:r>
-        <w:br/>
-      </w:r>
-      <w:r>
-        <w:rPr>
-          <w:rStyle w:val="CommentTok"/>
-        </w:rPr>
-        <w:t xml:space="preserve">#&gt; beta0 -3.119 -3.391 -2.870    1</w:t>
-      </w:r>
-      <w:r>
-        <w:br/>
-      </w:r>
-      <w:r>
-        <w:rPr>
-          <w:rStyle w:val="CommentTok"/>
-        </w:rPr>
-        <w:t xml:space="preserve">#&gt; beta1 -0.529 -0.941 -0.133    1</w:t>
-      </w:r>
-    </w:p>
-    <w:p>
-      <w:pPr>
-        <w:pStyle w:val="FirstParagraph"/>
-      </w:pPr>
-      <w:r>
-        <w:t xml:space="preserve">About 50% of the follow-up times end in an event.</w:t>
-      </w:r>
-      <w:r>
-        <w:t xml:space="preserve"> </w:t>
-      </w:r>
-      <w:r>
-        <w:t xml:space="preserve">The 95% credible interval for</w:t>
+      <w:r>
+        <w:t xml:space="preserve"> </w:t>
+      </w:r>
+      <w:r>
+        <w:t xml:space="preserve">In the code,</w:t>
+      </w:r>
+      <w:r>
+        <w:t xml:space="preserve"> </w:t>
+      </w:r>
+      <w:r>
+        <w:rPr>
+          <w:rStyle w:val="VerbatimChar"/>
+        </w:rPr>
+        <w:t xml:space="preserve">beta0</w:t>
+      </w:r>
+      <w:r>
+        <w:t xml:space="preserve"> </w:t>
+      </w:r>
+      <w:r>
+        <w:t xml:space="preserve">and</w:t>
+      </w:r>
+      <w:r>
+        <w:t xml:space="preserve"> </w:t>
+      </w:r>
+      <w:r>
+        <w:rPr>
+          <w:rStyle w:val="VerbatimChar"/>
+        </w:rPr>
+        <w:t xml:space="preserve">beta1</w:t>
+      </w:r>
+      <w:r>
+        <w:t xml:space="preserve"> </w:t>
+      </w:r>
+      <w:r>
+        <w:t xml:space="preserve">are</w:t>
       </w:r>
       <w:r>
         <w:t xml:space="preserve"> </w:t>
@@ -6879,7 +5349,1707 @@
           </m:e>
           <m:sub>
             <m:r>
-              <m:t>1</m:t>
+              <m:t>0</m:t>
+            </m:r>
+          </m:sub>
+        </m:sSub>
+      </m:oMath>
+      <w:r>
+        <w:t xml:space="preserve"> </w:t>
+      </w:r>
+      <w:r>
+        <w:t xml:space="preserve">and</w:t>
+      </w:r>
+      <w:r>
+        <w:t xml:space="preserve"> </w:t>
+      </w:r>
+      <m:oMath>
+        <m:sSub>
+          <m:e>
+            <m:r>
+              <m:t>β</m:t>
+            </m:r>
+          </m:e>
+          <m:sub>
+            <m:r>
+              <m:t>x</m:t>
+            </m:r>
+          </m:sub>
+        </m:sSub>
+      </m:oMath>
+      <w:r>
+        <w:t xml:space="preserve">.</w:t>
+      </w:r>
+    </w:p>
+    <w:p>
+      <w:pPr>
+        <w:pStyle w:val="SourceCode"/>
+      </w:pPr>
+      <w:r>
+        <w:rPr>
+          <w:rStyle w:val="FunctionTok"/>
+        </w:rPr>
+        <w:t xml:space="preserve">set.seed</w:t>
+      </w:r>
+      <w:r>
+        <w:rPr>
+          <w:rStyle w:val="NormalTok"/>
+        </w:rPr>
+        <w:t xml:space="preserve">(</w:t>
+      </w:r>
+      <w:r>
+        <w:rPr>
+          <w:rStyle w:val="DecValTok"/>
+        </w:rPr>
+        <w:t xml:space="preserve">2026</w:t>
+      </w:r>
+      <w:r>
+        <w:rPr>
+          <w:rStyle w:val="NormalTok"/>
+        </w:rPr>
+        <w:t xml:space="preserve">)</w:t>
+      </w:r>
+      <w:r>
+        <w:br/>
+      </w:r>
+      <w:r>
+        <w:rPr>
+          <w:rStyle w:val="NormalTok"/>
+        </w:rPr>
+        <w:t xml:space="preserve">n_obs </w:t>
+      </w:r>
+      <w:r>
+        <w:rPr>
+          <w:rStyle w:val="OtherTok"/>
+        </w:rPr>
+        <w:t xml:space="preserve">&lt;-</w:t>
+      </w:r>
+      <w:r>
+        <w:rPr>
+          <w:rStyle w:val="NormalTok"/>
+        </w:rPr>
+        <w:t xml:space="preserve"> </w:t>
+      </w:r>
+      <w:r>
+        <w:rPr>
+          <w:rStyle w:val="DecValTok"/>
+        </w:rPr>
+        <w:t xml:space="preserve">200</w:t>
+      </w:r>
+      <w:r>
+        <w:rPr>
+          <w:rStyle w:val="NormalTok"/>
+        </w:rPr>
+        <w:t xml:space="preserve">L</w:t>
+      </w:r>
+      <w:r>
+        <w:br/>
+      </w:r>
+      <w:r>
+        <w:rPr>
+          <w:rStyle w:val="NormalTok"/>
+        </w:rPr>
+        <w:t xml:space="preserve">x </w:t>
+      </w:r>
+      <w:r>
+        <w:rPr>
+          <w:rStyle w:val="OtherTok"/>
+        </w:rPr>
+        <w:t xml:space="preserve">&lt;-</w:t>
+      </w:r>
+      <w:r>
+        <w:rPr>
+          <w:rStyle w:val="NormalTok"/>
+        </w:rPr>
+        <w:t xml:space="preserve"> stats</w:t>
+      </w:r>
+      <w:r>
+        <w:rPr>
+          <w:rStyle w:val="SpecialCharTok"/>
+        </w:rPr>
+        <w:t xml:space="preserve">::</w:t>
+      </w:r>
+      <w:r>
+        <w:rPr>
+          <w:rStyle w:val="FunctionTok"/>
+        </w:rPr>
+        <w:t xml:space="preserve">rbinom</w:t>
+      </w:r>
+      <w:r>
+        <w:rPr>
+          <w:rStyle w:val="NormalTok"/>
+        </w:rPr>
+        <w:t xml:space="preserve">(n_obs, </w:t>
+      </w:r>
+      <w:r>
+        <w:rPr>
+          <w:rStyle w:val="AttributeTok"/>
+        </w:rPr>
+        <w:t xml:space="preserve">size =</w:t>
+      </w:r>
+      <w:r>
+        <w:rPr>
+          <w:rStyle w:val="NormalTok"/>
+        </w:rPr>
+        <w:t xml:space="preserve"> </w:t>
+      </w:r>
+      <w:r>
+        <w:rPr>
+          <w:rStyle w:val="DecValTok"/>
+        </w:rPr>
+        <w:t xml:space="preserve">1</w:t>
+      </w:r>
+      <w:r>
+        <w:rPr>
+          <w:rStyle w:val="NormalTok"/>
+        </w:rPr>
+        <w:t xml:space="preserve">, </w:t>
+      </w:r>
+      <w:r>
+        <w:rPr>
+          <w:rStyle w:val="AttributeTok"/>
+        </w:rPr>
+        <w:t xml:space="preserve">prob =</w:t>
+      </w:r>
+      <w:r>
+        <w:rPr>
+          <w:rStyle w:val="NormalTok"/>
+        </w:rPr>
+        <w:t xml:space="preserve"> </w:t>
+      </w:r>
+      <w:r>
+        <w:rPr>
+          <w:rStyle w:val="FloatTok"/>
+        </w:rPr>
+        <w:t xml:space="preserve">0.5</w:t>
+      </w:r>
+      <w:r>
+        <w:rPr>
+          <w:rStyle w:val="NormalTok"/>
+        </w:rPr>
+        <w:t xml:space="preserve">)</w:t>
+      </w:r>
+      <w:r>
+        <w:br/>
+      </w:r>
+      <w:r>
+        <w:rPr>
+          <w:rStyle w:val="NormalTok"/>
+        </w:rPr>
+        <w:t xml:space="preserve">event_time </w:t>
+      </w:r>
+      <w:r>
+        <w:rPr>
+          <w:rStyle w:val="OtherTok"/>
+        </w:rPr>
+        <w:t xml:space="preserve">&lt;-</w:t>
+      </w:r>
+      <w:r>
+        <w:rPr>
+          <w:rStyle w:val="NormalTok"/>
+        </w:rPr>
+        <w:t xml:space="preserve"> stats</w:t>
+      </w:r>
+      <w:r>
+        <w:rPr>
+          <w:rStyle w:val="SpecialCharTok"/>
+        </w:rPr>
+        <w:t xml:space="preserve">::</w:t>
+      </w:r>
+      <w:r>
+        <w:rPr>
+          <w:rStyle w:val="FunctionTok"/>
+        </w:rPr>
+        <w:t xml:space="preserve">rexp</w:t>
+      </w:r>
+      <w:r>
+        <w:rPr>
+          <w:rStyle w:val="NormalTok"/>
+        </w:rPr>
+        <w:t xml:space="preserve">(n_obs, </w:t>
+      </w:r>
+      <w:r>
+        <w:rPr>
+          <w:rStyle w:val="AttributeTok"/>
+        </w:rPr>
+        <w:t xml:space="preserve">rate =</w:t>
+      </w:r>
+      <w:r>
+        <w:rPr>
+          <w:rStyle w:val="NormalTok"/>
+        </w:rPr>
+        <w:t xml:space="preserve"> </w:t>
+      </w:r>
+      <w:r>
+        <w:rPr>
+          <w:rStyle w:val="FunctionTok"/>
+        </w:rPr>
+        <w:t xml:space="preserve">exp</w:t>
+      </w:r>
+      <w:r>
+        <w:rPr>
+          <w:rStyle w:val="NormalTok"/>
+        </w:rPr>
+        <w:t xml:space="preserve">(</w:t>
+      </w:r>
+      <w:r>
+        <w:rPr>
+          <w:rStyle w:val="FunctionTok"/>
+        </w:rPr>
+        <w:t xml:space="preserve">log</w:t>
+      </w:r>
+      <w:r>
+        <w:rPr>
+          <w:rStyle w:val="NormalTok"/>
+        </w:rPr>
+        <w:t xml:space="preserve">(</w:t>
+      </w:r>
+      <w:r>
+        <w:rPr>
+          <w:rStyle w:val="FloatTok"/>
+        </w:rPr>
+        <w:t xml:space="preserve">0.05</w:t>
+      </w:r>
+      <w:r>
+        <w:rPr>
+          <w:rStyle w:val="NormalTok"/>
+        </w:rPr>
+        <w:t xml:space="preserve">) </w:t>
+      </w:r>
+      <w:r>
+        <w:rPr>
+          <w:rStyle w:val="SpecialCharTok"/>
+        </w:rPr>
+        <w:t xml:space="preserve">-</w:t>
+      </w:r>
+      <w:r>
+        <w:rPr>
+          <w:rStyle w:val="NormalTok"/>
+        </w:rPr>
+        <w:t xml:space="preserve"> </w:t>
+      </w:r>
+      <w:r>
+        <w:rPr>
+          <w:rStyle w:val="FloatTok"/>
+        </w:rPr>
+        <w:t xml:space="preserve">0.7</w:t>
+      </w:r>
+      <w:r>
+        <w:rPr>
+          <w:rStyle w:val="NormalTok"/>
+        </w:rPr>
+        <w:t xml:space="preserve"> </w:t>
+      </w:r>
+      <w:r>
+        <w:rPr>
+          <w:rStyle w:val="SpecialCharTok"/>
+        </w:rPr>
+        <w:t xml:space="preserve">*</w:t>
+      </w:r>
+      <w:r>
+        <w:rPr>
+          <w:rStyle w:val="NormalTok"/>
+        </w:rPr>
+        <w:t xml:space="preserve"> x))</w:t>
+      </w:r>
+      <w:r>
+        <w:br/>
+      </w:r>
+      <w:r>
+        <w:rPr>
+          <w:rStyle w:val="NormalTok"/>
+        </w:rPr>
+        <w:t xml:space="preserve">censor_time </w:t>
+      </w:r>
+      <w:r>
+        <w:rPr>
+          <w:rStyle w:val="OtherTok"/>
+        </w:rPr>
+        <w:t xml:space="preserve">&lt;-</w:t>
+      </w:r>
+      <w:r>
+        <w:rPr>
+          <w:rStyle w:val="NormalTok"/>
+        </w:rPr>
+        <w:t xml:space="preserve"> stats</w:t>
+      </w:r>
+      <w:r>
+        <w:rPr>
+          <w:rStyle w:val="SpecialCharTok"/>
+        </w:rPr>
+        <w:t xml:space="preserve">::</w:t>
+      </w:r>
+      <w:r>
+        <w:rPr>
+          <w:rStyle w:val="FunctionTok"/>
+        </w:rPr>
+        <w:t xml:space="preserve">rexp</w:t>
+      </w:r>
+      <w:r>
+        <w:rPr>
+          <w:rStyle w:val="NormalTok"/>
+        </w:rPr>
+        <w:t xml:space="preserve">(n_obs, </w:t>
+      </w:r>
+      <w:r>
+        <w:rPr>
+          <w:rStyle w:val="AttributeTok"/>
+        </w:rPr>
+        <w:t xml:space="preserve">rate =</w:t>
+      </w:r>
+      <w:r>
+        <w:rPr>
+          <w:rStyle w:val="NormalTok"/>
+        </w:rPr>
+        <w:t xml:space="preserve"> </w:t>
+      </w:r>
+      <w:r>
+        <w:rPr>
+          <w:rStyle w:val="FloatTok"/>
+        </w:rPr>
+        <w:t xml:space="preserve">0.03</w:t>
+      </w:r>
+      <w:r>
+        <w:rPr>
+          <w:rStyle w:val="NormalTok"/>
+        </w:rPr>
+        <w:t xml:space="preserve">)</w:t>
+      </w:r>
+      <w:r>
+        <w:br/>
+      </w:r>
+      <w:r>
+        <w:rPr>
+          <w:rStyle w:val="NormalTok"/>
+        </w:rPr>
+        <w:t xml:space="preserve">follow_up </w:t>
+      </w:r>
+      <w:r>
+        <w:rPr>
+          <w:rStyle w:val="OtherTok"/>
+        </w:rPr>
+        <w:t xml:space="preserve">&lt;-</w:t>
+      </w:r>
+      <w:r>
+        <w:rPr>
+          <w:rStyle w:val="NormalTok"/>
+        </w:rPr>
+        <w:t xml:space="preserve"> </w:t>
+      </w:r>
+      <w:r>
+        <w:rPr>
+          <w:rStyle w:val="FunctionTok"/>
+        </w:rPr>
+        <w:t xml:space="preserve">pmin</w:t>
+      </w:r>
+      <w:r>
+        <w:rPr>
+          <w:rStyle w:val="NormalTok"/>
+        </w:rPr>
+        <w:t xml:space="preserve">(event_time, censor_time)</w:t>
+      </w:r>
+      <w:r>
+        <w:br/>
+      </w:r>
+      <w:r>
+        <w:rPr>
+          <w:rStyle w:val="NormalTok"/>
+        </w:rPr>
+        <w:t xml:space="preserve">event </w:t>
+      </w:r>
+      <w:r>
+        <w:rPr>
+          <w:rStyle w:val="OtherTok"/>
+        </w:rPr>
+        <w:t xml:space="preserve">&lt;-</w:t>
+      </w:r>
+      <w:r>
+        <w:rPr>
+          <w:rStyle w:val="NormalTok"/>
+        </w:rPr>
+        <w:t xml:space="preserve"> </w:t>
+      </w:r>
+      <w:r>
+        <w:rPr>
+          <w:rStyle w:val="FunctionTok"/>
+        </w:rPr>
+        <w:t xml:space="preserve">as.integer</w:t>
+      </w:r>
+      <w:r>
+        <w:rPr>
+          <w:rStyle w:val="NormalTok"/>
+        </w:rPr>
+        <w:t xml:space="preserve">(event_time </w:t>
+      </w:r>
+      <w:r>
+        <w:rPr>
+          <w:rStyle w:val="SpecialCharTok"/>
+        </w:rPr>
+        <w:t xml:space="preserve">&lt;=</w:t>
+      </w:r>
+      <w:r>
+        <w:rPr>
+          <w:rStyle w:val="NormalTok"/>
+        </w:rPr>
+        <w:t xml:space="preserve"> censor_time)</w:t>
+      </w:r>
+      <w:r>
+        <w:br/>
+      </w:r>
+      <w:r>
+        <w:br/>
+      </w:r>
+      <w:r>
+        <w:rPr>
+          <w:rStyle w:val="NormalTok"/>
+        </w:rPr>
+        <w:t xml:space="preserve">survival_model </w:t>
+      </w:r>
+      <w:r>
+        <w:rPr>
+          <w:rStyle w:val="OtherTok"/>
+        </w:rPr>
+        <w:t xml:space="preserve">&lt;-</w:t>
+      </w:r>
+      <w:r>
+        <w:rPr>
+          <w:rStyle w:val="NormalTok"/>
+        </w:rPr>
+        <w:t xml:space="preserve"> </w:t>
+      </w:r>
+      <w:r>
+        <w:rPr>
+          <w:rStyle w:val="StringTok"/>
+        </w:rPr>
+        <w:t xml:space="preserve">"</w:t>
+      </w:r>
+      <w:r>
+        <w:br/>
+      </w:r>
+      <w:r>
+        <w:rPr>
+          <w:rStyle w:val="StringTok"/>
+        </w:rPr>
+        <w:t xml:space="preserve">model {</w:t>
+      </w:r>
+      <w:r>
+        <w:br/>
+      </w:r>
+      <w:r>
+        <w:rPr>
+          <w:rStyle w:val="StringTok"/>
+        </w:rPr>
+        <w:t xml:space="preserve">  C &lt;- 10000</w:t>
+      </w:r>
+      <w:r>
+        <w:br/>
+      </w:r>
+      <w:r>
+        <w:rPr>
+          <w:rStyle w:val="StringTok"/>
+        </w:rPr>
+        <w:t xml:space="preserve">  for (i in 1:N) {</w:t>
+      </w:r>
+      <w:r>
+        <w:br/>
+      </w:r>
+      <w:r>
+        <w:rPr>
+          <w:rStyle w:val="StringTok"/>
+        </w:rPr>
+        <w:t xml:space="preserve">    log(lambda[i]) &lt;- beta0 + beta1 * x[i]</w:t>
+      </w:r>
+      <w:r>
+        <w:br/>
+      </w:r>
+      <w:r>
+        <w:rPr>
+          <w:rStyle w:val="StringTok"/>
+        </w:rPr>
+        <w:t xml:space="preserve">    loglik[i] &lt;- event[i] * log(lambda[i]) - lambda[i] * follow_up[i]</w:t>
+      </w:r>
+      <w:r>
+        <w:br/>
+      </w:r>
+      <w:r>
+        <w:rPr>
+          <w:rStyle w:val="StringTok"/>
+        </w:rPr>
+        <w:t xml:space="preserve">    zeros[i] ~ dpois(C - loglik[i])</w:t>
+      </w:r>
+      <w:r>
+        <w:br/>
+      </w:r>
+      <w:r>
+        <w:rPr>
+          <w:rStyle w:val="StringTok"/>
+        </w:rPr>
+        <w:t xml:space="preserve">  }</w:t>
+      </w:r>
+      <w:r>
+        <w:br/>
+      </w:r>
+      <w:r>
+        <w:rPr>
+          <w:rStyle w:val="StringTok"/>
+        </w:rPr>
+        <w:t xml:space="preserve">  beta0 ~ dnorm(0, 0.01)</w:t>
+      </w:r>
+      <w:r>
+        <w:br/>
+      </w:r>
+      <w:r>
+        <w:rPr>
+          <w:rStyle w:val="StringTok"/>
+        </w:rPr>
+        <w:t xml:space="preserve">  beta1 ~ dnorm(0, 0.01)</w:t>
+      </w:r>
+      <w:r>
+        <w:br/>
+      </w:r>
+      <w:r>
+        <w:rPr>
+          <w:rStyle w:val="StringTok"/>
+        </w:rPr>
+        <w:t xml:space="preserve">  HR &lt;- exp(beta1)</w:t>
+      </w:r>
+      <w:r>
+        <w:br/>
+      </w:r>
+      <w:r>
+        <w:rPr>
+          <w:rStyle w:val="StringTok"/>
+        </w:rPr>
+        <w:t xml:space="preserve">}</w:t>
+      </w:r>
+      <w:r>
+        <w:br/>
+      </w:r>
+      <w:r>
+        <w:rPr>
+          <w:rStyle w:val="StringTok"/>
+        </w:rPr>
+        <w:t xml:space="preserve">"</w:t>
+      </w:r>
+      <w:r>
+        <w:br/>
+      </w:r>
+      <w:r>
+        <w:rPr>
+          <w:rStyle w:val="NormalTok"/>
+        </w:rPr>
+        <w:t xml:space="preserve">inits </w:t>
+      </w:r>
+      <w:r>
+        <w:rPr>
+          <w:rStyle w:val="OtherTok"/>
+        </w:rPr>
+        <w:t xml:space="preserve">&lt;-</w:t>
+      </w:r>
+      <w:r>
+        <w:rPr>
+          <w:rStyle w:val="NormalTok"/>
+        </w:rPr>
+        <w:t xml:space="preserve"> </w:t>
+      </w:r>
+      <w:r>
+        <w:rPr>
+          <w:rStyle w:val="FunctionTok"/>
+        </w:rPr>
+        <w:t xml:space="preserve">list</w:t>
+      </w:r>
+      <w:r>
+        <w:rPr>
+          <w:rStyle w:val="NormalTok"/>
+        </w:rPr>
+        <w:t xml:space="preserve">(</w:t>
+      </w:r>
+      <w:r>
+        <w:br/>
+      </w:r>
+      <w:r>
+        <w:rPr>
+          <w:rStyle w:val="NormalTok"/>
+        </w:rPr>
+        <w:t xml:space="preserve">  </w:t>
+      </w:r>
+      <w:r>
+        <w:rPr>
+          <w:rStyle w:val="FunctionTok"/>
+        </w:rPr>
+        <w:t xml:space="preserve">list</w:t>
+      </w:r>
+      <w:r>
+        <w:rPr>
+          <w:rStyle w:val="NormalTok"/>
+        </w:rPr>
+        <w:t xml:space="preserve">(</w:t>
+      </w:r>
+      <w:r>
+        <w:rPr>
+          <w:rStyle w:val="AttributeTok"/>
+        </w:rPr>
+        <w:t xml:space="preserve">.RNG.name =</w:t>
+      </w:r>
+      <w:r>
+        <w:rPr>
+          <w:rStyle w:val="NormalTok"/>
+        </w:rPr>
+        <w:t xml:space="preserve"> </w:t>
+      </w:r>
+      <w:r>
+        <w:rPr>
+          <w:rStyle w:val="StringTok"/>
+        </w:rPr>
+        <w:t xml:space="preserve">"base::Mersenne-Twister"</w:t>
+      </w:r>
+      <w:r>
+        <w:rPr>
+          <w:rStyle w:val="NormalTok"/>
+        </w:rPr>
+        <w:t xml:space="preserve">, </w:t>
+      </w:r>
+      <w:r>
+        <w:rPr>
+          <w:rStyle w:val="AttributeTok"/>
+        </w:rPr>
+        <w:t xml:space="preserve">.RNG.seed =</w:t>
+      </w:r>
+      <w:r>
+        <w:rPr>
+          <w:rStyle w:val="NormalTok"/>
+        </w:rPr>
+        <w:t xml:space="preserve"> </w:t>
+      </w:r>
+      <w:r>
+        <w:rPr>
+          <w:rStyle w:val="DecValTok"/>
+        </w:rPr>
+        <w:t xml:space="preserve">1</w:t>
+      </w:r>
+      <w:r>
+        <w:rPr>
+          <w:rStyle w:val="NormalTok"/>
+        </w:rPr>
+        <w:t xml:space="preserve">),</w:t>
+      </w:r>
+      <w:r>
+        <w:br/>
+      </w:r>
+      <w:r>
+        <w:rPr>
+          <w:rStyle w:val="NormalTok"/>
+        </w:rPr>
+        <w:t xml:space="preserve">  </w:t>
+      </w:r>
+      <w:r>
+        <w:rPr>
+          <w:rStyle w:val="FunctionTok"/>
+        </w:rPr>
+        <w:t xml:space="preserve">list</w:t>
+      </w:r>
+      <w:r>
+        <w:rPr>
+          <w:rStyle w:val="NormalTok"/>
+        </w:rPr>
+        <w:t xml:space="preserve">(</w:t>
+      </w:r>
+      <w:r>
+        <w:rPr>
+          <w:rStyle w:val="AttributeTok"/>
+        </w:rPr>
+        <w:t xml:space="preserve">.RNG.name =</w:t>
+      </w:r>
+      <w:r>
+        <w:rPr>
+          <w:rStyle w:val="NormalTok"/>
+        </w:rPr>
+        <w:t xml:space="preserve"> </w:t>
+      </w:r>
+      <w:r>
+        <w:rPr>
+          <w:rStyle w:val="StringTok"/>
+        </w:rPr>
+        <w:t xml:space="preserve">"base::Mersenne-Twister"</w:t>
+      </w:r>
+      <w:r>
+        <w:rPr>
+          <w:rStyle w:val="NormalTok"/>
+        </w:rPr>
+        <w:t xml:space="preserve">, </w:t>
+      </w:r>
+      <w:r>
+        <w:rPr>
+          <w:rStyle w:val="AttributeTok"/>
+        </w:rPr>
+        <w:t xml:space="preserve">.RNG.seed =</w:t>
+      </w:r>
+      <w:r>
+        <w:rPr>
+          <w:rStyle w:val="NormalTok"/>
+        </w:rPr>
+        <w:t xml:space="preserve"> </w:t>
+      </w:r>
+      <w:r>
+        <w:rPr>
+          <w:rStyle w:val="DecValTok"/>
+        </w:rPr>
+        <w:t xml:space="preserve">2</w:t>
+      </w:r>
+      <w:r>
+        <w:rPr>
+          <w:rStyle w:val="NormalTok"/>
+        </w:rPr>
+        <w:t xml:space="preserve">)</w:t>
+      </w:r>
+      <w:r>
+        <w:br/>
+      </w:r>
+      <w:r>
+        <w:rPr>
+          <w:rStyle w:val="NormalTok"/>
+        </w:rPr>
+        <w:t xml:space="preserve">)</w:t>
+      </w:r>
+      <w:r>
+        <w:br/>
+      </w:r>
+      <w:r>
+        <w:rPr>
+          <w:rStyle w:val="NormalTok"/>
+        </w:rPr>
+        <w:t xml:space="preserve">fit </w:t>
+      </w:r>
+      <w:r>
+        <w:rPr>
+          <w:rStyle w:val="OtherTok"/>
+        </w:rPr>
+        <w:t xml:space="preserve">&lt;-</w:t>
+      </w:r>
+      <w:r>
+        <w:rPr>
+          <w:rStyle w:val="NormalTok"/>
+        </w:rPr>
+        <w:t xml:space="preserve"> rjags</w:t>
+      </w:r>
+      <w:r>
+        <w:rPr>
+          <w:rStyle w:val="SpecialCharTok"/>
+        </w:rPr>
+        <w:t xml:space="preserve">::</w:t>
+      </w:r>
+      <w:r>
+        <w:rPr>
+          <w:rStyle w:val="FunctionTok"/>
+        </w:rPr>
+        <w:t xml:space="preserve">jags.model</w:t>
+      </w:r>
+      <w:r>
+        <w:rPr>
+          <w:rStyle w:val="NormalTok"/>
+        </w:rPr>
+        <w:t xml:space="preserve">(</w:t>
+      </w:r>
+      <w:r>
+        <w:br/>
+      </w:r>
+      <w:r>
+        <w:rPr>
+          <w:rStyle w:val="NormalTok"/>
+        </w:rPr>
+        <w:t xml:space="preserve">  </w:t>
+      </w:r>
+      <w:r>
+        <w:rPr>
+          <w:rStyle w:val="FunctionTok"/>
+        </w:rPr>
+        <w:t xml:space="preserve">textConnection</w:t>
+      </w:r>
+      <w:r>
+        <w:rPr>
+          <w:rStyle w:val="NormalTok"/>
+        </w:rPr>
+        <w:t xml:space="preserve">(survival_model),</w:t>
+      </w:r>
+      <w:r>
+        <w:br/>
+      </w:r>
+      <w:r>
+        <w:rPr>
+          <w:rStyle w:val="NormalTok"/>
+        </w:rPr>
+        <w:t xml:space="preserve">  </w:t>
+      </w:r>
+      <w:r>
+        <w:rPr>
+          <w:rStyle w:val="AttributeTok"/>
+        </w:rPr>
+        <w:t xml:space="preserve">data =</w:t>
+      </w:r>
+      <w:r>
+        <w:rPr>
+          <w:rStyle w:val="NormalTok"/>
+        </w:rPr>
+        <w:t xml:space="preserve"> </w:t>
+      </w:r>
+      <w:r>
+        <w:rPr>
+          <w:rStyle w:val="FunctionTok"/>
+        </w:rPr>
+        <w:t xml:space="preserve">list</w:t>
+      </w:r>
+      <w:r>
+        <w:rPr>
+          <w:rStyle w:val="NormalTok"/>
+        </w:rPr>
+        <w:t xml:space="preserve">(</w:t>
+      </w:r>
+      <w:r>
+        <w:br/>
+      </w:r>
+      <w:r>
+        <w:rPr>
+          <w:rStyle w:val="NormalTok"/>
+        </w:rPr>
+        <w:t xml:space="preserve">    </w:t>
+      </w:r>
+      <w:r>
+        <w:rPr>
+          <w:rStyle w:val="AttributeTok"/>
+        </w:rPr>
+        <w:t xml:space="preserve">follow_up =</w:t>
+      </w:r>
+      <w:r>
+        <w:rPr>
+          <w:rStyle w:val="NormalTok"/>
+        </w:rPr>
+        <w:t xml:space="preserve"> follow_up, </w:t>
+      </w:r>
+      <w:r>
+        <w:rPr>
+          <w:rStyle w:val="AttributeTok"/>
+        </w:rPr>
+        <w:t xml:space="preserve">x =</w:t>
+      </w:r>
+      <w:r>
+        <w:rPr>
+          <w:rStyle w:val="NormalTok"/>
+        </w:rPr>
+        <w:t xml:space="preserve"> x, </w:t>
+      </w:r>
+      <w:r>
+        <w:rPr>
+          <w:rStyle w:val="AttributeTok"/>
+        </w:rPr>
+        <w:t xml:space="preserve">event =</w:t>
+      </w:r>
+      <w:r>
+        <w:rPr>
+          <w:rStyle w:val="NormalTok"/>
+        </w:rPr>
+        <w:t xml:space="preserve"> event,</w:t>
+      </w:r>
+      <w:r>
+        <w:br/>
+      </w:r>
+      <w:r>
+        <w:rPr>
+          <w:rStyle w:val="NormalTok"/>
+        </w:rPr>
+        <w:t xml:space="preserve">    </w:t>
+      </w:r>
+      <w:r>
+        <w:rPr>
+          <w:rStyle w:val="AttributeTok"/>
+        </w:rPr>
+        <w:t xml:space="preserve">N =</w:t>
+      </w:r>
+      <w:r>
+        <w:rPr>
+          <w:rStyle w:val="NormalTok"/>
+        </w:rPr>
+        <w:t xml:space="preserve"> n_obs, </w:t>
+      </w:r>
+      <w:r>
+        <w:rPr>
+          <w:rStyle w:val="AttributeTok"/>
+        </w:rPr>
+        <w:t xml:space="preserve">zeros =</w:t>
+      </w:r>
+      <w:r>
+        <w:rPr>
+          <w:rStyle w:val="NormalTok"/>
+        </w:rPr>
+        <w:t xml:space="preserve"> </w:t>
+      </w:r>
+      <w:r>
+        <w:rPr>
+          <w:rStyle w:val="FunctionTok"/>
+        </w:rPr>
+        <w:t xml:space="preserve">rep</w:t>
+      </w:r>
+      <w:r>
+        <w:rPr>
+          <w:rStyle w:val="NormalTok"/>
+        </w:rPr>
+        <w:t xml:space="preserve">(</w:t>
+      </w:r>
+      <w:r>
+        <w:rPr>
+          <w:rStyle w:val="DecValTok"/>
+        </w:rPr>
+        <w:t xml:space="preserve">0</w:t>
+      </w:r>
+      <w:r>
+        <w:rPr>
+          <w:rStyle w:val="NormalTok"/>
+        </w:rPr>
+        <w:t xml:space="preserve">, n_obs)</w:t>
+      </w:r>
+      <w:r>
+        <w:br/>
+      </w:r>
+      <w:r>
+        <w:rPr>
+          <w:rStyle w:val="NormalTok"/>
+        </w:rPr>
+        <w:t xml:space="preserve">  ),</w:t>
+      </w:r>
+      <w:r>
+        <w:br/>
+      </w:r>
+      <w:r>
+        <w:rPr>
+          <w:rStyle w:val="NormalTok"/>
+        </w:rPr>
+        <w:t xml:space="preserve">  </w:t>
+      </w:r>
+      <w:r>
+        <w:rPr>
+          <w:rStyle w:val="AttributeTok"/>
+        </w:rPr>
+        <w:t xml:space="preserve">inits =</w:t>
+      </w:r>
+      <w:r>
+        <w:rPr>
+          <w:rStyle w:val="NormalTok"/>
+        </w:rPr>
+        <w:t xml:space="preserve"> inits,</w:t>
+      </w:r>
+      <w:r>
+        <w:br/>
+      </w:r>
+      <w:r>
+        <w:rPr>
+          <w:rStyle w:val="NormalTok"/>
+        </w:rPr>
+        <w:t xml:space="preserve">  </w:t>
+      </w:r>
+      <w:r>
+        <w:rPr>
+          <w:rStyle w:val="AttributeTok"/>
+        </w:rPr>
+        <w:t xml:space="preserve">n.chains =</w:t>
+      </w:r>
+      <w:r>
+        <w:rPr>
+          <w:rStyle w:val="NormalTok"/>
+        </w:rPr>
+        <w:t xml:space="preserve"> </w:t>
+      </w:r>
+      <w:r>
+        <w:rPr>
+          <w:rStyle w:val="DecValTok"/>
+        </w:rPr>
+        <w:t xml:space="preserve">2</w:t>
+      </w:r>
+      <w:r>
+        <w:rPr>
+          <w:rStyle w:val="NormalTok"/>
+        </w:rPr>
+        <w:t xml:space="preserve">,</w:t>
+      </w:r>
+      <w:r>
+        <w:br/>
+      </w:r>
+      <w:r>
+        <w:rPr>
+          <w:rStyle w:val="NormalTok"/>
+        </w:rPr>
+        <w:t xml:space="preserve">  </w:t>
+      </w:r>
+      <w:r>
+        <w:rPr>
+          <w:rStyle w:val="AttributeTok"/>
+        </w:rPr>
+        <w:t xml:space="preserve">quiet =</w:t>
+      </w:r>
+      <w:r>
+        <w:rPr>
+          <w:rStyle w:val="NormalTok"/>
+        </w:rPr>
+        <w:t xml:space="preserve"> </w:t>
+      </w:r>
+      <w:r>
+        <w:rPr>
+          <w:rStyle w:val="ConstantTok"/>
+        </w:rPr>
+        <w:t xml:space="preserve">TRUE</w:t>
+      </w:r>
+      <w:r>
+        <w:br/>
+      </w:r>
+      <w:r>
+        <w:rPr>
+          <w:rStyle w:val="NormalTok"/>
+        </w:rPr>
+        <w:t xml:space="preserve">)</w:t>
+      </w:r>
+      <w:r>
+        <w:br/>
+      </w:r>
+      <w:r>
+        <w:rPr>
+          <w:rStyle w:val="NormalTok"/>
+        </w:rPr>
+        <w:t xml:space="preserve">stats</w:t>
+      </w:r>
+      <w:r>
+        <w:rPr>
+          <w:rStyle w:val="SpecialCharTok"/>
+        </w:rPr>
+        <w:t xml:space="preserve">::</w:t>
+      </w:r>
+      <w:r>
+        <w:rPr>
+          <w:rStyle w:val="FunctionTok"/>
+        </w:rPr>
+        <w:t xml:space="preserve">update</w:t>
+      </w:r>
+      <w:r>
+        <w:rPr>
+          <w:rStyle w:val="NormalTok"/>
+        </w:rPr>
+        <w:t xml:space="preserve">(fit, </w:t>
+      </w:r>
+      <w:r>
+        <w:rPr>
+          <w:rStyle w:val="AttributeTok"/>
+        </w:rPr>
+        <w:t xml:space="preserve">n.iter =</w:t>
+      </w:r>
+      <w:r>
+        <w:rPr>
+          <w:rStyle w:val="NormalTok"/>
+        </w:rPr>
+        <w:t xml:space="preserve"> </w:t>
+      </w:r>
+      <w:r>
+        <w:rPr>
+          <w:rStyle w:val="DecValTok"/>
+        </w:rPr>
+        <w:t xml:space="preserve">1000</w:t>
+      </w:r>
+      <w:r>
+        <w:rPr>
+          <w:rStyle w:val="NormalTok"/>
+        </w:rPr>
+        <w:t xml:space="preserve">, </w:t>
+      </w:r>
+      <w:r>
+        <w:rPr>
+          <w:rStyle w:val="AttributeTok"/>
+        </w:rPr>
+        <w:t xml:space="preserve">progress.bar =</w:t>
+      </w:r>
+      <w:r>
+        <w:rPr>
+          <w:rStyle w:val="NormalTok"/>
+        </w:rPr>
+        <w:t xml:space="preserve"> </w:t>
+      </w:r>
+      <w:r>
+        <w:rPr>
+          <w:rStyle w:val="StringTok"/>
+        </w:rPr>
+        <w:t xml:space="preserve">"none"</w:t>
+      </w:r>
+      <w:r>
+        <w:rPr>
+          <w:rStyle w:val="NormalTok"/>
+        </w:rPr>
+        <w:t xml:space="preserve">)</w:t>
+      </w:r>
+      <w:r>
+        <w:br/>
+      </w:r>
+      <w:r>
+        <w:rPr>
+          <w:rStyle w:val="NormalTok"/>
+        </w:rPr>
+        <w:t xml:space="preserve">draws </w:t>
+      </w:r>
+      <w:r>
+        <w:rPr>
+          <w:rStyle w:val="OtherTok"/>
+        </w:rPr>
+        <w:t xml:space="preserve">&lt;-</w:t>
+      </w:r>
+      <w:r>
+        <w:rPr>
+          <w:rStyle w:val="NormalTok"/>
+        </w:rPr>
+        <w:t xml:space="preserve"> rjags</w:t>
+      </w:r>
+      <w:r>
+        <w:rPr>
+          <w:rStyle w:val="SpecialCharTok"/>
+        </w:rPr>
+        <w:t xml:space="preserve">::</w:t>
+      </w:r>
+      <w:r>
+        <w:rPr>
+          <w:rStyle w:val="FunctionTok"/>
+        </w:rPr>
+        <w:t xml:space="preserve">coda.samples</w:t>
+      </w:r>
+      <w:r>
+        <w:rPr>
+          <w:rStyle w:val="NormalTok"/>
+        </w:rPr>
+        <w:t xml:space="preserve">(</w:t>
+      </w:r>
+      <w:r>
+        <w:br/>
+      </w:r>
+      <w:r>
+        <w:rPr>
+          <w:rStyle w:val="NormalTok"/>
+        </w:rPr>
+        <w:t xml:space="preserve">  fit,</w:t>
+      </w:r>
+      <w:r>
+        <w:br/>
+      </w:r>
+      <w:r>
+        <w:rPr>
+          <w:rStyle w:val="NormalTok"/>
+        </w:rPr>
+        <w:t xml:space="preserve">  </w:t>
+      </w:r>
+      <w:r>
+        <w:rPr>
+          <w:rStyle w:val="AttributeTok"/>
+        </w:rPr>
+        <w:t xml:space="preserve">variable.names =</w:t>
+      </w:r>
+      <w:r>
+        <w:rPr>
+          <w:rStyle w:val="NormalTok"/>
+        </w:rPr>
+        <w:t xml:space="preserve"> </w:t>
+      </w:r>
+      <w:r>
+        <w:rPr>
+          <w:rStyle w:val="FunctionTok"/>
+        </w:rPr>
+        <w:t xml:space="preserve">c</w:t>
+      </w:r>
+      <w:r>
+        <w:rPr>
+          <w:rStyle w:val="NormalTok"/>
+        </w:rPr>
+        <w:t xml:space="preserve">(</w:t>
+      </w:r>
+      <w:r>
+        <w:rPr>
+          <w:rStyle w:val="StringTok"/>
+        </w:rPr>
+        <w:t xml:space="preserve">"beta0"</w:t>
+      </w:r>
+      <w:r>
+        <w:rPr>
+          <w:rStyle w:val="NormalTok"/>
+        </w:rPr>
+        <w:t xml:space="preserve">, </w:t>
+      </w:r>
+      <w:r>
+        <w:rPr>
+          <w:rStyle w:val="StringTok"/>
+        </w:rPr>
+        <w:t xml:space="preserve">"beta1"</w:t>
+      </w:r>
+      <w:r>
+        <w:rPr>
+          <w:rStyle w:val="NormalTok"/>
+        </w:rPr>
+        <w:t xml:space="preserve">, </w:t>
+      </w:r>
+      <w:r>
+        <w:rPr>
+          <w:rStyle w:val="StringTok"/>
+        </w:rPr>
+        <w:t xml:space="preserve">"HR"</w:t>
+      </w:r>
+      <w:r>
+        <w:rPr>
+          <w:rStyle w:val="NormalTok"/>
+        </w:rPr>
+        <w:t xml:space="preserve">),</w:t>
+      </w:r>
+      <w:r>
+        <w:br/>
+      </w:r>
+      <w:r>
+        <w:rPr>
+          <w:rStyle w:val="NormalTok"/>
+        </w:rPr>
+        <w:t xml:space="preserve">  </w:t>
+      </w:r>
+      <w:r>
+        <w:rPr>
+          <w:rStyle w:val="AttributeTok"/>
+        </w:rPr>
+        <w:t xml:space="preserve">n.iter =</w:t>
+      </w:r>
+      <w:r>
+        <w:rPr>
+          <w:rStyle w:val="NormalTok"/>
+        </w:rPr>
+        <w:t xml:space="preserve"> </w:t>
+      </w:r>
+      <w:r>
+        <w:rPr>
+          <w:rStyle w:val="DecValTok"/>
+        </w:rPr>
+        <w:t xml:space="preserve">4000</w:t>
+      </w:r>
+      <w:r>
+        <w:rPr>
+          <w:rStyle w:val="NormalTok"/>
+        </w:rPr>
+        <w:t xml:space="preserve">,</w:t>
+      </w:r>
+      <w:r>
+        <w:br/>
+      </w:r>
+      <w:r>
+        <w:rPr>
+          <w:rStyle w:val="NormalTok"/>
+        </w:rPr>
+        <w:t xml:space="preserve">  </w:t>
+      </w:r>
+      <w:r>
+        <w:rPr>
+          <w:rStyle w:val="AttributeTok"/>
+        </w:rPr>
+        <w:t xml:space="preserve">progress.bar =</w:t>
+      </w:r>
+      <w:r>
+        <w:rPr>
+          <w:rStyle w:val="NormalTok"/>
+        </w:rPr>
+        <w:t xml:space="preserve"> </w:t>
+      </w:r>
+      <w:r>
+        <w:rPr>
+          <w:rStyle w:val="StringTok"/>
+        </w:rPr>
+        <w:t xml:space="preserve">"none"</w:t>
+      </w:r>
+      <w:r>
+        <w:br/>
+      </w:r>
+      <w:r>
+        <w:rPr>
+          <w:rStyle w:val="NormalTok"/>
+        </w:rPr>
+        <w:t xml:space="preserve">)</w:t>
+      </w:r>
+      <w:r>
+        <w:br/>
+      </w:r>
+      <w:r>
+        <w:rPr>
+          <w:rStyle w:val="NormalTok"/>
+        </w:rPr>
+        <w:t xml:space="preserve">draws_matrix </w:t>
+      </w:r>
+      <w:r>
+        <w:rPr>
+          <w:rStyle w:val="OtherTok"/>
+        </w:rPr>
+        <w:t xml:space="preserve">&lt;-</w:t>
+      </w:r>
+      <w:r>
+        <w:rPr>
+          <w:rStyle w:val="NormalTok"/>
+        </w:rPr>
+        <w:t xml:space="preserve"> </w:t>
+      </w:r>
+      <w:r>
+        <w:rPr>
+          <w:rStyle w:val="FunctionTok"/>
+        </w:rPr>
+        <w:t xml:space="preserve">as.matrix</w:t>
+      </w:r>
+      <w:r>
+        <w:rPr>
+          <w:rStyle w:val="NormalTok"/>
+        </w:rPr>
+        <w:t xml:space="preserve">(draws)</w:t>
+      </w:r>
+      <w:r>
+        <w:br/>
+      </w:r>
+      <w:r>
+        <w:rPr>
+          <w:rStyle w:val="FunctionTok"/>
+        </w:rPr>
+        <w:t xml:space="preserve">cbind</w:t>
+      </w:r>
+      <w:r>
+        <w:rPr>
+          <w:rStyle w:val="NormalTok"/>
+        </w:rPr>
+        <w:t xml:space="preserve">(</w:t>
+      </w:r>
+      <w:r>
+        <w:br/>
+      </w:r>
+      <w:r>
+        <w:rPr>
+          <w:rStyle w:val="NormalTok"/>
+        </w:rPr>
+        <w:t xml:space="preserve">  </w:t>
+      </w:r>
+      <w:r>
+        <w:rPr>
+          <w:rStyle w:val="AttributeTok"/>
+        </w:rPr>
+        <w:t xml:space="preserve">mean =</w:t>
+      </w:r>
+      <w:r>
+        <w:rPr>
+          <w:rStyle w:val="NormalTok"/>
+        </w:rPr>
+        <w:t xml:space="preserve"> </w:t>
+      </w:r>
+      <w:r>
+        <w:rPr>
+          <w:rStyle w:val="FunctionTok"/>
+        </w:rPr>
+        <w:t xml:space="preserve">colMeans</w:t>
+      </w:r>
+      <w:r>
+        <w:rPr>
+          <w:rStyle w:val="NormalTok"/>
+        </w:rPr>
+        <w:t xml:space="preserve">(draws_matrix),</w:t>
+      </w:r>
+      <w:r>
+        <w:br/>
+      </w:r>
+      <w:r>
+        <w:rPr>
+          <w:rStyle w:val="NormalTok"/>
+        </w:rPr>
+        <w:t xml:space="preserve">  </w:t>
+      </w:r>
+      <w:r>
+        <w:rPr>
+          <w:rStyle w:val="FunctionTok"/>
+        </w:rPr>
+        <w:t xml:space="preserve">t</w:t>
+      </w:r>
+      <w:r>
+        <w:rPr>
+          <w:rStyle w:val="NormalTok"/>
+        </w:rPr>
+        <w:t xml:space="preserve">(</w:t>
+      </w:r>
+      <w:r>
+        <w:rPr>
+          <w:rStyle w:val="FunctionTok"/>
+        </w:rPr>
+        <w:t xml:space="preserve">apply</w:t>
+      </w:r>
+      <w:r>
+        <w:rPr>
+          <w:rStyle w:val="NormalTok"/>
+        </w:rPr>
+        <w:t xml:space="preserve">(draws_matrix, </w:t>
+      </w:r>
+      <w:r>
+        <w:rPr>
+          <w:rStyle w:val="DecValTok"/>
+        </w:rPr>
+        <w:t xml:space="preserve">2</w:t>
+      </w:r>
+      <w:r>
+        <w:rPr>
+          <w:rStyle w:val="NormalTok"/>
+        </w:rPr>
+        <w:t xml:space="preserve">, stats</w:t>
+      </w:r>
+      <w:r>
+        <w:rPr>
+          <w:rStyle w:val="SpecialCharTok"/>
+        </w:rPr>
+        <w:t xml:space="preserve">::</w:t>
+      </w:r>
+      <w:r>
+        <w:rPr>
+          <w:rStyle w:val="NormalTok"/>
+        </w:rPr>
+        <w:t xml:space="preserve">quantile, </w:t>
+      </w:r>
+      <w:r>
+        <w:rPr>
+          <w:rStyle w:val="AttributeTok"/>
+        </w:rPr>
+        <w:t xml:space="preserve">probs =</w:t>
+      </w:r>
+      <w:r>
+        <w:rPr>
+          <w:rStyle w:val="NormalTok"/>
+        </w:rPr>
+        <w:t xml:space="preserve"> </w:t>
+      </w:r>
+      <w:r>
+        <w:rPr>
+          <w:rStyle w:val="FunctionTok"/>
+        </w:rPr>
+        <w:t xml:space="preserve">c</w:t>
+      </w:r>
+      <w:r>
+        <w:rPr>
+          <w:rStyle w:val="NormalTok"/>
+        </w:rPr>
+        <w:t xml:space="preserve">(</w:t>
+      </w:r>
+      <w:r>
+        <w:rPr>
+          <w:rStyle w:val="FloatTok"/>
+        </w:rPr>
+        <w:t xml:space="preserve">0.025</w:t>
+      </w:r>
+      <w:r>
+        <w:rPr>
+          <w:rStyle w:val="NormalTok"/>
+        </w:rPr>
+        <w:t xml:space="preserve">, </w:t>
+      </w:r>
+      <w:r>
+        <w:rPr>
+          <w:rStyle w:val="FloatTok"/>
+        </w:rPr>
+        <w:t xml:space="preserve">0.975</w:t>
+      </w:r>
+      <w:r>
+        <w:rPr>
+          <w:rStyle w:val="NormalTok"/>
+        </w:rPr>
+        <w:t xml:space="preserve">))),</w:t>
+      </w:r>
+      <w:r>
+        <w:br/>
+      </w:r>
+      <w:r>
+        <w:rPr>
+          <w:rStyle w:val="NormalTok"/>
+        </w:rPr>
+        <w:t xml:space="preserve">  </w:t>
+      </w:r>
+      <w:r>
+        <w:rPr>
+          <w:rStyle w:val="AttributeTok"/>
+        </w:rPr>
+        <w:t xml:space="preserve">Rhat =</w:t>
+      </w:r>
+      <w:r>
+        <w:rPr>
+          <w:rStyle w:val="NormalTok"/>
+        </w:rPr>
+        <w:t xml:space="preserve"> coda</w:t>
+      </w:r>
+      <w:r>
+        <w:rPr>
+          <w:rStyle w:val="SpecialCharTok"/>
+        </w:rPr>
+        <w:t xml:space="preserve">::</w:t>
+      </w:r>
+      <w:r>
+        <w:rPr>
+          <w:rStyle w:val="FunctionTok"/>
+        </w:rPr>
+        <w:t xml:space="preserve">gelman.diag</w:t>
+      </w:r>
+      <w:r>
+        <w:rPr>
+          <w:rStyle w:val="NormalTok"/>
+        </w:rPr>
+        <w:t xml:space="preserve">(draws, </w:t>
+      </w:r>
+      <w:r>
+        <w:rPr>
+          <w:rStyle w:val="AttributeTok"/>
+        </w:rPr>
+        <w:t xml:space="preserve">multivariate =</w:t>
+      </w:r>
+      <w:r>
+        <w:rPr>
+          <w:rStyle w:val="NormalTok"/>
+        </w:rPr>
+        <w:t xml:space="preserve"> </w:t>
+      </w:r>
+      <w:r>
+        <w:rPr>
+          <w:rStyle w:val="ConstantTok"/>
+        </w:rPr>
+        <w:t xml:space="preserve">FALSE</w:t>
+      </w:r>
+      <w:r>
+        <w:rPr>
+          <w:rStyle w:val="NormalTok"/>
+        </w:rPr>
+        <w:t xml:space="preserve">)</w:t>
+      </w:r>
+      <w:r>
+        <w:rPr>
+          <w:rStyle w:val="SpecialCharTok"/>
+        </w:rPr>
+        <w:t xml:space="preserve">$</w:t>
+      </w:r>
+      <w:r>
+        <w:rPr>
+          <w:rStyle w:val="NormalTok"/>
+        </w:rPr>
+        <w:t xml:space="preserve">psrf[, </w:t>
+      </w:r>
+      <w:r>
+        <w:rPr>
+          <w:rStyle w:val="StringTok"/>
+        </w:rPr>
+        <w:t xml:space="preserve">"Point est."</w:t>
+      </w:r>
+      <w:r>
+        <w:rPr>
+          <w:rStyle w:val="NormalTok"/>
+        </w:rPr>
+        <w:t xml:space="preserve">]</w:t>
+      </w:r>
+      <w:r>
+        <w:br/>
+      </w:r>
+      <w:r>
+        <w:rPr>
+          <w:rStyle w:val="NormalTok"/>
+        </w:rPr>
+        <w:t xml:space="preserve">) </w:t>
+      </w:r>
+      <w:r>
+        <w:rPr>
+          <w:rStyle w:val="SpecialCharTok"/>
+        </w:rPr>
+        <w:t xml:space="preserve">|&gt;</w:t>
+      </w:r>
+      <w:r>
+        <w:br/>
+      </w:r>
+      <w:r>
+        <w:rPr>
+          <w:rStyle w:val="NormalTok"/>
+        </w:rPr>
+        <w:t xml:space="preserve">  </w:t>
+      </w:r>
+      <w:r>
+        <w:rPr>
+          <w:rStyle w:val="FunctionTok"/>
+        </w:rPr>
+        <w:t xml:space="preserve">round</w:t>
+      </w:r>
+      <w:r>
+        <w:rPr>
+          <w:rStyle w:val="NormalTok"/>
+        </w:rPr>
+        <w:t xml:space="preserve">(</w:t>
+      </w:r>
+      <w:r>
+        <w:rPr>
+          <w:rStyle w:val="DecValTok"/>
+        </w:rPr>
+        <w:t xml:space="preserve">3</w:t>
+      </w:r>
+      <w:r>
+        <w:rPr>
+          <w:rStyle w:val="NormalTok"/>
+        </w:rPr>
+        <w:t xml:space="preserve">)</w:t>
+      </w:r>
+      <w:r>
+        <w:br/>
+      </w:r>
+      <w:r>
+        <w:rPr>
+          <w:rStyle w:val="CommentTok"/>
+        </w:rPr>
+        <w:t xml:space="preserve">#&gt;         mean   2.5%  97.5% Rhat</w:t>
+      </w:r>
+      <w:r>
+        <w:br/>
+      </w:r>
+      <w:r>
+        <w:rPr>
+          <w:rStyle w:val="CommentTok"/>
+        </w:rPr>
+        <w:t xml:space="preserve">#&gt; HR     0.602  0.390  0.875    1</w:t>
+      </w:r>
+      <w:r>
+        <w:br/>
+      </w:r>
+      <w:r>
+        <w:rPr>
+          <w:rStyle w:val="CommentTok"/>
+        </w:rPr>
+        <w:t xml:space="preserve">#&gt; beta0 -3.119 -3.391 -2.870    1</w:t>
+      </w:r>
+      <w:r>
+        <w:br/>
+      </w:r>
+      <w:r>
+        <w:rPr>
+          <w:rStyle w:val="CommentTok"/>
+        </w:rPr>
+        <w:t xml:space="preserve">#&gt; beta1 -0.529 -0.941 -0.133    1</w:t>
+      </w:r>
+    </w:p>
+    <w:p>
+      <w:pPr>
+        <w:pStyle w:val="FirstParagraph"/>
+      </w:pPr>
+      <w:r>
+        <w:t xml:space="preserve">About 50% of the follow-up times end in an event.</w:t>
+      </w:r>
+      <w:r>
+        <w:t xml:space="preserve"> </w:t>
+      </w:r>
+      <w:r>
+        <w:t xml:space="preserve">The 95% credible interval for</w:t>
+      </w:r>
+      <w:r>
+        <w:t xml:space="preserve"> </w:t>
+      </w:r>
+      <m:oMath>
+        <m:sSub>
+          <m:e>
+            <m:r>
+              <m:t>β</m:t>
+            </m:r>
+          </m:e>
+          <m:sub>
+            <m:r>
+              <m:t>x</m:t>
             </m:r>
           </m:sub>
         </m:sSub>
@@ -7359,7 +7529,7 @@
               </m:e>
               <m:sub>
                 <m:r>
-                  <m:t>1</m:t>
+                  <m:t>x</m:t>
                 </m:r>
               </m:sub>
             </m:sSub>

</xml_diff>

<commit_message>
Deploying to gh-pages from @ Morrison-Lab/sds@be833578baffe0a4a21170df67444c59257bf6cb 🚀
</commit_message>
<xml_diff>
--- a/bayesian-examples-handout.docx
+++ b/bayesian-examples-handout.docx
@@ -15,7 +15,7 @@
         <w:pStyle w:val="Date"/>
       </w:pPr>
       <w:r>
-        <w:t xml:space="preserve">Last modified: 2026-10-09 00:28:12 (UTC)</w:t>
+        <w:t xml:space="preserve">Last modified: 2026-10-08 18:31:00 (PDT)</w:t>
       </w:r>
     </w:p>
     <w:p>
@@ -1601,7 +1601,7 @@
     </w:p>
     <w:bookmarkEnd w:id="13"/>
     <w:bookmarkEnd w:id="14"/>
-    <w:bookmarkStart w:id="18" w:name="sec-bayes-examples-logistic"/>
+    <w:bookmarkStart w:id="19" w:name="sec-bayes-examples-logistic"/>
     <w:p>
       <w:pPr>
         <w:pStyle w:val="Heading2"/>
@@ -1993,8 +1993,33 @@
       <w:r>
         <w:t xml:space="preserve">is obtained by transforming the draws.</w:t>
       </w:r>
+      <w:r>
+        <w:t xml:space="preserve"> </w:t>
+      </w:r>
+      <w:r>
+        <w:t xml:space="preserve">For a video introduction, see Richard McElreath’s lecture</w:t>
+      </w:r>
+      <w:r>
+        <w:t xml:space="preserve"> </w:t>
+      </w:r>
+      <w:hyperlink r:id="rId16">
+        <w:r>
+          <w:rPr>
+            <w:rStyle w:val="Hyperlink"/>
+            <w:i/>
+            <w:iCs/>
+          </w:rPr>
+          <w:t xml:space="preserve">Modeling Events</w:t>
+        </w:r>
+      </w:hyperlink>
+      <w:r>
+        <w:t xml:space="preserve"> </w:t>
+      </w:r>
+      <w:r>
+        <w:t xml:space="preserve">(Statistical Rethinking 2026, Lecture A09).</w:t>
+      </w:r>
     </w:p>
-    <w:bookmarkStart w:id="17" w:name="exm-bayes-logistic"/>
+    <w:bookmarkStart w:id="18" w:name="exm-bayes-logistic"/>
     <w:p>
       <w:pPr>
         <w:pStyle w:val="BodyText"/>
@@ -3751,7 +3776,7 @@
       <w:r>
         <w:t xml:space="preserve"> </w:t>
       </w:r>
-      <w:hyperlink r:id="rId16">
+      <w:hyperlink r:id="rId17">
         <w:r>
           <w:rPr>
             <w:rStyle w:val="Hyperlink"/>
@@ -3933,9 +3958,9 @@
         <w:t xml:space="preserve">#&gt;      -0.647       1.183</w:t>
       </w:r>
     </w:p>
-    <w:bookmarkEnd w:id="17"/>
     <w:bookmarkEnd w:id="18"/>
-    <w:bookmarkStart w:id="21" w:name="sec-bayes-examples-survival"/>
+    <w:bookmarkEnd w:id="19"/>
+    <w:bookmarkStart w:id="22" w:name="sec-bayes-examples-survival"/>
     <w:p>
       <w:pPr>
         <w:pStyle w:val="Heading2"/>
@@ -3999,7 +4024,7 @@
       <w:r>
         <w:t xml:space="preserve"> </w:t>
       </w:r>
-      <w:hyperlink r:id="rId19">
+      <w:hyperlink r:id="rId20">
         <w:r>
           <w:rPr>
             <w:rStyle w:val="Hyperlink"/>
@@ -4761,7 +4786,7 @@
         <w:t xml:space="preserve">positive.</w:t>
       </w:r>
     </w:p>
-    <w:bookmarkStart w:id="20" w:name="exm-bayes-survival"/>
+    <w:bookmarkStart w:id="21" w:name="exm-bayes-survival"/>
     <w:p>
       <w:pPr>
         <w:pStyle w:val="BodyText"/>
@@ -7543,9 +7568,9 @@
         <w:t xml:space="preserve">gives the hazard ratio and its credible interval directly.</w:t>
       </w:r>
     </w:p>
-    <w:bookmarkEnd w:id="20"/>
     <w:bookmarkEnd w:id="21"/>
-    <w:bookmarkStart w:id="28" w:name="sec-bayes-examples-random-effects"/>
+    <w:bookmarkEnd w:id="22"/>
+    <w:bookmarkStart w:id="29" w:name="sec-bayes-examples-random-effects"/>
     <w:p>
       <w:pPr>
         <w:pStyle w:val="Heading2"/>
@@ -7564,7 +7589,7 @@
       <w:r>
         <w:t xml:space="preserve"> </w:t>
       </w:r>
-      <w:hyperlink r:id="rId22">
+      <w:hyperlink r:id="rId23">
         <w:r>
           <w:rPr>
             <w:rStyle w:val="Hyperlink"/>
@@ -7581,7 +7606,7 @@
       <w:r>
         <w:t xml:space="preserve"> </w:t>
       </w:r>
-      <w:hyperlink r:id="rId23">
+      <w:hyperlink r:id="rId24">
         <w:r>
           <w:rPr>
             <w:rStyle w:val="Hyperlink"/>
@@ -7798,7 +7823,7 @@
         <w:t xml:space="preserve">into every group-level summary.</w:t>
       </w:r>
     </w:p>
-    <w:bookmarkStart w:id="27" w:name="exm-bayes-random-effects"/>
+    <w:bookmarkStart w:id="28" w:name="exm-bayes-random-effects"/>
     <w:p>
       <w:pPr>
         <w:pStyle w:val="BodyText"/>
@@ -8039,7 +8064,7 @@
       <w:r>
         <w:t xml:space="preserve"> </w:t>
       </w:r>
-      <w:hyperlink r:id="rId24">
+      <w:hyperlink r:id="rId25">
         <w:r>
           <w:rPr>
             <w:rStyle w:val="Hyperlink"/>
@@ -8128,7 +8153,7 @@
       <w:r>
         <w:t xml:space="preserve"> </w:t>
       </w:r>
-      <w:hyperlink r:id="rId25">
+      <w:hyperlink r:id="rId26">
         <w:r>
           <w:rPr>
             <w:rStyle w:val="Hyperlink"/>
@@ -10278,7 +10303,7 @@
       <w:r>
         <w:t xml:space="preserve"> </w:t>
       </w:r>
-      <w:hyperlink r:id="rId26">
+      <w:hyperlink r:id="rId27">
         <w:r>
           <w:rPr>
             <w:rStyle w:val="Hyperlink"/>
@@ -10302,9 +10327,9 @@
         <w:t xml:space="preserve">is pulled furthest toward the overall mean.</w:t>
       </w:r>
     </w:p>
-    <w:bookmarkEnd w:id="27"/>
     <w:bookmarkEnd w:id="28"/>
-    <w:bookmarkStart w:id="37" w:name="sec-bayes-examples-bma"/>
+    <w:bookmarkEnd w:id="29"/>
+    <w:bookmarkStart w:id="38" w:name="sec-bayes-examples-bma"/>
     <w:p>
       <w:pPr>
         <w:pStyle w:val="Heading2"/>
@@ -10402,7 +10427,7 @@
       <w:r>
         <w:t xml:space="preserve"> </w:t>
       </w:r>
-      <w:hyperlink r:id="rId29">
+      <w:hyperlink r:id="rId30">
         <w:r>
           <w:rPr>
             <w:rStyle w:val="Hyperlink"/>
@@ -10414,7 +10439,7 @@
         <w:t xml:space="preserve">.</w:t>
       </w:r>
     </w:p>
-    <w:bookmarkStart w:id="31" w:name="def-posterior-model-probability"/>
+    <w:bookmarkStart w:id="32" w:name="def-posterior-model-probability"/>
     <w:p>
       <w:pPr>
         <w:pStyle w:val="BodyText"/>
@@ -10598,7 +10623,7 @@
       <w:r>
         <w:t xml:space="preserve"> </w:t>
       </w:r>
-      <w:hyperlink r:id="rId30">
+      <w:hyperlink r:id="rId31">
         <w:r>
           <w:rPr>
             <w:rStyle w:val="Hyperlink"/>
@@ -10957,8 +10982,8 @@
         </m:oMath>
       </m:oMathPara>
     </w:p>
-    <w:bookmarkEnd w:id="31"/>
-    <w:bookmarkStart w:id="32" w:name="exm-posterior-model-probability"/>
+    <w:bookmarkEnd w:id="32"/>
+    <w:bookmarkStart w:id="33" w:name="exm-posterior-model-probability"/>
     <w:p>
       <w:pPr>
         <w:pStyle w:val="FirstParagraph"/>
@@ -11363,8 +11388,8 @@
         <w:t xml:space="preserve">.</w:t>
       </w:r>
     </w:p>
-    <w:bookmarkEnd w:id="32"/>
-    <w:bookmarkStart w:id="33" w:name="def-bma"/>
+    <w:bookmarkEnd w:id="33"/>
+    <w:bookmarkStart w:id="34" w:name="def-bma"/>
     <w:p>
       <w:pPr>
         <w:pStyle w:val="BodyText"/>
@@ -11753,8 +11778,8 @@
         </m:oMath>
       </m:oMathPara>
     </w:p>
-    <w:bookmarkEnd w:id="33"/>
-    <w:bookmarkStart w:id="34" w:name="def-pip"/>
+    <w:bookmarkEnd w:id="34"/>
+    <w:bookmarkStart w:id="35" w:name="def-pip"/>
     <w:p>
       <w:pPr>
         <w:pStyle w:val="FirstParagraph"/>
@@ -11818,8 +11843,8 @@
         <w:t xml:space="preserve">is the total posterior probability of the models that include it.</w:t>
       </w:r>
     </w:p>
-    <w:bookmarkEnd w:id="34"/>
-    <w:bookmarkStart w:id="36" w:name="exm-bayes-bma"/>
+    <w:bookmarkEnd w:id="35"/>
+    <w:bookmarkStart w:id="37" w:name="exm-bayes-bma"/>
     <w:p>
       <w:pPr>
         <w:pStyle w:val="BodyText"/>
@@ -11852,7 +11877,7 @@
       <w:r>
         <w:t xml:space="preserve"> </w:t>
       </w:r>
-      <w:hyperlink r:id="rId35">
+      <w:hyperlink r:id="rId36">
         <w:r>
           <w:rPr>
             <w:rStyle w:val="Hyperlink"/>
@@ -14737,9 +14762,9 @@
         <w:t xml:space="preserve">not because of the averaging.</w:t>
       </w:r>
     </w:p>
-    <w:bookmarkEnd w:id="36"/>
     <w:bookmarkEnd w:id="37"/>
-    <w:bookmarkStart w:id="43" w:name="references"/>
+    <w:bookmarkEnd w:id="38"/>
+    <w:bookmarkStart w:id="44" w:name="references"/>
     <w:p>
       <w:pPr>
         <w:pStyle w:val="Heading2"/>
@@ -14748,8 +14773,8 @@
         <w:t xml:space="preserve">References</w:t>
       </w:r>
     </w:p>
-    <w:bookmarkStart w:id="42" w:name="refs"/>
-    <w:bookmarkStart w:id="39" w:name="ref-dobson4e"/>
+    <w:bookmarkStart w:id="43" w:name="refs"/>
+    <w:bookmarkStart w:id="40" w:name="ref-dobson4e"/>
     <w:p>
       <w:pPr>
         <w:pStyle w:val="Bibliography"/>
@@ -14773,7 +14798,7 @@
       <w:r>
         <w:t xml:space="preserve"> </w:t>
       </w:r>
-      <w:hyperlink r:id="rId38">
+      <w:hyperlink r:id="rId39">
         <w:r>
           <w:rPr>
             <w:rStyle w:val="Hyperlink"/>
@@ -14785,8 +14810,8 @@
         <w:t xml:space="preserve">.</w:t>
       </w:r>
     </w:p>
-    <w:bookmarkEnd w:id="39"/>
-    <w:bookmarkStart w:id="41" w:name="ref-schwarz1978estimating"/>
+    <w:bookmarkEnd w:id="40"/>
+    <w:bookmarkStart w:id="42" w:name="ref-schwarz1978estimating"/>
     <w:p>
       <w:pPr>
         <w:pStyle w:val="Bibliography"/>
@@ -14819,7 +14844,7 @@
       <w:r>
         <w:t xml:space="preserve"> </w:t>
       </w:r>
-      <w:hyperlink r:id="rId40">
+      <w:hyperlink r:id="rId41">
         <w:r>
           <w:rPr>
             <w:rStyle w:val="Hyperlink"/>
@@ -14831,9 +14856,9 @@
         <w:t xml:space="preserve">.</w:t>
       </w:r>
     </w:p>
-    <w:bookmarkEnd w:id="41"/>
     <w:bookmarkEnd w:id="42"/>
     <w:bookmarkEnd w:id="43"/>
+    <w:bookmarkEnd w:id="44"/>
     <w:sectPr>
       <w:footnotePr>
         <w:numRestart w:val="eachSect"/>

</xml_diff>

<commit_message>
Deploying to gh-pages from @ Morrison-Lab/sds@11cb9bb228f93d85896b14bc950444e7f4f730e4 🚀
</commit_message>
<xml_diff>
--- a/bayesian-examples-handout.docx
+++ b/bayesian-examples-handout.docx
@@ -15,7 +15,7 @@
         <w:pStyle w:val="Date"/>
       </w:pPr>
       <w:r>
-        <w:t xml:space="preserve">Last modified: 2026-10-16 02:26:19 (PDT)</w:t>
+        <w:t xml:space="preserve">Last modified: 2026-10-16 02:40:23 (PDT)</w:t>
       </w:r>
     </w:p>
     <w:p>
@@ -1718,16 +1718,21 @@
         </m:r>
         <m:sSub>
           <m:e>
-            <m:acc>
-              <m:accPr>
-                <m:chr m:val="̃"/>
-              </m:accPr>
+            <m:limLow>
               <m:e>
                 <m:r>
                   <m:t>x</m:t>
                 </m:r>
               </m:e>
-            </m:acc>
+              <m:lim>
+                <m:r>
+                  <m:rPr>
+                    <m:sty m:val="p"/>
+                  </m:rPr>
+                  <m:t>∼</m:t>
+                </m:r>
+              </m:lim>
+            </m:limLow>
           </m:e>
           <m:sub>
             <m:r>
@@ -1741,16 +1746,21 @@
           </m:rPr>
           <m:t>⋅</m:t>
         </m:r>
-        <m:acc>
-          <m:accPr>
-            <m:chr m:val="̃"/>
-          </m:accPr>
+        <m:limLow>
           <m:e>
             <m:r>
               <m:t>β</m:t>
             </m:r>
           </m:e>
-        </m:acc>
+          <m:lim>
+            <m:r>
+              <m:rPr>
+                <m:sty m:val="p"/>
+              </m:rPr>
+              <m:t>∼</m:t>
+            </m:r>
+          </m:lim>
+        </m:limLow>
       </m:oMath>
       <w:r>
         <w:t xml:space="preserve">,</w:t>
@@ -1788,16 +1798,21 @@
         <w:t xml:space="preserve"> </w:t>
       </w:r>
       <m:oMath>
-        <m:acc>
-          <m:accPr>
-            <m:chr m:val="̃"/>
-          </m:accPr>
+        <m:limLow>
           <m:e>
             <m:r>
               <m:t>β</m:t>
             </m:r>
           </m:e>
-        </m:acc>
+          <m:lim>
+            <m:r>
+              <m:rPr>
+                <m:sty m:val="p"/>
+              </m:rPr>
+              <m:t>∼</m:t>
+            </m:r>
+          </m:lim>
+        </m:limLow>
       </m:oMath>
       <w:r>
         <w:t xml:space="preserve"> </w:t>
@@ -1821,32 +1836,42 @@
           </m:rPr>
           <m:t>(</m:t>
         </m:r>
-        <m:acc>
-          <m:accPr>
-            <m:chr m:val="̃"/>
-          </m:accPr>
+        <m:limLow>
           <m:e>
             <m:r>
               <m:t>β</m:t>
             </m:r>
           </m:e>
-        </m:acc>
+          <m:lim>
+            <m:r>
+              <m:rPr>
+                <m:sty m:val="p"/>
+              </m:rPr>
+              <m:t>∼</m:t>
+            </m:r>
+          </m:lim>
+        </m:limLow>
         <m:r>
           <m:rPr>
             <m:sty m:val="p"/>
           </m:rPr>
           <m:t>∣</m:t>
         </m:r>
-        <m:acc>
-          <m:accPr>
-            <m:chr m:val="̃"/>
-          </m:accPr>
+        <m:limLow>
           <m:e>
             <m:r>
               <m:t>y</m:t>
             </m:r>
           </m:e>
-        </m:acc>
+          <m:lim>
+            <m:r>
+              <m:rPr>
+                <m:sty m:val="p"/>
+              </m:rPr>
+              <m:t>∼</m:t>
+            </m:r>
+          </m:lim>
+        </m:limLow>
         <m:r>
           <m:rPr>
             <m:sty m:val="p"/>
@@ -1973,16 +1998,21 @@
         <w:t xml:space="preserve"> </w:t>
       </w:r>
       <m:oMath>
-        <m:acc>
-          <m:accPr>
-            <m:chr m:val="̃"/>
-          </m:accPr>
+        <m:limLow>
           <m:e>
             <m:r>
               <m:t>β</m:t>
             </m:r>
           </m:e>
-        </m:acc>
+          <m:lim>
+            <m:r>
+              <m:rPr>
+                <m:sty m:val="p"/>
+              </m:rPr>
+              <m:t>∼</m:t>
+            </m:r>
+          </m:lim>
+        </m:limLow>
       </m:oMath>
       <w:r>
         <w:t xml:space="preserve">,</w:t>
@@ -10579,16 +10609,21 @@
           </m:rPr>
           <m:t>(</m:t>
         </m:r>
-        <m:acc>
-          <m:accPr>
-            <m:chr m:val="̃"/>
-          </m:accPr>
+        <m:limLow>
           <m:e>
             <m:r>
               <m:t>y</m:t>
             </m:r>
           </m:e>
-        </m:acc>
+          <m:lim>
+            <m:r>
+              <m:rPr>
+                <m:sty m:val="p"/>
+              </m:rPr>
+              <m:t>∼</m:t>
+            </m:r>
+          </m:lim>
+        </m:limLow>
         <m:r>
           <m:rPr>
             <m:sty m:val="p"/>
@@ -10742,16 +10777,21 @@
             </m:rPr>
             <m:t>∣</m:t>
           </m:r>
-          <m:acc>
-            <m:accPr>
-              <m:chr m:val="̃"/>
-            </m:accPr>
+          <m:limLow>
             <m:e>
               <m:r>
                 <m:t>y</m:t>
               </m:r>
             </m:e>
-          </m:acc>
+            <m:lim>
+              <m:r>
+                <m:rPr>
+                  <m:sty m:val="p"/>
+                </m:rPr>
+                <m:t>∼</m:t>
+              </m:r>
+            </m:lim>
+          </m:limLow>
           <m:r>
             <m:rPr>
               <m:sty m:val="p"/>
@@ -10794,16 +10834,21 @@
                 </m:rPr>
                 <m:t>(</m:t>
               </m:r>
-              <m:acc>
-                <m:accPr>
-                  <m:chr m:val="̃"/>
-                </m:accPr>
+              <m:limLow>
                 <m:e>
                   <m:r>
                     <m:t>y</m:t>
                   </m:r>
                 </m:e>
-              </m:acc>
+                <m:lim>
+                  <m:r>
+                    <m:rPr>
+                      <m:sty m:val="p"/>
+                    </m:rPr>
+                    <m:t>∼</m:t>
+                  </m:r>
+                </m:lim>
+              </m:limLow>
               <m:r>
                 <m:rPr>
                   <m:sty m:val="p"/>
@@ -10904,16 +10949,21 @@
                 </m:rPr>
                 <m:t>(</m:t>
               </m:r>
-              <m:acc>
-                <m:accPr>
-                  <m:chr m:val="̃"/>
-                </m:accPr>
+              <m:limLow>
                 <m:e>
                   <m:r>
                     <m:t>y</m:t>
                   </m:r>
                 </m:e>
-              </m:acc>
+                <m:lim>
+                  <m:r>
+                    <m:rPr>
+                      <m:sty m:val="p"/>
+                    </m:rPr>
+                    <m:t>∼</m:t>
+                  </m:r>
+                </m:lim>
+              </m:limLow>
               <m:r>
                 <m:rPr>
                   <m:sty m:val="p"/>
@@ -11124,16 +11174,21 @@
           </m:rPr>
           <m:t>(</m:t>
         </m:r>
-        <m:acc>
-          <m:accPr>
-            <m:chr m:val="̃"/>
-          </m:accPr>
+        <m:limLow>
           <m:e>
             <m:r>
               <m:t>y</m:t>
             </m:r>
           </m:e>
-        </m:acc>
+          <m:lim>
+            <m:r>
+              <m:rPr>
+                <m:sty m:val="p"/>
+              </m:rPr>
+              <m:t>∼</m:t>
+            </m:r>
+          </m:lim>
+        </m:limLow>
         <m:r>
           <m:rPr>
             <m:sty m:val="p"/>
@@ -11190,16 +11245,21 @@
           </m:rPr>
           <m:t>(</m:t>
         </m:r>
-        <m:acc>
-          <m:accPr>
-            <m:chr m:val="̃"/>
-          </m:accPr>
+        <m:limLow>
           <m:e>
             <m:r>
               <m:t>y</m:t>
             </m:r>
           </m:e>
-        </m:acc>
+          <m:lim>
+            <m:r>
+              <m:rPr>
+                <m:sty m:val="p"/>
+              </m:rPr>
+              <m:t>∼</m:t>
+            </m:r>
+          </m:lim>
+        </m:limLow>
         <m:r>
           <m:rPr>
             <m:sty m:val="p"/>
@@ -11282,16 +11342,21 @@
                 </m:rPr>
                 <m:t>∣</m:t>
               </m:r>
-              <m:acc>
-                <m:accPr>
-                  <m:chr m:val="̃"/>
-                </m:accPr>
+              <m:limLow>
                 <m:e>
                   <m:r>
                     <m:t>y</m:t>
                   </m:r>
                 </m:e>
-              </m:acc>
+                <m:lim>
+                  <m:r>
+                    <m:rPr>
+                      <m:sty m:val="p"/>
+                    </m:rPr>
+                    <m:t>∼</m:t>
+                  </m:r>
+                </m:lim>
+              </m:limLow>
               <m:r>
                 <m:rPr>
                   <m:sty m:val="p"/>
@@ -11400,16 +11465,21 @@
           </m:rPr>
           <m:t>∣</m:t>
         </m:r>
-        <m:acc>
-          <m:accPr>
-            <m:chr m:val="̃"/>
-          </m:accPr>
+        <m:limLow>
           <m:e>
             <m:r>
               <m:t>y</m:t>
             </m:r>
           </m:e>
-        </m:acc>
+          <m:lim>
+            <m:r>
+              <m:rPr>
+                <m:sty m:val="p"/>
+              </m:rPr>
+              <m:t>∼</m:t>
+            </m:r>
+          </m:lim>
+        </m:limLow>
         <m:r>
           <m:rPr>
             <m:sty m:val="p"/>
@@ -11494,16 +11564,21 @@
           </m:rPr>
           <m:t>∣</m:t>
         </m:r>
-        <m:acc>
-          <m:accPr>
-            <m:chr m:val="̃"/>
-          </m:accPr>
+        <m:limLow>
           <m:e>
             <m:r>
               <m:t>y</m:t>
             </m:r>
           </m:e>
-        </m:acc>
+          <m:lim>
+            <m:r>
+              <m:rPr>
+                <m:sty m:val="p"/>
+              </m:rPr>
+              <m:t>∼</m:t>
+            </m:r>
+          </m:lim>
+        </m:limLow>
         <m:r>
           <m:rPr>
             <m:sty m:val="p"/>
@@ -11640,16 +11715,21 @@
             </m:rPr>
             <m:t>∣</m:t>
           </m:r>
-          <m:acc>
-            <m:accPr>
-              <m:chr m:val="̃"/>
-            </m:accPr>
+          <m:limLow>
             <m:e>
               <m:r>
                 <m:t>y</m:t>
               </m:r>
             </m:e>
-          </m:acc>
+            <m:lim>
+              <m:r>
+                <m:rPr>
+                  <m:sty m:val="p"/>
+                </m:rPr>
+                <m:t>∼</m:t>
+              </m:r>
+            </m:lim>
+          </m:limLow>
           <m:r>
             <m:rPr>
               <m:sty m:val="p"/>
@@ -11746,16 +11826,21 @@
             </m:rPr>
             <m:t>,</m:t>
           </m:r>
-          <m:acc>
-            <m:accPr>
-              <m:chr m:val="̃"/>
-            </m:accPr>
+          <m:limLow>
             <m:e>
               <m:r>
                 <m:t>y</m:t>
               </m:r>
             </m:e>
-          </m:acc>
+            <m:lim>
+              <m:r>
+                <m:rPr>
+                  <m:sty m:val="p"/>
+                </m:rPr>
+                <m:t>∼</m:t>
+              </m:r>
+            </m:lim>
+          </m:limLow>
           <m:r>
             <m:rPr>
               <m:sty m:val="p"/>
@@ -11795,16 +11880,21 @@
             </m:rPr>
             <m:t>∣</m:t>
           </m:r>
-          <m:acc>
-            <m:accPr>
-              <m:chr m:val="̃"/>
-            </m:accPr>
+          <m:limLow>
             <m:e>
               <m:r>
                 <m:t>y</m:t>
               </m:r>
             </m:e>
-          </m:acc>
+            <m:lim>
+              <m:r>
+                <m:rPr>
+                  <m:sty m:val="p"/>
+                </m:rPr>
+                <m:t>∼</m:t>
+              </m:r>
+            </m:lim>
+          </m:limLow>
           <m:r>
             <m:rPr>
               <m:sty m:val="p"/>
@@ -11982,16 +12072,21 @@
             </m:rPr>
             <m:t>∣</m:t>
           </m:r>
-          <m:acc>
-            <m:accPr>
-              <m:chr m:val="̃"/>
-            </m:accPr>
+          <m:limLow>
             <m:e>
               <m:r>
                 <m:t>y</m:t>
               </m:r>
             </m:e>
-          </m:acc>
+            <m:lim>
+              <m:r>
+                <m:rPr>
+                  <m:sty m:val="p"/>
+                </m:rPr>
+                <m:t>∼</m:t>
+              </m:r>
+            </m:lim>
+          </m:limLow>
           <m:r>
             <m:rPr>
               <m:sty m:val="p"/>

</xml_diff>

<commit_message>
Deploying to gh-pages from @ Morrison-Lab/sds@feafc2ed569efcbe59d7c81a2fb07a29dd152692 🚀
</commit_message>
<xml_diff>
--- a/bayesian-examples-handout.docx
+++ b/bayesian-examples-handout.docx
@@ -15,7 +15,7 @@
         <w:pStyle w:val="Date"/>
       </w:pPr>
       <w:r>
-        <w:t xml:space="preserve">Last modified: 2026-10-16 16:37:17 (PDT)</w:t>
+        <w:t xml:space="preserve">Last modified: 2026-10-16 18:58:08 (PDT)</w:t>
       </w:r>
     </w:p>
     <w:p>
@@ -1679,89 +1679,9 @@
       <w:r>
         <w:t xml:space="preserve"> </w:t>
       </w:r>
-      <m:oMath>
-        <m:r>
-          <m:rPr>
-            <m:sty m:val="p"/>
-          </m:rPr>
-          <m:t>logit</m:t>
-        </m:r>
-        <m:r>
-          <m:rPr>
-            <m:sty m:val="p"/>
-          </m:rPr>
-          <m:t>(</m:t>
-        </m:r>
-        <m:sSub>
-          <m:e>
-            <m:r>
-              <m:t>π</m:t>
-            </m:r>
-          </m:e>
-          <m:sub>
-            <m:r>
-              <m:t>i</m:t>
-            </m:r>
-          </m:sub>
-        </m:sSub>
-        <m:r>
-          <m:rPr>
-            <m:sty m:val="p"/>
-          </m:rPr>
-          <m:t>)</m:t>
-        </m:r>
-        <m:r>
-          <m:rPr>
-            <m:sty m:val="p"/>
-          </m:rPr>
-          <m:t>=</m:t>
-        </m:r>
-        <m:sSub>
-          <m:e>
-            <m:limLow>
-              <m:e>
-                <m:r>
-                  <m:t>x</m:t>
-                </m:r>
-              </m:e>
-              <m:lim>
-                <m:r>
-                  <m:rPr>
-                    <m:sty m:val="p"/>
-                  </m:rPr>
-                  <m:t>∼</m:t>
-                </m:r>
-              </m:lim>
-            </m:limLow>
-          </m:e>
-          <m:sub>
-            <m:r>
-              <m:t>i</m:t>
-            </m:r>
-          </m:sub>
-        </m:sSub>
-        <m:r>
-          <m:rPr>
-            <m:sty m:val="p"/>
-          </m:rPr>
-          <m:t>⋅</m:t>
-        </m:r>
-        <m:limLow>
-          <m:e>
-            <m:r>
-              <m:t>β</m:t>
-            </m:r>
-          </m:e>
-          <m:lim>
-            <m:r>
-              <m:rPr>
-                <m:sty m:val="p"/>
-              </m:rPr>
-              <m:t>∼</m:t>
-            </m:r>
-          </m:lim>
-        </m:limLow>
-      </m:oMath>
+      <w:r>
+        <w:t xml:space="preserve">$\operatorname{logit}(\pi_i) = \mathord{\smash[b]{\underset{\raise.3ex\hbox{$\scriptstyle\sim$}}{x}}\vphantom{x}}_i \cdot \mathord{\smash[b]{\underset{\raise.3ex\hbox{$\scriptstyle\sim$}}{\beta}}\vphantom{\beta}}$</w:t>
+      </w:r>
       <w:r>
         <w:t xml:space="preserve">,</w:t>
       </w:r>
@@ -1797,23 +1717,9 @@
       <w:r>
         <w:t xml:space="preserve"> </w:t>
       </w:r>
-      <m:oMath>
-        <m:limLow>
-          <m:e>
-            <m:r>
-              <m:t>β</m:t>
-            </m:r>
-          </m:e>
-          <m:lim>
-            <m:r>
-              <m:rPr>
-                <m:sty m:val="p"/>
-              </m:rPr>
-              <m:t>∼</m:t>
-            </m:r>
-          </m:lim>
-        </m:limLow>
-      </m:oMath>
+      <w:r>
+        <w:t xml:space="preserve">$\mathord{\smash[b]{\underset{\raise.3ex\hbox{$\scriptstyle\sim$}}{\beta}}\vphantom{\beta}}$</w:t>
+      </w:r>
       <w:r>
         <w:t xml:space="preserve"> </w:t>
       </w:r>
@@ -1823,62 +1729,9 @@
       <w:r>
         <w:t xml:space="preserve"> </w:t>
       </w:r>
-      <m:oMath>
-        <m:r>
-          <m:rPr>
-            <m:sty m:val="p"/>
-          </m:rPr>
-          <m:t>p</m:t>
-        </m:r>
-        <m:r>
-          <m:rPr>
-            <m:sty m:val="p"/>
-          </m:rPr>
-          <m:t>(</m:t>
-        </m:r>
-        <m:limLow>
-          <m:e>
-            <m:r>
-              <m:t>β</m:t>
-            </m:r>
-          </m:e>
-          <m:lim>
-            <m:r>
-              <m:rPr>
-                <m:sty m:val="p"/>
-              </m:rPr>
-              <m:t>∼</m:t>
-            </m:r>
-          </m:lim>
-        </m:limLow>
-        <m:r>
-          <m:rPr>
-            <m:sty m:val="p"/>
-          </m:rPr>
-          <m:t>∣</m:t>
-        </m:r>
-        <m:limLow>
-          <m:e>
-            <m:r>
-              <m:t>y</m:t>
-            </m:r>
-          </m:e>
-          <m:lim>
-            <m:r>
-              <m:rPr>
-                <m:sty m:val="p"/>
-              </m:rPr>
-              <m:t>∼</m:t>
-            </m:r>
-          </m:lim>
-        </m:limLow>
-        <m:r>
-          <m:rPr>
-            <m:sty m:val="p"/>
-          </m:rPr>
-          <m:t>)</m:t>
-        </m:r>
-      </m:oMath>
+      <w:r>
+        <w:t xml:space="preserve">$\operatorname{p}(\mathord{\smash[b]{\underset{\raise.3ex\hbox{$\scriptstyle\sim$}}{\beta}}\vphantom{\beta}}\mid \mathord{\smash[b]{\underset{\raise.3ex\hbox{$\scriptstyle\sim$}}{y}}\vphantom{y}})$</w:t>
+      </w:r>
       <w:r>
         <w:t xml:space="preserve"> </w:t>
       </w:r>
@@ -1997,23 +1850,9 @@
       <w:r>
         <w:t xml:space="preserve"> </w:t>
       </w:r>
-      <m:oMath>
-        <m:limLow>
-          <m:e>
-            <m:r>
-              <m:t>β</m:t>
-            </m:r>
-          </m:e>
-          <m:lim>
-            <m:r>
-              <m:rPr>
-                <m:sty m:val="p"/>
-              </m:rPr>
-              <m:t>∼</m:t>
-            </m:r>
-          </m:lim>
-        </m:limLow>
-      </m:oMath>
+      <w:r>
+        <w:t xml:space="preserve">$\mathord{\smash[b]{\underset{\raise.3ex\hbox{$\scriptstyle\sim$}}{\beta}}\vphantom{\beta}}$</w:t>
+      </w:r>
       <w:r>
         <w:t xml:space="preserve">,</w:t>
       </w:r>
@@ -10596,59 +10435,9 @@
       <w:r>
         <w:t xml:space="preserve"> </w:t>
       </w:r>
-      <m:oMath>
-        <m:r>
-          <m:rPr>
-            <m:sty m:val="p"/>
-          </m:rPr>
-          <m:t>p</m:t>
-        </m:r>
-        <m:r>
-          <m:rPr>
-            <m:sty m:val="p"/>
-          </m:rPr>
-          <m:t>(</m:t>
-        </m:r>
-        <m:limLow>
-          <m:e>
-            <m:r>
-              <m:t>y</m:t>
-            </m:r>
-          </m:e>
-          <m:lim>
-            <m:r>
-              <m:rPr>
-                <m:sty m:val="p"/>
-              </m:rPr>
-              <m:t>∼</m:t>
-            </m:r>
-          </m:lim>
-        </m:limLow>
-        <m:r>
-          <m:rPr>
-            <m:sty m:val="p"/>
-          </m:rPr>
-          <m:t>∣</m:t>
-        </m:r>
-        <m:sSub>
-          <m:e>
-            <m:r>
-              <m:t>M</m:t>
-            </m:r>
-          </m:e>
-          <m:sub>
-            <m:r>
-              <m:t>k</m:t>
-            </m:r>
-          </m:sub>
-        </m:sSub>
-        <m:r>
-          <m:rPr>
-            <m:sty m:val="p"/>
-          </m:rPr>
-          <m:t>)</m:t>
-        </m:r>
-      </m:oMath>
+      <w:r>
+        <w:t xml:space="preserve">$\operatorname{p}(\mathord{\smash[b]{\underset{\raise.3ex\hbox{$\scriptstyle\sim$}}{y}}\vphantom{y}}\mid M_k)$</w:t>
+      </w:r>
       <w:r>
         <w:t xml:space="preserve"> </w:t>
       </w:r>
@@ -10742,295 +10531,12 @@
       <w:pPr>
         <w:pStyle w:val="BodyText"/>
       </w:pPr>
-      <m:oMathPara>
-        <m:oMathParaPr>
-          <m:jc m:val="center"/>
-        </m:oMathParaPr>
-        <m:oMath>
-          <m:r>
-            <m:rPr>
-              <m:sty m:val="p"/>
-            </m:rPr>
-            <m:t>p</m:t>
-          </m:r>
-          <m:r>
-            <m:rPr>
-              <m:sty m:val="p"/>
-            </m:rPr>
-            <m:t>(</m:t>
-          </m:r>
-          <m:sSub>
-            <m:e>
-              <m:r>
-                <m:t>M</m:t>
-              </m:r>
-            </m:e>
-            <m:sub>
-              <m:r>
-                <m:t>k</m:t>
-              </m:r>
-            </m:sub>
-          </m:sSub>
-          <m:r>
-            <m:rPr>
-              <m:sty m:val="p"/>
-            </m:rPr>
-            <m:t>∣</m:t>
-          </m:r>
-          <m:limLow>
-            <m:e>
-              <m:r>
-                <m:t>y</m:t>
-              </m:r>
-            </m:e>
-            <m:lim>
-              <m:r>
-                <m:rPr>
-                  <m:sty m:val="p"/>
-                </m:rPr>
-                <m:t>∼</m:t>
-              </m:r>
-            </m:lim>
-          </m:limLow>
-          <m:r>
-            <m:rPr>
-              <m:sty m:val="p"/>
-            </m:rPr>
-            <m:t>)</m:t>
-          </m:r>
-          <m:limUpp>
-            <m:e>
-              <m:r>
-                <m:rPr>
-                  <m:sty m:val="p"/>
-                </m:rPr>
-                <m:t>=</m:t>
-              </m:r>
-            </m:e>
-            <m:lim>
-              <m:r>
-                <m:rPr>
-                  <m:nor/>
-                  <m:sty m:val="p"/>
-                </m:rPr>
-                <m:t>def</m:t>
-              </m:r>
-            </m:lim>
-          </m:limUpp>
-          <m:f>
-            <m:fPr>
-              <m:type m:val="bar"/>
-            </m:fPr>
-            <m:num>
-              <m:r>
-                <m:rPr>
-                  <m:sty m:val="p"/>
-                </m:rPr>
-                <m:t>p</m:t>
-              </m:r>
-              <m:r>
-                <m:rPr>
-                  <m:sty m:val="p"/>
-                </m:rPr>
-                <m:t>(</m:t>
-              </m:r>
-              <m:limLow>
-                <m:e>
-                  <m:r>
-                    <m:t>y</m:t>
-                  </m:r>
-                </m:e>
-                <m:lim>
-                  <m:r>
-                    <m:rPr>
-                      <m:sty m:val="p"/>
-                    </m:rPr>
-                    <m:t>∼</m:t>
-                  </m:r>
-                </m:lim>
-              </m:limLow>
-              <m:r>
-                <m:rPr>
-                  <m:sty m:val="p"/>
-                </m:rPr>
-                <m:t>∣</m:t>
-              </m:r>
-              <m:sSub>
-                <m:e>
-                  <m:r>
-                    <m:t>M</m:t>
-                  </m:r>
-                </m:e>
-                <m:sub>
-                  <m:r>
-                    <m:t>k</m:t>
-                  </m:r>
-                </m:sub>
-              </m:sSub>
-              <m:r>
-                <m:rPr>
-                  <m:sty m:val="p"/>
-                </m:rPr>
-                <m:t>)</m:t>
-              </m:r>
-              <m:r>
-                <m:t> </m:t>
-              </m:r>
-              <m:r>
-                <m:rPr>
-                  <m:sty m:val="p"/>
-                </m:rPr>
-                <m:t>p</m:t>
-              </m:r>
-              <m:r>
-                <m:rPr>
-                  <m:sty m:val="p"/>
-                </m:rPr>
-                <m:t>(</m:t>
-              </m:r>
-              <m:sSub>
-                <m:e>
-                  <m:r>
-                    <m:t>M</m:t>
-                  </m:r>
-                </m:e>
-                <m:sub>
-                  <m:r>
-                    <m:t>k</m:t>
-                  </m:r>
-                </m:sub>
-              </m:sSub>
-              <m:r>
-                <m:rPr>
-                  <m:sty m:val="p"/>
-                </m:rPr>
-                <m:t>)</m:t>
-              </m:r>
-            </m:num>
-            <m:den>
-              <m:nary>
-                <m:naryPr>
-                  <m:chr m:val="∑"/>
-                  <m:limLoc m:val="undOvr"/>
-                  <m:subHide m:val="off"/>
-                  <m:supHide m:val="off"/>
-                </m:naryPr>
-                <m:sub>
-                  <m:r>
-                    <m:t>l</m:t>
-                  </m:r>
-                  <m:r>
-                    <m:rPr>
-                      <m:sty m:val="p"/>
-                    </m:rPr>
-                    <m:t>=</m:t>
-                  </m:r>
-                  <m:r>
-                    <m:t>1</m:t>
-                  </m:r>
-                </m:sub>
-                <m:sup>
-                  <m:r>
-                    <m:t>K</m:t>
-                  </m:r>
-                </m:sup>
-                <m:e>
-                  <m:r>
-                    <m:rPr>
-                      <m:sty m:val="p"/>
-                    </m:rPr>
-                    <m:t>p</m:t>
-                  </m:r>
-                </m:e>
-              </m:nary>
-              <m:r>
-                <m:rPr>
-                  <m:sty m:val="p"/>
-                </m:rPr>
-                <m:t>(</m:t>
-              </m:r>
-              <m:limLow>
-                <m:e>
-                  <m:r>
-                    <m:t>y</m:t>
-                  </m:r>
-                </m:e>
-                <m:lim>
-                  <m:r>
-                    <m:rPr>
-                      <m:sty m:val="p"/>
-                    </m:rPr>
-                    <m:t>∼</m:t>
-                  </m:r>
-                </m:lim>
-              </m:limLow>
-              <m:r>
-                <m:rPr>
-                  <m:sty m:val="p"/>
-                </m:rPr>
-                <m:t>∣</m:t>
-              </m:r>
-              <m:sSub>
-                <m:e>
-                  <m:r>
-                    <m:t>M</m:t>
-                  </m:r>
-                </m:e>
-                <m:sub>
-                  <m:r>
-                    <m:t>l</m:t>
-                  </m:r>
-                </m:sub>
-              </m:sSub>
-              <m:r>
-                <m:rPr>
-                  <m:sty m:val="p"/>
-                </m:rPr>
-                <m:t>)</m:t>
-              </m:r>
-              <m:r>
-                <m:t> </m:t>
-              </m:r>
-              <m:r>
-                <m:rPr>
-                  <m:sty m:val="p"/>
-                </m:rPr>
-                <m:t>p</m:t>
-              </m:r>
-              <m:r>
-                <m:rPr>
-                  <m:sty m:val="p"/>
-                </m:rPr>
-                <m:t>(</m:t>
-              </m:r>
-              <m:sSub>
-                <m:e>
-                  <m:r>
-                    <m:t>M</m:t>
-                  </m:r>
-                </m:e>
-                <m:sub>
-                  <m:r>
-                    <m:t>l</m:t>
-                  </m:r>
-                </m:sub>
-              </m:sSub>
-              <m:r>
-                <m:rPr>
-                  <m:sty m:val="p"/>
-                </m:rPr>
-                <m:t>)</m:t>
-              </m:r>
-            </m:den>
-          </m:f>
-          <m:r>
-            <m:rPr>
-              <m:sty m:val="p"/>
-            </m:rPr>
-            <m:t>.</m:t>
-          </m:r>
-        </m:oMath>
-      </m:oMathPara>
+      <w:r>
+        <w:t xml:space="preserve">$$
+    \operatorname{p}(M_k \mid \mathord{\smash[b]{\underset{\raise.3ex\hbox{$\scriptstyle\sim$}}{y}}\vphantom{y}}) \stackrel{\text{def}}{=}
+    \frac{\operatorname{p}(\mathord{\smash[b]{\underset{\raise.3ex\hbox{$\scriptstyle\sim$}}{y}}\vphantom{y}}\mid M_k)\, \operatorname{p}(M_k)}{\sum_{l=1}^{K} \operatorname{p}(\mathord{\smash[b]{\underset{\raise.3ex\hbox{$\scriptstyle\sim$}}{y}}\vphantom{y}}\mid M_l)\, \operatorname{p}(M_l)}.
+    $$</w:t>
+      </w:r>
     </w:p>
     <w:bookmarkEnd w:id="32"/>
     <w:bookmarkStart w:id="33" w:name="exm-posterior-model-probability"/>
@@ -11161,68 +10667,9 @@
       <w:r>
         <w:t xml:space="preserve"> </w:t>
       </w:r>
-      <m:oMath>
-        <m:r>
-          <m:rPr>
-            <m:sty m:val="p"/>
-          </m:rPr>
-          <m:t>p</m:t>
-        </m:r>
-        <m:r>
-          <m:rPr>
-            <m:sty m:val="p"/>
-          </m:rPr>
-          <m:t>(</m:t>
-        </m:r>
-        <m:limLow>
-          <m:e>
-            <m:r>
-              <m:t>y</m:t>
-            </m:r>
-          </m:e>
-          <m:lim>
-            <m:r>
-              <m:rPr>
-                <m:sty m:val="p"/>
-              </m:rPr>
-              <m:t>∼</m:t>
-            </m:r>
-          </m:lim>
-        </m:limLow>
-        <m:r>
-          <m:rPr>
-            <m:sty m:val="p"/>
-          </m:rPr>
-          <m:t>∣</m:t>
-        </m:r>
-        <m:sSub>
-          <m:e>
-            <m:r>
-              <m:t>M</m:t>
-            </m:r>
-          </m:e>
-          <m:sub>
-            <m:r>
-              <m:t>1</m:t>
-            </m:r>
-          </m:sub>
-        </m:sSub>
-        <m:r>
-          <m:rPr>
-            <m:sty m:val="p"/>
-          </m:rPr>
-          <m:t>)</m:t>
-        </m:r>
-        <m:r>
-          <m:rPr>
-            <m:sty m:val="p"/>
-          </m:rPr>
-          <m:t>=</m:t>
-        </m:r>
-        <m:r>
-          <m:t>0.02</m:t>
-        </m:r>
-      </m:oMath>
+      <w:r>
+        <w:t xml:space="preserve">$\operatorname{p}(\mathord{\smash[b]{\underset{\raise.3ex\hbox{$\scriptstyle\sim$}}{y}}\vphantom{y}}\mid M_1) = 0.02$</w:t>
+      </w:r>
       <w:r>
         <w:t xml:space="preserve"> </w:t>
       </w:r>
@@ -11232,68 +10679,9 @@
       <w:r>
         <w:t xml:space="preserve"> </w:t>
       </w:r>
-      <m:oMath>
-        <m:r>
-          <m:rPr>
-            <m:sty m:val="p"/>
-          </m:rPr>
-          <m:t>p</m:t>
-        </m:r>
-        <m:r>
-          <m:rPr>
-            <m:sty m:val="p"/>
-          </m:rPr>
-          <m:t>(</m:t>
-        </m:r>
-        <m:limLow>
-          <m:e>
-            <m:r>
-              <m:t>y</m:t>
-            </m:r>
-          </m:e>
-          <m:lim>
-            <m:r>
-              <m:rPr>
-                <m:sty m:val="p"/>
-              </m:rPr>
-              <m:t>∼</m:t>
-            </m:r>
-          </m:lim>
-        </m:limLow>
-        <m:r>
-          <m:rPr>
-            <m:sty m:val="p"/>
-          </m:rPr>
-          <m:t>∣</m:t>
-        </m:r>
-        <m:sSub>
-          <m:e>
-            <m:r>
-              <m:t>M</m:t>
-            </m:r>
-          </m:e>
-          <m:sub>
-            <m:r>
-              <m:t>2</m:t>
-            </m:r>
-          </m:sub>
-        </m:sSub>
-        <m:r>
-          <m:rPr>
-            <m:sty m:val="p"/>
-          </m:rPr>
-          <m:t>)</m:t>
-        </m:r>
-        <m:r>
-          <m:rPr>
-            <m:sty m:val="p"/>
-          </m:rPr>
-          <m:t>=</m:t>
-        </m:r>
-        <m:r>
-          <m:t>0.06</m:t>
-        </m:r>
-      </m:oMath>
+      <w:r>
+        <w:t xml:space="preserve">$\operatorname{p}(\mathord{\smash[b]{\underset{\raise.3ex\hbox{$\scriptstyle\sim$}}{y}}\vphantom{y}}\mid M_2) = 0.06$</w:t>
+      </w:r>
       <w:r>
         <w:t xml:space="preserve"> </w:t>
       </w:r>
@@ -11305,124 +10693,14 @@
       <w:pPr>
         <w:pStyle w:val="BodyText"/>
       </w:pPr>
-      <m:oMathPara>
-        <m:oMathParaPr>
-          <m:jc m:val="center"/>
-        </m:oMathParaPr>
-        <m:oMath>
-          <m:eqArr>
-            <m:e>
-              <m:r>
-                <m:rPr>
-                  <m:sty m:val="p"/>
-                </m:rPr>
-                <m:t>p</m:t>
-              </m:r>
-              <m:r>
-                <m:rPr>
-                  <m:sty m:val="p"/>
-                </m:rPr>
-                <m:t>(</m:t>
-              </m:r>
-              <m:sSub>
-                <m:e>
-                  <m:r>
-                    <m:t>M</m:t>
-                  </m:r>
-                </m:e>
-                <m:sub>
-                  <m:r>
-                    <m:t>1</m:t>
-                  </m:r>
-                </m:sub>
-              </m:sSub>
-              <m:r>
-                <m:rPr>
-                  <m:sty m:val="p"/>
-                </m:rPr>
-                <m:t>∣</m:t>
-              </m:r>
-              <m:limLow>
-                <m:e>
-                  <m:r>
-                    <m:t>y</m:t>
-                  </m:r>
-                </m:e>
-                <m:lim>
-                  <m:r>
-                    <m:rPr>
-                      <m:sty m:val="p"/>
-                    </m:rPr>
-                    <m:t>∼</m:t>
-                  </m:r>
-                </m:lim>
-              </m:limLow>
-              <m:r>
-                <m:rPr>
-                  <m:sty m:val="p"/>
-                </m:rPr>
-                <m:t>)</m:t>
-              </m:r>
-              <m:r>
-                <m:t>&amp;</m:t>
-              </m:r>
-              <m:r>
-                <m:rPr>
-                  <m:sty m:val="p"/>
-                </m:rPr>
-                <m:t>=</m:t>
-              </m:r>
-              <m:r>
-                <m:t>0.01</m:t>
-              </m:r>
-              <m:r>
-                <m:rPr>
-                  <m:sty m:val="p"/>
-                </m:rPr>
-                <m:t>/</m:t>
-              </m:r>
-              <m:r>
-                <m:rPr>
-                  <m:sty m:val="p"/>
-                </m:rPr>
-                <m:t>(</m:t>
-              </m:r>
-              <m:r>
-                <m:t>0.01</m:t>
-              </m:r>
-              <m:r>
-                <m:rPr>
-                  <m:sty m:val="p"/>
-                </m:rPr>
-                <m:t>+</m:t>
-              </m:r>
-              <m:r>
-                <m:t>0.03</m:t>
-              </m:r>
-              <m:r>
-                <m:rPr>
-                  <m:sty m:val="p"/>
-                </m:rPr>
-                <m:t>)</m:t>
-              </m:r>
-            </m:e>
-            <m:e>
-              <m:r>
-                <m:t>&amp;</m:t>
-              </m:r>
-              <m:r>
-                <m:rPr>
-                  <m:sty m:val="p"/>
-                </m:rPr>
-                <m:t>=</m:t>
-              </m:r>
-              <m:r>
-                <m:t>0.25</m:t>
-              </m:r>
-            </m:e>
-          </m:eqArr>
-        </m:oMath>
-      </m:oMathPara>
+      <w:r>
+        <w:t xml:space="preserve">$$
+    \begin{aligned}
+      \operatorname{p}(M_1 \mid \mathord{\smash[b]{\underset{\raise.3ex\hbox{$\scriptstyle\sim$}}{y}}\vphantom{y}}) &amp;= 0.01 / (0.01 + 0.03) \\
+      &amp;= 0.25
+    \end{aligned}
+    $$</w:t>
+      </w:r>
     </w:p>
     <w:p>
       <w:pPr>
@@ -11434,68 +10712,9 @@
       <w:r>
         <w:t xml:space="preserve"> </w:t>
       </w:r>
-      <m:oMath>
-        <m:r>
-          <m:rPr>
-            <m:sty m:val="p"/>
-          </m:rPr>
-          <m:t>p</m:t>
-        </m:r>
-        <m:r>
-          <m:rPr>
-            <m:sty m:val="p"/>
-          </m:rPr>
-          <m:t>(</m:t>
-        </m:r>
-        <m:sSub>
-          <m:e>
-            <m:r>
-              <m:t>M</m:t>
-            </m:r>
-          </m:e>
-          <m:sub>
-            <m:r>
-              <m:t>2</m:t>
-            </m:r>
-          </m:sub>
-        </m:sSub>
-        <m:r>
-          <m:rPr>
-            <m:sty m:val="p"/>
-          </m:rPr>
-          <m:t>∣</m:t>
-        </m:r>
-        <m:limLow>
-          <m:e>
-            <m:r>
-              <m:t>y</m:t>
-            </m:r>
-          </m:e>
-          <m:lim>
-            <m:r>
-              <m:rPr>
-                <m:sty m:val="p"/>
-              </m:rPr>
-              <m:t>∼</m:t>
-            </m:r>
-          </m:lim>
-        </m:limLow>
-        <m:r>
-          <m:rPr>
-            <m:sty m:val="p"/>
-          </m:rPr>
-          <m:t>)</m:t>
-        </m:r>
-        <m:r>
-          <m:rPr>
-            <m:sty m:val="p"/>
-          </m:rPr>
-          <m:t>=</m:t>
-        </m:r>
-        <m:r>
-          <m:t>0.75</m:t>
-        </m:r>
-      </m:oMath>
+      <w:r>
+        <w:t xml:space="preserve">$\operatorname{p}(M_2 \mid \mathord{\smash[b]{\underset{\raise.3ex\hbox{$\scriptstyle\sim$}}{y}}\vphantom{y}}) = 0.75$</w:t>
+      </w:r>
       <w:r>
         <w:t xml:space="preserve">.</w:t>
       </w:r>
@@ -11533,59 +10752,9 @@
       <w:r>
         <w:t xml:space="preserve"> </w:t>
       </w:r>
-      <m:oMath>
-        <m:r>
-          <m:rPr>
-            <m:sty m:val="p"/>
-          </m:rPr>
-          <m:t>p</m:t>
-        </m:r>
-        <m:r>
-          <m:rPr>
-            <m:sty m:val="p"/>
-          </m:rPr>
-          <m:t>(</m:t>
-        </m:r>
-        <m:sSub>
-          <m:e>
-            <m:r>
-              <m:t>M</m:t>
-            </m:r>
-          </m:e>
-          <m:sub>
-            <m:r>
-              <m:t>k</m:t>
-            </m:r>
-          </m:sub>
-        </m:sSub>
-        <m:r>
-          <m:rPr>
-            <m:sty m:val="p"/>
-          </m:rPr>
-          <m:t>∣</m:t>
-        </m:r>
-        <m:limLow>
-          <m:e>
-            <m:r>
-              <m:t>y</m:t>
-            </m:r>
-          </m:e>
-          <m:lim>
-            <m:r>
-              <m:rPr>
-                <m:sty m:val="p"/>
-              </m:rPr>
-              <m:t>∼</m:t>
-            </m:r>
-          </m:lim>
-        </m:limLow>
-        <m:r>
-          <m:rPr>
-            <m:sty m:val="p"/>
-          </m:rPr>
-          <m:t>)</m:t>
-        </m:r>
-      </m:oMath>
+      <w:r>
+        <w:t xml:space="preserve">$\operatorname{p}(M_k \mid \mathord{\smash[b]{\underset{\raise.3ex\hbox{$\scriptstyle\sim$}}{y}}\vphantom{y}})$</w:t>
+      </w:r>
       <w:r>
         <w:t xml:space="preserve"> </w:t>
       </w:r>
@@ -11686,229 +10855,11 @@
       <w:pPr>
         <w:pStyle w:val="BodyText"/>
       </w:pPr>
-      <m:oMathPara>
-        <m:oMathParaPr>
-          <m:jc m:val="center"/>
-        </m:oMathParaPr>
-        <m:oMath>
-          <m:r>
-            <m:rPr>
-              <m:sty m:val="p"/>
-            </m:rPr>
-            <m:t>p</m:t>
-          </m:r>
-          <m:r>
-            <m:rPr>
-              <m:sty m:val="p"/>
-            </m:rPr>
-            <m:t>(</m:t>
-          </m:r>
-          <m:r>
-            <m:rPr>
-              <m:sty m:val="p"/>
-            </m:rPr>
-            <m:t>Δ</m:t>
-          </m:r>
-          <m:r>
-            <m:rPr>
-              <m:sty m:val="p"/>
-            </m:rPr>
-            <m:t>∣</m:t>
-          </m:r>
-          <m:limLow>
-            <m:e>
-              <m:r>
-                <m:t>y</m:t>
-              </m:r>
-            </m:e>
-            <m:lim>
-              <m:r>
-                <m:rPr>
-                  <m:sty m:val="p"/>
-                </m:rPr>
-                <m:t>∼</m:t>
-              </m:r>
-            </m:lim>
-          </m:limLow>
-          <m:r>
-            <m:rPr>
-              <m:sty m:val="p"/>
-            </m:rPr>
-            <m:t>)</m:t>
-          </m:r>
-          <m:limUpp>
-            <m:e>
-              <m:r>
-                <m:rPr>
-                  <m:sty m:val="p"/>
-                </m:rPr>
-                <m:t>=</m:t>
-              </m:r>
-            </m:e>
-            <m:lim>
-              <m:r>
-                <m:rPr>
-                  <m:nor/>
-                  <m:sty m:val="p"/>
-                </m:rPr>
-                <m:t>def</m:t>
-              </m:r>
-            </m:lim>
-          </m:limUpp>
-          <m:nary>
-            <m:naryPr>
-              <m:chr m:val="∑"/>
-              <m:limLoc m:val="undOvr"/>
-              <m:subHide m:val="off"/>
-              <m:supHide m:val="off"/>
-            </m:naryPr>
-            <m:sub>
-              <m:r>
-                <m:t>k</m:t>
-              </m:r>
-              <m:r>
-                <m:rPr>
-                  <m:sty m:val="p"/>
-                </m:rPr>
-                <m:t>=</m:t>
-              </m:r>
-              <m:r>
-                <m:t>1</m:t>
-              </m:r>
-            </m:sub>
-            <m:sup>
-              <m:r>
-                <m:t>K</m:t>
-              </m:r>
-            </m:sup>
-            <m:e>
-              <m:r>
-                <m:rPr>
-                  <m:sty m:val="p"/>
-                </m:rPr>
-                <m:t>p</m:t>
-              </m:r>
-            </m:e>
-          </m:nary>
-          <m:r>
-            <m:rPr>
-              <m:sty m:val="p"/>
-            </m:rPr>
-            <m:t>(</m:t>
-          </m:r>
-          <m:r>
-            <m:rPr>
-              <m:sty m:val="p"/>
-            </m:rPr>
-            <m:t>Δ</m:t>
-          </m:r>
-          <m:r>
-            <m:rPr>
-              <m:sty m:val="p"/>
-            </m:rPr>
-            <m:t>∣</m:t>
-          </m:r>
-          <m:sSub>
-            <m:e>
-              <m:r>
-                <m:t>M</m:t>
-              </m:r>
-            </m:e>
-            <m:sub>
-              <m:r>
-                <m:t>k</m:t>
-              </m:r>
-            </m:sub>
-          </m:sSub>
-          <m:r>
-            <m:rPr>
-              <m:sty m:val="p"/>
-            </m:rPr>
-            <m:t>,</m:t>
-          </m:r>
-          <m:limLow>
-            <m:e>
-              <m:r>
-                <m:t>y</m:t>
-              </m:r>
-            </m:e>
-            <m:lim>
-              <m:r>
-                <m:rPr>
-                  <m:sty m:val="p"/>
-                </m:rPr>
-                <m:t>∼</m:t>
-              </m:r>
-            </m:lim>
-          </m:limLow>
-          <m:r>
-            <m:rPr>
-              <m:sty m:val="p"/>
-            </m:rPr>
-            <m:t>)</m:t>
-          </m:r>
-          <m:r>
-            <m:t> </m:t>
-          </m:r>
-          <m:r>
-            <m:rPr>
-              <m:sty m:val="p"/>
-            </m:rPr>
-            <m:t>p</m:t>
-          </m:r>
-          <m:r>
-            <m:rPr>
-              <m:sty m:val="p"/>
-            </m:rPr>
-            <m:t>(</m:t>
-          </m:r>
-          <m:sSub>
-            <m:e>
-              <m:r>
-                <m:t>M</m:t>
-              </m:r>
-            </m:e>
-            <m:sub>
-              <m:r>
-                <m:t>k</m:t>
-              </m:r>
-            </m:sub>
-          </m:sSub>
-          <m:r>
-            <m:rPr>
-              <m:sty m:val="p"/>
-            </m:rPr>
-            <m:t>∣</m:t>
-          </m:r>
-          <m:limLow>
-            <m:e>
-              <m:r>
-                <m:t>y</m:t>
-              </m:r>
-            </m:e>
-            <m:lim>
-              <m:r>
-                <m:rPr>
-                  <m:sty m:val="p"/>
-                </m:rPr>
-                <m:t>∼</m:t>
-              </m:r>
-            </m:lim>
-          </m:limLow>
-          <m:r>
-            <m:rPr>
-              <m:sty m:val="p"/>
-            </m:rPr>
-            <m:t>)</m:t>
-          </m:r>
-          <m:r>
-            <m:rPr>
-              <m:sty m:val="p"/>
-            </m:rPr>
-            <m:t>.</m:t>
-          </m:r>
-        </m:oMath>
-      </m:oMathPara>
+      <w:r>
+        <w:t xml:space="preserve">$$
+    \operatorname{p}(\Delta\mid \mathord{\smash[b]{\underset{\raise.3ex\hbox{$\scriptstyle\sim$}}{y}}\vphantom{y}}) \stackrel{\text{def}}{=}\sum_{k=1}^{K} \operatorname{p}(\Delta\mid M_k, \mathord{\smash[b]{\underset{\raise.3ex\hbox{$\scriptstyle\sim$}}{y}}\vphantom{y}})\, \operatorname{p}(M_k \mid \mathord{\smash[b]{\underset{\raise.3ex\hbox{$\scriptstyle\sim$}}{y}}\vphantom{y}}).
+    $$</w:t>
+      </w:r>
     </w:p>
     <w:bookmarkEnd w:id="34"/>
     <w:bookmarkStart w:id="35" w:name="def-pip"/>
@@ -12037,230 +10988,12 @@
       <w:pPr>
         <w:pStyle w:val="BodyText"/>
       </w:pPr>
-      <m:oMathPara>
-        <m:oMathParaPr>
-          <m:jc m:val="center"/>
-        </m:oMathParaPr>
-        <m:oMath>
-          <m:r>
-            <m:rPr>
-              <m:sty m:val="p"/>
-            </m:rPr>
-            <m:t>p</m:t>
-          </m:r>
-          <m:r>
-            <m:rPr>
-              <m:sty m:val="p"/>
-            </m:rPr>
-            <m:t>(</m:t>
-          </m:r>
-          <m:sSub>
-            <m:e>
-              <m:r>
-                <m:t>M</m:t>
-              </m:r>
-            </m:e>
-            <m:sub>
-              <m:r>
-                <m:t>k</m:t>
-              </m:r>
-            </m:sub>
-          </m:sSub>
-          <m:r>
-            <m:rPr>
-              <m:sty m:val="p"/>
-            </m:rPr>
-            <m:t>∣</m:t>
-          </m:r>
-          <m:limLow>
-            <m:e>
-              <m:r>
-                <m:t>y</m:t>
-              </m:r>
-            </m:e>
-            <m:lim>
-              <m:r>
-                <m:rPr>
-                  <m:sty m:val="p"/>
-                </m:rPr>
-                <m:t>∼</m:t>
-              </m:r>
-            </m:lim>
-          </m:limLow>
-          <m:r>
-            <m:rPr>
-              <m:sty m:val="p"/>
-            </m:rPr>
-            <m:t>)</m:t>
-          </m:r>
-          <m:r>
-            <m:rPr>
-              <m:sty m:val="p"/>
-            </m:rPr>
-            <m:t>≈</m:t>
-          </m:r>
-          <m:f>
-            <m:fPr>
-              <m:type m:val="bar"/>
-            </m:fPr>
-            <m:num>
-              <m:r>
-                <m:rPr>
-                  <m:sty m:val="p"/>
-                </m:rPr>
-                <m:t>exp</m:t>
-              </m:r>
-              <m:r>
-                <m:t>​</m:t>
-              </m:r>
-              <m:d>
-                <m:dPr>
-                  <m:begChr m:val="{"/>
-                  <m:sepChr m:val=""/>
-                  <m:endChr m:val="}"/>
-                  <m:grow/>
-                </m:dPr>
-                <m:e>
-                  <m:r>
-                    <m:rPr>
-                      <m:sty m:val="p"/>
-                    </m:rPr>
-                    <m:t>−</m:t>
-                  </m:r>
-                  <m:f>
-                    <m:fPr>
-                      <m:type m:val="lin"/>
-                    </m:fPr>
-                    <m:num>
-                      <m:r>
-                        <m:t>1</m:t>
-                      </m:r>
-                    </m:num>
-                    <m:den>
-                      <m:r>
-                        <m:t>2</m:t>
-                      </m:r>
-                    </m:den>
-                  </m:f>
-                  <m:sSub>
-                    <m:e>
-                      <m:r>
-                        <m:rPr>
-                          <m:sty m:val="p"/>
-                        </m:rPr>
-                        <m:t>BIC</m:t>
-                      </m:r>
-                    </m:e>
-                    <m:sub>
-                      <m:r>
-                        <m:t>k</m:t>
-                      </m:r>
-                    </m:sub>
-                  </m:sSub>
-                </m:e>
-              </m:d>
-              <m:r>
-                <m:t>​</m:t>
-              </m:r>
-            </m:num>
-            <m:den>
-              <m:nary>
-                <m:naryPr>
-                  <m:chr m:val="∑"/>
-                  <m:limLoc m:val="undOvr"/>
-                  <m:subHide m:val="off"/>
-                  <m:supHide m:val="off"/>
-                </m:naryPr>
-                <m:sub>
-                  <m:r>
-                    <m:t>l</m:t>
-                  </m:r>
-                  <m:r>
-                    <m:rPr>
-                      <m:sty m:val="p"/>
-                    </m:rPr>
-                    <m:t>=</m:t>
-                  </m:r>
-                  <m:r>
-                    <m:t>1</m:t>
-                  </m:r>
-                </m:sub>
-                <m:sup>
-                  <m:r>
-                    <m:t>K</m:t>
-                  </m:r>
-                </m:sup>
-                <m:e>
-                  <m:r>
-                    <m:rPr>
-                      <m:sty m:val="p"/>
-                    </m:rPr>
-                    <m:t>exp</m:t>
-                  </m:r>
-                </m:e>
-              </m:nary>
-              <m:r>
-                <m:t>​</m:t>
-              </m:r>
-              <m:d>
-                <m:dPr>
-                  <m:begChr m:val="{"/>
-                  <m:sepChr m:val=""/>
-                  <m:endChr m:val="}"/>
-                  <m:grow/>
-                </m:dPr>
-                <m:e>
-                  <m:r>
-                    <m:rPr>
-                      <m:sty m:val="p"/>
-                    </m:rPr>
-                    <m:t>−</m:t>
-                  </m:r>
-                  <m:f>
-                    <m:fPr>
-                      <m:type m:val="lin"/>
-                    </m:fPr>
-                    <m:num>
-                      <m:r>
-                        <m:t>1</m:t>
-                      </m:r>
-                    </m:num>
-                    <m:den>
-                      <m:r>
-                        <m:t>2</m:t>
-                      </m:r>
-                    </m:den>
-                  </m:f>
-                  <m:sSub>
-                    <m:e>
-                      <m:r>
-                        <m:rPr>
-                          <m:sty m:val="p"/>
-                        </m:rPr>
-                        <m:t>BIC</m:t>
-                      </m:r>
-                    </m:e>
-                    <m:sub>
-                      <m:r>
-                        <m:t>l</m:t>
-                      </m:r>
-                    </m:sub>
-                  </m:sSub>
-                </m:e>
-              </m:d>
-              <m:r>
-                <m:t>​</m:t>
-              </m:r>
-            </m:den>
-          </m:f>
-          <m:r>
-            <m:rPr>
-              <m:sty m:val="p"/>
-            </m:rPr>
-            <m:t>.</m:t>
-          </m:r>
-        </m:oMath>
-      </m:oMathPara>
+      <w:r>
+        <w:t xml:space="preserve">$$
+    \operatorname{p}(M_k \mid \mathord{\smash[b]{\underset{\raise.3ex\hbox{$\scriptstyle\sim$}}{y}}\vphantom{y}}) \approx
+    \frac{\operatorname{exp}\mathopen{}\left\{-\tfrac{1}{2}\operatorname{BIC}_k\right\}\mathclose{}}{\sum_{l=1}^{K} \operatorname{exp}\mathopen{}\left\{-\tfrac{1}{2}\operatorname{BIC}_l\right\}\mathclose{}}.
+    $$</w:t>
+      </w:r>
     </w:p>
     <w:p>
       <w:pPr>

</xml_diff>

<commit_message>
Deploying to gh-pages from @ Morrison-Lab/sds@6dcd887249f18546f23cb366993322f95b3702fe 🚀
</commit_message>
<xml_diff>
--- a/bayesian-examples-handout.docx
+++ b/bayesian-examples-handout.docx
@@ -15,7 +15,7 @@
         <w:pStyle w:val="Date"/>
       </w:pPr>
       <w:r>
-        <w:t xml:space="preserve">Last modified: 2026-10-19 03:59:32 (PDT)</w:t>
+        <w:t xml:space="preserve">Last modified: 2026-10-19 04:11:38 (PDT)</w:t>
       </w:r>
     </w:p>
     <w:p>
@@ -11006,7 +11006,7 @@
       <w:r>
         <w:t xml:space="preserve">$$
     \operatorname{p}(M_k \mid \mathord{\smash[b]{\underset{\raise.3ex\hbox{$\scriptstyle\sim$}}{y}}\vphantom{y}}) \approx
-    \frac{\operatorname{exp}\mathopen{}\left\{-\tfrac{1}{2}\operatorname{BIC}_k\right\}\mathclose{}}{\sum_{l=1}^{K} \operatorname{exp}\mathopen{}\left\{-\tfrac{1}{2}\operatorname{BIC}_l\right\}\mathclose{}}.
+    \frac{{\operatorname{exp}\mathopen{}\left\{-\tfrac{1}{2}\operatorname{BIC}_k\right\}\mathclose{}}}{\sum_{l=1}^{K} {\operatorname{exp}\mathopen{}\left\{-\tfrac{1}{2}\operatorname{BIC}_l\right\}\mathclose{}}}.
     $$</w:t>
       </w:r>
     </w:p>

</xml_diff>

<commit_message>
Deploying to gh-pages from @ Morrison-Lab/sds@7fd8d11024ecab16f5a76708d465527c20268f05 🚀
</commit_message>
<xml_diff>
--- a/bayesian-examples-handout.docx
+++ b/bayesian-examples-handout.docx
@@ -15,7 +15,7 @@
         <w:pStyle w:val="Date"/>
       </w:pPr>
       <w:r>
-        <w:t xml:space="preserve">Last modified: 2026-10-26 16:37:41 (PDT)</w:t>
+        <w:t xml:space="preserve">Last modified: 2026-10-26 18:20:41 (PDT)</w:t>
       </w:r>
     </w:p>
     <w:p>
@@ -69,6 +69,12 @@
       </w:r>
       <w:r>
         <w:t xml:space="preserve">.</w:t>
+      </w:r>
+      <w:r>
+        <w:t xml:space="preserve"> </w:t>
+      </w:r>
+      <w:r>
+        <w:t xml:space="preserve">After the first example, the page compares JAGS with Stan on the same model.</w:t>
       </w:r>
       <w:r>
         <w:t xml:space="preserve"> </w:t>
@@ -1601,13 +1607,2102 @@
     </w:p>
     <w:bookmarkEnd w:id="13"/>
     <w:bookmarkEnd w:id="14"/>
-    <w:bookmarkStart w:id="19" w:name="sec-bayes-examples-logistic"/>
+    <w:bookmarkStart w:id="29" w:name="sec-bayes-examples-stan-jags"/>
     <w:p>
       <w:pPr>
         <w:pStyle w:val="Heading2"/>
       </w:pPr>
       <w:r>
-        <w:t xml:space="preserve">2 Binary outcomes: logistic regression</w:t>
+        <w:t xml:space="preserve">2 Comparing Stan and JAGS</w:t>
+      </w:r>
+    </w:p>
+    <w:p>
+      <w:pPr>
+        <w:pStyle w:val="FirstParagraph"/>
+      </w:pPr>
+      <w:r>
+        <w:t xml:space="preserve">JAGS is not the only program that turns a model description into an MCMC sampler.</w:t>
+      </w:r>
+      <w:r>
+        <w:t xml:space="preserve"> </w:t>
+      </w:r>
+      <w:r>
+        <w:t xml:space="preserve">Stan</w:t>
+      </w:r>
+      <w:r>
+        <w:t xml:space="preserve"> </w:t>
+      </w:r>
+      <w:r>
+        <w:t xml:space="preserve">[2]</w:t>
+      </w:r>
+      <w:r>
+        <w:t xml:space="preserve"> </w:t>
+      </w:r>
+      <w:r>
+        <w:t xml:space="preserve">is a widely used alternative.</w:t>
+      </w:r>
+      <w:r>
+        <w:t xml:space="preserve"> </w:t>
+      </w:r>
+      <w:r>
+        <w:t xml:space="preserve">Both take a model written in their own language,</w:t>
+      </w:r>
+      <w:r>
+        <w:t xml:space="preserve"> </w:t>
+      </w:r>
+      <w:r>
+        <w:t xml:space="preserve">accept data from R,</w:t>
+      </w:r>
+      <w:r>
+        <w:t xml:space="preserve"> </w:t>
+      </w:r>
+      <w:r>
+        <w:t xml:space="preserve">and return draws from the</w:t>
+      </w:r>
+      <w:r>
+        <w:t xml:space="preserve"> </w:t>
+      </w:r>
+      <w:hyperlink r:id="rId15">
+        <w:r>
+          <w:rPr>
+            <w:rStyle w:val="Hyperlink"/>
+          </w:rPr>
+          <w:t xml:space="preserve">posterior</w:t>
+        </w:r>
+      </w:hyperlink>
+      <w:r>
+        <w:t xml:space="preserve">.</w:t>
+      </w:r>
+      <w:r>
+        <w:t xml:space="preserve"> </w:t>
+      </w:r>
+      <w:r>
+        <w:t xml:space="preserve">They differ in how they draw and in what a model may contain.</w:t>
+      </w:r>
+    </w:p>
+    <w:p>
+      <w:pPr>
+        <w:pStyle w:val="BodyText"/>
+      </w:pPr>
+      <w:r>
+        <w:t xml:space="preserve">JAGS updates one node of the model at a time,</w:t>
+      </w:r>
+      <w:r>
+        <w:t xml:space="preserve"> </w:t>
+      </w:r>
+      <w:r>
+        <w:t xml:space="preserve">in the manner of a</w:t>
+      </w:r>
+      <w:r>
+        <w:t xml:space="preserve"> </w:t>
+      </w:r>
+      <w:hyperlink r:id="rId16">
+        <w:r>
+          <w:rPr>
+            <w:rStyle w:val="Hyperlink"/>
+          </w:rPr>
+          <w:t xml:space="preserve">Gibbs sampler</w:t>
+        </w:r>
+      </w:hyperlink>
+      <w:r>
+        <w:t xml:space="preserve"> </w:t>
+      </w:r>
+      <w:r>
+        <w:t xml:space="preserve">[3], [4]</w:t>
+      </w:r>
+      <w:r>
+        <w:t xml:space="preserve">.</w:t>
+      </w:r>
+      <w:r>
+        <w:t xml:space="preserve"> </w:t>
+      </w:r>
+      <w:r>
+        <w:t xml:space="preserve">For each</w:t>
+      </w:r>
+      <w:r>
+        <w:t xml:space="preserve"> </w:t>
+      </w:r>
+      <w:hyperlink r:id="rId17">
+        <w:r>
+          <w:rPr>
+            <w:rStyle w:val="Hyperlink"/>
+          </w:rPr>
+          <w:t xml:space="preserve">full conditional</w:t>
+        </w:r>
+      </w:hyperlink>
+      <w:r>
+        <w:t xml:space="preserve">,</w:t>
+      </w:r>
+      <w:r>
+        <w:t xml:space="preserve"> </w:t>
+      </w:r>
+      <w:r>
+        <w:t xml:space="preserve">it uses a</w:t>
+      </w:r>
+      <w:r>
+        <w:t xml:space="preserve"> </w:t>
+      </w:r>
+      <w:hyperlink r:id="rId18">
+        <w:r>
+          <w:rPr>
+            <w:rStyle w:val="Hyperlink"/>
+          </w:rPr>
+          <w:t xml:space="preserve">conjugate</w:t>
+        </w:r>
+      </w:hyperlink>
+      <w:r>
+        <w:t xml:space="preserve"> </w:t>
+      </w:r>
+      <w:r>
+        <w:t xml:space="preserve">sampler where it recognizes one,</w:t>
+      </w:r>
+      <w:r>
+        <w:t xml:space="preserve"> </w:t>
+      </w:r>
+      <w:r>
+        <w:t xml:space="preserve">and slice or Metropolis steps otherwise.</w:t>
+      </w:r>
+      <w:r>
+        <w:t xml:space="preserve"> </w:t>
+      </w:r>
+      <w:r>
+        <w:t xml:space="preserve">Stan uses Hamiltonian Monte Carlo,</w:t>
+      </w:r>
+      <w:r>
+        <w:t xml:space="preserve"> </w:t>
+      </w:r>
+      <w:r>
+        <w:t xml:space="preserve">which proposes moves along the gradient of the logarithm of the</w:t>
+      </w:r>
+      <w:r>
+        <w:t xml:space="preserve"> </w:t>
+      </w:r>
+      <w:hyperlink r:id="rId15">
+        <w:r>
+          <w:rPr>
+            <w:rStyle w:val="Hyperlink"/>
+          </w:rPr>
+          <w:t xml:space="preserve">posterior</w:t>
+        </w:r>
+      </w:hyperlink>
+      <w:r>
+        <w:t xml:space="preserve">,</w:t>
+      </w:r>
+      <w:r>
+        <w:t xml:space="preserve"> </w:t>
+      </w:r>
+      <w:r>
+        <w:t xml:space="preserve">in the adaptive form called the No-U-Turn sampler (NUTS)</w:t>
+      </w:r>
+      <w:r>
+        <w:t xml:space="preserve"> </w:t>
+      </w:r>
+      <w:r>
+        <w:t xml:space="preserve">[5]</w:t>
+      </w:r>
+      <w:r>
+        <w:t xml:space="preserve">.</w:t>
+      </w:r>
+      <w:r>
+        <w:t xml:space="preserve"> </w:t>
+      </w:r>
+      <w:r>
+        <w:t xml:space="preserve">Using the gradient is why Stan cannot draw a</w:t>
+      </w:r>
+      <w:r>
+        <w:t xml:space="preserve"> </w:t>
+      </w:r>
+      <w:hyperlink r:id="rId19">
+        <w:r>
+          <w:rPr>
+            <w:rStyle w:val="Hyperlink"/>
+          </w:rPr>
+          <w:t xml:space="preserve">discrete</w:t>
+        </w:r>
+      </w:hyperlink>
+      <w:r>
+        <w:t xml:space="preserve"> </w:t>
+      </w:r>
+      <w:r>
+        <w:t xml:space="preserve">parameter:</w:t>
+      </w:r>
+      <w:r>
+        <w:t xml:space="preserve"> </w:t>
+      </w:r>
+      <w:r>
+        <w:t xml:space="preserve">a discrete parameter has no gradient.</w:t>
+      </w:r>
+      <w:r>
+        <w:t xml:space="preserve"> </w:t>
+      </w:r>
+      <w:r>
+        <w:t xml:space="preserve">A Stan model sums a discrete quantity out of the joint</w:t>
+      </w:r>
+      <w:r>
+        <w:t xml:space="preserve"> </w:t>
+      </w:r>
+      <w:hyperlink r:id="rId20">
+        <w:r>
+          <w:rPr>
+            <w:rStyle w:val="Hyperlink"/>
+          </w:rPr>
+          <w:t xml:space="preserve">density</w:t>
+        </w:r>
+      </w:hyperlink>
+      <w:r>
+        <w:t xml:space="preserve"> </w:t>
+      </w:r>
+      <w:r>
+        <w:t xml:space="preserve">of the data and the parameters instead</w:t>
+      </w:r>
+      <w:r>
+        <w:t xml:space="preserve"> </w:t>
+      </w:r>
+      <w:r>
+        <w:t xml:space="preserve">[6], chapter</w:t>
+      </w:r>
+      <w:r>
+        <w:t xml:space="preserve"> </w:t>
+      </w:r>
+      <w:r>
+        <w:t xml:space="preserve">“Latent Discrete Parameters”</w:t>
+      </w:r>
+      <w:r>
+        <w:t xml:space="preserve">.</w:t>
+      </w:r>
+      <w:r>
+        <w:t xml:space="preserve"> </w:t>
+      </w:r>
+      <w:hyperlink w:anchor="tbl-stan-vs-jags">
+        <w:r>
+          <w:rPr>
+            <w:rStyle w:val="Hyperlink"/>
+          </w:rPr>
+          <w:t xml:space="preserve">Table 1</w:t>
+        </w:r>
+      </w:hyperlink>
+      <w:r>
+        <w:t xml:space="preserve"> </w:t>
+      </w:r>
+      <w:r>
+        <w:t xml:space="preserve">lists the practical differences,</w:t>
+      </w:r>
+      <w:r>
+        <w:t xml:space="preserve"> </w:t>
+      </w:r>
+      <w:r>
+        <w:t xml:space="preserve">taken from the JAGS manual</w:t>
+      </w:r>
+      <w:r>
+        <w:t xml:space="preserve"> </w:t>
+      </w:r>
+      <w:r>
+        <w:t xml:space="preserve">[4]</w:t>
+      </w:r>
+      <w:r>
+        <w:t xml:space="preserve"> </w:t>
+      </w:r>
+      <w:r>
+        <w:t xml:space="preserve">and the Stan User’s Guide</w:t>
+      </w:r>
+      <w:r>
+        <w:t xml:space="preserve"> </w:t>
+      </w:r>
+      <w:r>
+        <w:t xml:space="preserve">[6]</w:t>
+      </w:r>
+      <w:r>
+        <w:t xml:space="preserve">:</w:t>
+      </w:r>
+    </w:p>
+    <w:tbl>
+      <w:tblPr>
+        <w:tblStyle w:val="Table"/>
+        <w:tblW w:type="pct" w:w="5000"/>
+        <w:tblLayout w:type="fixed"/>
+        <w:tblLook w:firstRow="0" w:lastRow="0" w:firstColumn="0" w:lastColumn="0" w:noHBand="0" w:noVBand="0" w:val="0000"/>
+      </w:tblPr>
+      <w:tblGrid>
+        <w:gridCol w:w="7920"/>
+      </w:tblGrid>
+      <w:tr>
+        <w:tc>
+          <w:tcPr/>
+          <w:bookmarkStart w:id="23" w:name="tbl-stan-vs-jags"/>
+          <w:p>
+            <w:pPr>
+              <w:jc w:val="center"/>
+            </w:pPr>
+            <w:pPr>
+              <w:jc w:val="left"/>
+              <w:spacing w:before="200"/>
+              <w:pStyle w:val="ImageCaption"/>
+            </w:pPr>
+            <w:r>
+              <w:t xml:space="preserve">Table 1: JAGS and Stan compared</w:t>
+            </w:r>
+          </w:p>
+          <w:tbl>
+            <w:tblPr>
+              <w:tblStyle w:val="Table"/>
+              <w:tblW w:type="pct" w:w="5000"/>
+              <w:tblLayout w:type="fixed"/>
+              <w:tblLook w:firstRow="1" w:lastRow="0" w:firstColumn="0" w:lastColumn="0" w:noHBand="0" w:noVBand="0" w:val="0020"/>
+            </w:tblPr>
+            <w:tblGrid>
+              <w:gridCol w:w="571"/>
+              <w:gridCol w:w="3974"/>
+              <w:gridCol w:w="3373"/>
+            </w:tblGrid>
+            <w:tr>
+              <w:trPr>
+                <w:tblHeader w:val="on"/>
+              </w:trPr>
+              <w:tc>
+                <w:tcPr/>
+                <w:p>
+                  <w:pPr>
+                    <w:pStyle w:val="Compact"/>
+                    <w:jc w:val="left"/>
+                    <w:jc w:val="center"/>
+                  </w:pPr>
+                  <w:r>
+                    <w:t xml:space="preserve">Feature</w:t>
+                  </w:r>
+                </w:p>
+              </w:tc>
+              <w:tc>
+                <w:tcPr/>
+                <w:p>
+                  <w:pPr>
+                    <w:pStyle w:val="Compact"/>
+                    <w:jc w:val="left"/>
+                    <w:jc w:val="center"/>
+                  </w:pPr>
+                  <w:r>
+                    <w:t xml:space="preserve">JAGS</w:t>
+                  </w:r>
+                </w:p>
+              </w:tc>
+              <w:tc>
+                <w:tcPr/>
+                <w:p>
+                  <w:pPr>
+                    <w:pStyle w:val="Compact"/>
+                    <w:jc w:val="left"/>
+                    <w:jc w:val="center"/>
+                  </w:pPr>
+                  <w:r>
+                    <w:t xml:space="preserve">Stan</w:t>
+                  </w:r>
+                </w:p>
+              </w:tc>
+            </w:tr>
+            <w:tr>
+              <w:tc>
+                <w:tcPr/>
+                <w:p>
+                  <w:pPr>
+                    <w:pStyle w:val="Compact"/>
+                    <w:jc w:val="left"/>
+                    <w:jc w:val="center"/>
+                  </w:pPr>
+                  <w:r>
+                    <w:t xml:space="preserve">Sampling algorithm</w:t>
+                  </w:r>
+                </w:p>
+              </w:tc>
+              <w:tc>
+                <w:tcPr/>
+                <w:p>
+                  <w:pPr>
+                    <w:pStyle w:val="Compact"/>
+                    <w:jc w:val="left"/>
+                    <w:jc w:val="center"/>
+                  </w:pPr>
+                  <w:r>
+                    <w:t xml:space="preserve">Updates one node at a time, as in Gibbs sampling, with conjugate samplers where it recognizes them and slice or Metropolis steps otherwise</w:t>
+                  </w:r>
+                </w:p>
+              </w:tc>
+              <w:tc>
+                <w:tcPr/>
+                <w:p>
+                  <w:pPr>
+                    <w:pStyle w:val="Compact"/>
+                    <w:jc w:val="left"/>
+                    <w:jc w:val="center"/>
+                  </w:pPr>
+                  <w:r>
+                    <w:t xml:space="preserve">Hamiltonian Monte Carlo, in its No-U-Turn form (NUTS)</w:t>
+                  </w:r>
+                </w:p>
+              </w:tc>
+            </w:tr>
+            <w:tr>
+              <w:tc>
+                <w:tcPr/>
+                <w:p>
+                  <w:pPr>
+                    <w:pStyle w:val="Compact"/>
+                    <w:jc w:val="left"/>
+                    <w:jc w:val="center"/>
+                  </w:pPr>
+                  <w:r>
+                    <w:t xml:space="preserve">Model language</w:t>
+                  </w:r>
+                </w:p>
+              </w:tc>
+              <w:tc>
+                <w:tcPr/>
+                <w:p>
+                  <w:pPr>
+                    <w:pStyle w:val="Compact"/>
+                    <w:jc w:val="left"/>
+                    <w:jc w:val="center"/>
+                  </w:pPr>
+                  <w:r>
+                    <w:t xml:space="preserve">A BUGS-style description of a graphical model; the order of the statements does not matter</w:t>
+                  </w:r>
+                </w:p>
+              </w:tc>
+              <w:tc>
+                <w:tcPr/>
+                <w:p>
+                  <w:pPr>
+                    <w:pStyle w:val="Compact"/>
+                    <w:jc w:val="left"/>
+                    <w:jc w:val="center"/>
+                  </w:pPr>
+                  <w:r>
+                    <w:t xml:space="preserve">A typed program in blocks (</w:t>
+                  </w:r>
+                  <w:r>
+                    <w:rPr>
+                      <w:rStyle w:val="VerbatimChar"/>
+                    </w:rPr>
+                    <w:t xml:space="preserve">data</w:t>
+                  </w:r>
+                  <w:r>
+                    <w:t xml:space="preserve">,</w:t>
+                  </w:r>
+                  <w:r>
+                    <w:t xml:space="preserve"> </w:t>
+                  </w:r>
+                  <w:r>
+                    <w:rPr>
+                      <w:rStyle w:val="VerbatimChar"/>
+                    </w:rPr>
+                    <w:t xml:space="preserve">parameters</w:t>
+                  </w:r>
+                  <w:r>
+                    <w:t xml:space="preserve">,</w:t>
+                  </w:r>
+                  <w:r>
+                    <w:t xml:space="preserve"> </w:t>
+                  </w:r>
+                  <w:r>
+                    <w:rPr>
+                      <w:rStyle w:val="VerbatimChar"/>
+                    </w:rPr>
+                    <w:t xml:space="preserve">model</w:t>
+                  </w:r>
+                  <w:r>
+                    <w:t xml:space="preserve">); the statements run in order and accumulate the log density</w:t>
+                  </w:r>
+                </w:p>
+              </w:tc>
+            </w:tr>
+            <w:tr>
+              <w:tc>
+                <w:tcPr/>
+                <w:p>
+                  <w:pPr>
+                    <w:pStyle w:val="Compact"/>
+                    <w:jc w:val="left"/>
+                    <w:jc w:val="center"/>
+                  </w:pPr>
+                  <w:r>
+                    <w:t xml:space="preserve">Normal distribution</w:t>
+                  </w:r>
+                </w:p>
+              </w:tc>
+              <w:tc>
+                <w:tcPr/>
+                <w:p>
+                  <w:pPr>
+                    <w:pStyle w:val="Compact"/>
+                    <w:jc w:val="left"/>
+                    <w:jc w:val="center"/>
+                  </w:pPr>
+                  <w:r>
+                    <w:rPr>
+                      <w:rStyle w:val="VerbatimChar"/>
+                    </w:rPr>
+                    <w:t xml:space="preserve">dnorm(mean, precision)</w:t>
+                  </w:r>
+                </w:p>
+              </w:tc>
+              <w:tc>
+                <w:tcPr/>
+                <w:p>
+                  <w:pPr>
+                    <w:pStyle w:val="Compact"/>
+                    <w:jc w:val="left"/>
+                    <w:jc w:val="center"/>
+                  </w:pPr>
+                  <w:r>
+                    <w:rPr>
+                      <w:rStyle w:val="VerbatimChar"/>
+                    </w:rPr>
+                    <w:t xml:space="preserve">normal(mean, sd)</w:t>
+                  </w:r>
+                </w:p>
+              </w:tc>
+            </w:tr>
+            <w:tr>
+              <w:tc>
+                <w:tcPr/>
+                <w:p>
+                  <w:pPr>
+                    <w:pStyle w:val="Compact"/>
+                    <w:jc w:val="left"/>
+                    <w:jc w:val="center"/>
+                  </w:pPr>
+                  <w:r>
+                    <w:t xml:space="preserve">Discrete parameters</w:t>
+                  </w:r>
+                </w:p>
+              </w:tc>
+              <w:tc>
+                <w:tcPr/>
+                <w:p>
+                  <w:pPr>
+                    <w:pStyle w:val="Compact"/>
+                    <w:jc w:val="left"/>
+                    <w:jc w:val="center"/>
+                  </w:pPr>
+                  <w:r>
+                    <w:t xml:space="preserve">Allowed; JAGS samples them</w:t>
+                  </w:r>
+                </w:p>
+              </w:tc>
+              <w:tc>
+                <w:tcPr/>
+                <w:p>
+                  <w:pPr>
+                    <w:pStyle w:val="Compact"/>
+                    <w:jc w:val="left"/>
+                    <w:jc w:val="center"/>
+                  </w:pPr>
+                  <w:r>
+                    <w:t xml:space="preserve">Not allowed; they are summed out of the joint density</w:t>
+                  </w:r>
+                </w:p>
+              </w:tc>
+            </w:tr>
+            <w:tr>
+              <w:tc>
+                <w:tcPr/>
+                <w:p>
+                  <w:pPr>
+                    <w:pStyle w:val="Compact"/>
+                    <w:jc w:val="left"/>
+                    <w:jc w:val="center"/>
+                  </w:pPr>
+                  <w:r>
+                    <w:t xml:space="preserve">Execution</w:t>
+                  </w:r>
+                </w:p>
+              </w:tc>
+              <w:tc>
+                <w:tcPr/>
+                <w:p>
+                  <w:pPr>
+                    <w:pStyle w:val="Compact"/>
+                    <w:jc w:val="left"/>
+                    <w:jc w:val="center"/>
+                  </w:pPr>
+                  <w:r>
+                    <w:t xml:space="preserve">Interpreted by the JAGS library</w:t>
+                  </w:r>
+                </w:p>
+              </w:tc>
+              <w:tc>
+                <w:tcPr/>
+                <w:p>
+                  <w:pPr>
+                    <w:pStyle w:val="Compact"/>
+                    <w:jc w:val="left"/>
+                    <w:jc w:val="center"/>
+                  </w:pPr>
+                  <w:r>
+                    <w:t xml:space="preserve">Translated to C++ and compiled before sampling</w:t>
+                  </w:r>
+                </w:p>
+              </w:tc>
+            </w:tr>
+            <w:tr>
+              <w:tc>
+                <w:tcPr/>
+                <w:p>
+                  <w:pPr>
+                    <w:pStyle w:val="Compact"/>
+                    <w:jc w:val="left"/>
+                    <w:jc w:val="center"/>
+                  </w:pPr>
+                  <w:r>
+                    <w:t xml:space="preserve">Convergence checks</w:t>
+                  </w:r>
+                </w:p>
+              </w:tc>
+              <w:tc>
+                <w:tcPr/>
+                <w:p>
+                  <w:pPr>
+                    <w:pStyle w:val="Compact"/>
+                    <w:jc w:val="left"/>
+                    <w:jc w:val="center"/>
+                  </w:pPr>
+                  <w:r>
+                    <w:rPr>
+                      <w:rStyle w:val="VerbatimChar"/>
+                    </w:rPr>
+                    <w:t xml:space="preserve">Rhat</w:t>
+                  </w:r>
+                  <w:r>
+                    <w:t xml:space="preserve"> </w:t>
+                  </w:r>
+                  <w:r>
+                    <w:t xml:space="preserve">and effective sample size, computed from the draws with the</w:t>
+                  </w:r>
+                  <w:r>
+                    <w:t xml:space="preserve"> </w:t>
+                  </w:r>
+                  <w:r>
+                    <w:rPr>
+                      <w:rStyle w:val="VerbatimChar"/>
+                    </w:rPr>
+                    <w:t xml:space="preserve">coda</w:t>
+                  </w:r>
+                  <w:r>
+                    <w:t xml:space="preserve"> </w:t>
+                  </w:r>
+                  <w:r>
+                    <w:t xml:space="preserve">package</w:t>
+                  </w:r>
+                </w:p>
+              </w:tc>
+              <w:tc>
+                <w:tcPr/>
+                <w:p>
+                  <w:pPr>
+                    <w:pStyle w:val="Compact"/>
+                    <w:jc w:val="left"/>
+                    <w:jc w:val="center"/>
+                  </w:pPr>
+                  <w:r>
+                    <w:rPr>
+                      <w:rStyle w:val="VerbatimChar"/>
+                    </w:rPr>
+                    <w:t xml:space="preserve">Rhat</w:t>
+                  </w:r>
+                  <w:r>
+                    <w:t xml:space="preserve"> </w:t>
+                  </w:r>
+                  <w:r>
+                    <w:t xml:space="preserve">and effective sample size, plus sampler checks such as divergent transitions and tree depth</w:t>
+                  </w:r>
+                </w:p>
+              </w:tc>
+            </w:tr>
+            <w:tr>
+              <w:tc>
+                <w:tcPr/>
+                <w:p>
+                  <w:pPr>
+                    <w:pStyle w:val="Compact"/>
+                    <w:jc w:val="left"/>
+                    <w:jc w:val="center"/>
+                  </w:pPr>
+                  <w:r>
+                    <w:t xml:space="preserve">R interfaces</w:t>
+                  </w:r>
+                </w:p>
+              </w:tc>
+              <w:tc>
+                <w:tcPr/>
+                <w:p>
+                  <w:pPr>
+                    <w:pStyle w:val="Compact"/>
+                    <w:jc w:val="left"/>
+                    <w:jc w:val="center"/>
+                  </w:pPr>
+                  <w:r>
+                    <w:rPr>
+                      <w:rStyle w:val="VerbatimChar"/>
+                    </w:rPr>
+                    <w:t xml:space="preserve">rjags</w:t>
+                  </w:r>
+                  <w:r>
+                    <w:t xml:space="preserve">,</w:t>
+                  </w:r>
+                  <w:r>
+                    <w:t xml:space="preserve"> </w:t>
+                  </w:r>
+                  <w:r>
+                    <w:rPr>
+                      <w:rStyle w:val="VerbatimChar"/>
+                    </w:rPr>
+                    <w:t xml:space="preserve">runjags</w:t>
+                  </w:r>
+                </w:p>
+              </w:tc>
+              <w:tc>
+                <w:tcPr/>
+                <w:p>
+                  <w:pPr>
+                    <w:pStyle w:val="Compact"/>
+                    <w:jc w:val="left"/>
+                    <w:jc w:val="center"/>
+                  </w:pPr>
+                  <w:r>
+                    <w:rPr>
+                      <w:rStyle w:val="VerbatimChar"/>
+                    </w:rPr>
+                    <w:t xml:space="preserve">rstan</w:t>
+                  </w:r>
+                  <w:r>
+                    <w:t xml:space="preserve">,</w:t>
+                  </w:r>
+                  <w:r>
+                    <w:t xml:space="preserve"> </w:t>
+                  </w:r>
+                  <w:r>
+                    <w:rPr>
+                      <w:rStyle w:val="VerbatimChar"/>
+                    </w:rPr>
+                    <w:t xml:space="preserve">cmdstanr</w:t>
+                  </w:r>
+                </w:p>
+              </w:tc>
+            </w:tr>
+            <w:tr>
+              <w:tc>
+                <w:tcPr/>
+                <w:p>
+                  <w:pPr>
+                    <w:pStyle w:val="Compact"/>
+                    <w:jc w:val="left"/>
+                    <w:jc w:val="center"/>
+                  </w:pPr>
+                  <w:r>
+                    <w:t xml:space="preserve">Official site</w:t>
+                  </w:r>
+                </w:p>
+              </w:tc>
+              <w:tc>
+                <w:tcPr/>
+                <w:p>
+                  <w:pPr>
+                    <w:pStyle w:val="Compact"/>
+                    <w:jc w:val="left"/>
+                    <w:jc w:val="center"/>
+                  </w:pPr>
+                  <w:hyperlink r:id="rId21">
+                    <w:r>
+                      <w:rPr>
+                        <w:rStyle w:val="Hyperlink"/>
+                      </w:rPr>
+                      <w:t xml:space="preserve">mcmc-jags.sourceforge.io</w:t>
+                    </w:r>
+                  </w:hyperlink>
+                </w:p>
+              </w:tc>
+              <w:tc>
+                <w:tcPr/>
+                <w:p>
+                  <w:pPr>
+                    <w:pStyle w:val="Compact"/>
+                    <w:jc w:val="left"/>
+                    <w:jc w:val="center"/>
+                  </w:pPr>
+                  <w:hyperlink r:id="rId22">
+                    <w:r>
+                      <w:rPr>
+                        <w:rStyle w:val="Hyperlink"/>
+                      </w:rPr>
+                      <w:t xml:space="preserve">mc-stan.org</w:t>
+                    </w:r>
+                  </w:hyperlink>
+                </w:p>
+              </w:tc>
+            </w:tr>
+          </w:tbl>
+          <w:bookmarkEnd w:id="23"/>
+          <w:p/>
+        </w:tc>
+      </w:tr>
+    </w:tbl>
+    <w:p>
+      <w:pPr>
+        <w:pStyle w:val="BodyText"/>
+      </w:pPr>
+      <w:r>
+        <w:t xml:space="preserve">The next example fits the model of</w:t>
+      </w:r>
+      <w:r>
+        <w:t xml:space="preserve"> </w:t>
+      </w:r>
+      <w:hyperlink w:anchor="exm-bayes-proportion">
+        <w:r>
+          <w:rPr>
+            <w:rStyle w:val="Hyperlink"/>
+          </w:rPr>
+          <w:t xml:space="preserve">the first example</w:t>
+        </w:r>
+      </w:hyperlink>
+      <w:r>
+        <w:t xml:space="preserve"> </w:t>
+      </w:r>
+      <w:r>
+        <w:t xml:space="preserve">in Stan,</w:t>
+      </w:r>
+      <w:r>
+        <w:t xml:space="preserve"> </w:t>
+      </w:r>
+      <w:r>
+        <w:t xml:space="preserve">so the two programs can be compared on one problem.</w:t>
+      </w:r>
+    </w:p>
+    <w:bookmarkStart w:id="27" w:name="exm-bayes-proportion-stan"/>
+    <w:p>
+      <w:pPr>
+        <w:pStyle w:val="BodyText"/>
+      </w:pPr>
+      <w:r>
+        <w:rPr>
+          <w:b/>
+          <w:bCs/>
+        </w:rPr>
+        <w:t xml:space="preserve">Example 2 (The Bernoulli model fitted with Stan)</w:t>
+      </w:r>
+      <w:r>
+        <w:t xml:space="preserve"> </w:t>
+      </w:r>
+      <w:r>
+        <w:t xml:space="preserve">The data and the</w:t>
+      </w:r>
+      <w:r>
+        <w:t xml:space="preserve"> </w:t>
+      </w:r>
+      <w:hyperlink r:id="rId24">
+        <w:r>
+          <w:rPr>
+            <w:rStyle w:val="Hyperlink"/>
+          </w:rPr>
+          <w:t xml:space="preserve">uniform prior</w:t>
+        </w:r>
+      </w:hyperlink>
+      <w:r>
+        <w:t xml:space="preserve"> </w:t>
+      </w:r>
+      <w:r>
+        <w:t xml:space="preserve">are those of</w:t>
+      </w:r>
+      <w:r>
+        <w:t xml:space="preserve"> </w:t>
+      </w:r>
+      <w:hyperlink w:anchor="exm-bayes-proportion">
+        <w:r>
+          <w:rPr>
+            <w:rStyle w:val="Hyperlink"/>
+          </w:rPr>
+          <w:t xml:space="preserve">the JAGS example</w:t>
+        </w:r>
+      </w:hyperlink>
+      <w:r>
+        <w:t xml:space="preserve">.</w:t>
+      </w:r>
+      <w:r>
+        <w:t xml:space="preserve"> </w:t>
+      </w:r>
+      <w:r>
+        <w:t xml:space="preserve">The Stan program declares the data and the parameter with their types and ranges,</w:t>
+      </w:r>
+      <w:r>
+        <w:t xml:space="preserve"> </w:t>
+      </w:r>
+      <w:r>
+        <w:t xml:space="preserve">and the</w:t>
+      </w:r>
+      <w:r>
+        <w:t xml:space="preserve"> </w:t>
+      </w:r>
+      <w:r>
+        <w:rPr>
+          <w:rStyle w:val="VerbatimChar"/>
+        </w:rPr>
+        <w:t xml:space="preserve">model</w:t>
+      </w:r>
+      <w:r>
+        <w:t xml:space="preserve"> </w:t>
+      </w:r>
+      <w:r>
+        <w:t xml:space="preserve">block states the</w:t>
+      </w:r>
+      <w:r>
+        <w:t xml:space="preserve"> </w:t>
+      </w:r>
+      <w:hyperlink r:id="rId25">
+        <w:r>
+          <w:rPr>
+            <w:rStyle w:val="Hyperlink"/>
+          </w:rPr>
+          <w:t xml:space="preserve">prior</w:t>
+        </w:r>
+      </w:hyperlink>
+      <w:r>
+        <w:t xml:space="preserve"> </w:t>
+      </w:r>
+      <w:r>
+        <w:t xml:space="preserve">and the</w:t>
+      </w:r>
+      <w:r>
+        <w:t xml:space="preserve"> </w:t>
+      </w:r>
+      <w:hyperlink r:id="rId26">
+        <w:r>
+          <w:rPr>
+            <w:rStyle w:val="Hyperlink"/>
+          </w:rPr>
+          <w:t xml:space="preserve">likelihood</w:t>
+        </w:r>
+      </w:hyperlink>
+      <w:r>
+        <w:t xml:space="preserve">:</w:t>
+      </w:r>
+    </w:p>
+    <w:p>
+      <w:pPr>
+        <w:pStyle w:val="SourceCode"/>
+      </w:pPr>
+      <w:r>
+        <w:rPr>
+          <w:rStyle w:val="NormalTok"/>
+        </w:rPr>
+        <w:t xml:space="preserve">bernoulli_stan </w:t>
+      </w:r>
+      <w:r>
+        <w:rPr>
+          <w:rStyle w:val="OtherTok"/>
+        </w:rPr>
+        <w:t xml:space="preserve">&lt;-</w:t>
+      </w:r>
+      <w:r>
+        <w:rPr>
+          <w:rStyle w:val="NormalTok"/>
+        </w:rPr>
+        <w:t xml:space="preserve"> </w:t>
+      </w:r>
+      <w:r>
+        <w:rPr>
+          <w:rStyle w:val="StringTok"/>
+        </w:rPr>
+        <w:t xml:space="preserve">"</w:t>
+      </w:r>
+      <w:r>
+        <w:br/>
+      </w:r>
+      <w:r>
+        <w:rPr>
+          <w:rStyle w:val="StringTok"/>
+        </w:rPr>
+        <w:t xml:space="preserve">data {</w:t>
+      </w:r>
+      <w:r>
+        <w:br/>
+      </w:r>
+      <w:r>
+        <w:rPr>
+          <w:rStyle w:val="StringTok"/>
+        </w:rPr>
+        <w:t xml:space="preserve">  int&lt;lower=0&gt; N;</w:t>
+      </w:r>
+      <w:r>
+        <w:br/>
+      </w:r>
+      <w:r>
+        <w:rPr>
+          <w:rStyle w:val="StringTok"/>
+        </w:rPr>
+        <w:t xml:space="preserve">  array[N] int&lt;lower=0, upper=1&gt; y;</w:t>
+      </w:r>
+      <w:r>
+        <w:br/>
+      </w:r>
+      <w:r>
+        <w:rPr>
+          <w:rStyle w:val="StringTok"/>
+        </w:rPr>
+        <w:t xml:space="preserve">}</w:t>
+      </w:r>
+      <w:r>
+        <w:br/>
+      </w:r>
+      <w:r>
+        <w:rPr>
+          <w:rStyle w:val="StringTok"/>
+        </w:rPr>
+        <w:t xml:space="preserve">parameters {</w:t>
+      </w:r>
+      <w:r>
+        <w:br/>
+      </w:r>
+      <w:r>
+        <w:rPr>
+          <w:rStyle w:val="StringTok"/>
+        </w:rPr>
+        <w:t xml:space="preserve">  real&lt;lower=0, upper=1&gt; p;</w:t>
+      </w:r>
+      <w:r>
+        <w:br/>
+      </w:r>
+      <w:r>
+        <w:rPr>
+          <w:rStyle w:val="StringTok"/>
+        </w:rPr>
+        <w:t xml:space="preserve">}</w:t>
+      </w:r>
+      <w:r>
+        <w:br/>
+      </w:r>
+      <w:r>
+        <w:rPr>
+          <w:rStyle w:val="StringTok"/>
+        </w:rPr>
+        <w:t xml:space="preserve">model {</w:t>
+      </w:r>
+      <w:r>
+        <w:br/>
+      </w:r>
+      <w:r>
+        <w:rPr>
+          <w:rStyle w:val="StringTok"/>
+        </w:rPr>
+        <w:t xml:space="preserve">  p ~ beta(1, 1);</w:t>
+      </w:r>
+      <w:r>
+        <w:br/>
+      </w:r>
+      <w:r>
+        <w:rPr>
+          <w:rStyle w:val="StringTok"/>
+        </w:rPr>
+        <w:t xml:space="preserve">  y ~ bernoulli(p);</w:t>
+      </w:r>
+      <w:r>
+        <w:br/>
+      </w:r>
+      <w:r>
+        <w:rPr>
+          <w:rStyle w:val="StringTok"/>
+        </w:rPr>
+        <w:t xml:space="preserve">}</w:t>
+      </w:r>
+      <w:r>
+        <w:br/>
+      </w:r>
+      <w:r>
+        <w:rPr>
+          <w:rStyle w:val="StringTok"/>
+        </w:rPr>
+        <w:t xml:space="preserve">"</w:t>
+      </w:r>
+      <w:r>
+        <w:br/>
+      </w:r>
+      <w:r>
+        <w:rPr>
+          <w:rStyle w:val="NormalTok"/>
+        </w:rPr>
+        <w:t xml:space="preserve">stan_fit </w:t>
+      </w:r>
+      <w:r>
+        <w:rPr>
+          <w:rStyle w:val="OtherTok"/>
+        </w:rPr>
+        <w:t xml:space="preserve">&lt;-</w:t>
+      </w:r>
+      <w:r>
+        <w:rPr>
+          <w:rStyle w:val="NormalTok"/>
+        </w:rPr>
+        <w:t xml:space="preserve"> rstan</w:t>
+      </w:r>
+      <w:r>
+        <w:rPr>
+          <w:rStyle w:val="SpecialCharTok"/>
+        </w:rPr>
+        <w:t xml:space="preserve">::</w:t>
+      </w:r>
+      <w:r>
+        <w:rPr>
+          <w:rStyle w:val="FunctionTok"/>
+        </w:rPr>
+        <w:t xml:space="preserve">stan</w:t>
+      </w:r>
+      <w:r>
+        <w:rPr>
+          <w:rStyle w:val="NormalTok"/>
+        </w:rPr>
+        <w:t xml:space="preserve">(</w:t>
+      </w:r>
+      <w:r>
+        <w:br/>
+      </w:r>
+      <w:r>
+        <w:rPr>
+          <w:rStyle w:val="NormalTok"/>
+        </w:rPr>
+        <w:t xml:space="preserve">  </w:t>
+      </w:r>
+      <w:r>
+        <w:rPr>
+          <w:rStyle w:val="AttributeTok"/>
+        </w:rPr>
+        <w:t xml:space="preserve">model_code =</w:t>
+      </w:r>
+      <w:r>
+        <w:rPr>
+          <w:rStyle w:val="NormalTok"/>
+        </w:rPr>
+        <w:t xml:space="preserve"> bernoulli_stan,</w:t>
+      </w:r>
+      <w:r>
+        <w:br/>
+      </w:r>
+      <w:r>
+        <w:rPr>
+          <w:rStyle w:val="NormalTok"/>
+        </w:rPr>
+        <w:t xml:space="preserve">  </w:t>
+      </w:r>
+      <w:r>
+        <w:rPr>
+          <w:rStyle w:val="AttributeTok"/>
+        </w:rPr>
+        <w:t xml:space="preserve">data =</w:t>
+      </w:r>
+      <w:r>
+        <w:rPr>
+          <w:rStyle w:val="NormalTok"/>
+        </w:rPr>
+        <w:t xml:space="preserve"> </w:t>
+      </w:r>
+      <w:r>
+        <w:rPr>
+          <w:rStyle w:val="FunctionTok"/>
+        </w:rPr>
+        <w:t xml:space="preserve">list</w:t>
+      </w:r>
+      <w:r>
+        <w:rPr>
+          <w:rStyle w:val="NormalTok"/>
+        </w:rPr>
+        <w:t xml:space="preserve">(</w:t>
+      </w:r>
+      <w:r>
+        <w:rPr>
+          <w:rStyle w:val="AttributeTok"/>
+        </w:rPr>
+        <w:t xml:space="preserve">N =</w:t>
+      </w:r>
+      <w:r>
+        <w:rPr>
+          <w:rStyle w:val="NormalTok"/>
+        </w:rPr>
+        <w:t xml:space="preserve"> </w:t>
+      </w:r>
+      <w:r>
+        <w:rPr>
+          <w:rStyle w:val="FunctionTok"/>
+        </w:rPr>
+        <w:t xml:space="preserve">length</w:t>
+      </w:r>
+      <w:r>
+        <w:rPr>
+          <w:rStyle w:val="NormalTok"/>
+        </w:rPr>
+        <w:t xml:space="preserve">(y), </w:t>
+      </w:r>
+      <w:r>
+        <w:rPr>
+          <w:rStyle w:val="AttributeTok"/>
+        </w:rPr>
+        <w:t xml:space="preserve">y =</w:t>
+      </w:r>
+      <w:r>
+        <w:rPr>
+          <w:rStyle w:val="NormalTok"/>
+        </w:rPr>
+        <w:t xml:space="preserve"> y),</w:t>
+      </w:r>
+      <w:r>
+        <w:br/>
+      </w:r>
+      <w:r>
+        <w:rPr>
+          <w:rStyle w:val="NormalTok"/>
+        </w:rPr>
+        <w:t xml:space="preserve">  </w:t>
+      </w:r>
+      <w:r>
+        <w:rPr>
+          <w:rStyle w:val="AttributeTok"/>
+        </w:rPr>
+        <w:t xml:space="preserve">chains =</w:t>
+      </w:r>
+      <w:r>
+        <w:rPr>
+          <w:rStyle w:val="NormalTok"/>
+        </w:rPr>
+        <w:t xml:space="preserve"> </w:t>
+      </w:r>
+      <w:r>
+        <w:rPr>
+          <w:rStyle w:val="DecValTok"/>
+        </w:rPr>
+        <w:t xml:space="preserve">2</w:t>
+      </w:r>
+      <w:r>
+        <w:rPr>
+          <w:rStyle w:val="NormalTok"/>
+        </w:rPr>
+        <w:t xml:space="preserve">,</w:t>
+      </w:r>
+      <w:r>
+        <w:br/>
+      </w:r>
+      <w:r>
+        <w:rPr>
+          <w:rStyle w:val="NormalTok"/>
+        </w:rPr>
+        <w:t xml:space="preserve">  </w:t>
+      </w:r>
+      <w:r>
+        <w:rPr>
+          <w:rStyle w:val="AttributeTok"/>
+        </w:rPr>
+        <w:t xml:space="preserve">warmup =</w:t>
+      </w:r>
+      <w:r>
+        <w:rPr>
+          <w:rStyle w:val="NormalTok"/>
+        </w:rPr>
+        <w:t xml:space="preserve"> </w:t>
+      </w:r>
+      <w:r>
+        <w:rPr>
+          <w:rStyle w:val="DecValTok"/>
+        </w:rPr>
+        <w:t xml:space="preserve">1000</w:t>
+      </w:r>
+      <w:r>
+        <w:rPr>
+          <w:rStyle w:val="NormalTok"/>
+        </w:rPr>
+        <w:t xml:space="preserve">,</w:t>
+      </w:r>
+      <w:r>
+        <w:br/>
+      </w:r>
+      <w:r>
+        <w:rPr>
+          <w:rStyle w:val="NormalTok"/>
+        </w:rPr>
+        <w:t xml:space="preserve">  </w:t>
+      </w:r>
+      <w:r>
+        <w:rPr>
+          <w:rStyle w:val="AttributeTok"/>
+        </w:rPr>
+        <w:t xml:space="preserve">iter =</w:t>
+      </w:r>
+      <w:r>
+        <w:rPr>
+          <w:rStyle w:val="NormalTok"/>
+        </w:rPr>
+        <w:t xml:space="preserve"> </w:t>
+      </w:r>
+      <w:r>
+        <w:rPr>
+          <w:rStyle w:val="DecValTok"/>
+        </w:rPr>
+        <w:t xml:space="preserve">5000</w:t>
+      </w:r>
+      <w:r>
+        <w:rPr>
+          <w:rStyle w:val="NormalTok"/>
+        </w:rPr>
+        <w:t xml:space="preserve">,</w:t>
+      </w:r>
+      <w:r>
+        <w:br/>
+      </w:r>
+      <w:r>
+        <w:rPr>
+          <w:rStyle w:val="NormalTok"/>
+        </w:rPr>
+        <w:t xml:space="preserve">  </w:t>
+      </w:r>
+      <w:r>
+        <w:rPr>
+          <w:rStyle w:val="AttributeTok"/>
+        </w:rPr>
+        <w:t xml:space="preserve">seed =</w:t>
+      </w:r>
+      <w:r>
+        <w:rPr>
+          <w:rStyle w:val="NormalTok"/>
+        </w:rPr>
+        <w:t xml:space="preserve"> </w:t>
+      </w:r>
+      <w:r>
+        <w:rPr>
+          <w:rStyle w:val="DecValTok"/>
+        </w:rPr>
+        <w:t xml:space="preserve">1</w:t>
+      </w:r>
+      <w:r>
+        <w:rPr>
+          <w:rStyle w:val="NormalTok"/>
+        </w:rPr>
+        <w:t xml:space="preserve">,</w:t>
+      </w:r>
+      <w:r>
+        <w:br/>
+      </w:r>
+      <w:r>
+        <w:rPr>
+          <w:rStyle w:val="NormalTok"/>
+        </w:rPr>
+        <w:t xml:space="preserve">  </w:t>
+      </w:r>
+      <w:r>
+        <w:rPr>
+          <w:rStyle w:val="AttributeTok"/>
+        </w:rPr>
+        <w:t xml:space="preserve">refresh =</w:t>
+      </w:r>
+      <w:r>
+        <w:rPr>
+          <w:rStyle w:val="NormalTok"/>
+        </w:rPr>
+        <w:t xml:space="preserve"> </w:t>
+      </w:r>
+      <w:r>
+        <w:rPr>
+          <w:rStyle w:val="DecValTok"/>
+        </w:rPr>
+        <w:t xml:space="preserve">0</w:t>
+      </w:r>
+      <w:r>
+        <w:br/>
+      </w:r>
+      <w:r>
+        <w:rPr>
+          <w:rStyle w:val="NormalTok"/>
+        </w:rPr>
+        <w:t xml:space="preserve">)</w:t>
+      </w:r>
+      <w:r>
+        <w:br/>
+      </w:r>
+      <w:r>
+        <w:rPr>
+          <w:rStyle w:val="NormalTok"/>
+        </w:rPr>
+        <w:t xml:space="preserve">stan_draws </w:t>
+      </w:r>
+      <w:r>
+        <w:rPr>
+          <w:rStyle w:val="OtherTok"/>
+        </w:rPr>
+        <w:t xml:space="preserve">&lt;-</w:t>
+      </w:r>
+      <w:r>
+        <w:rPr>
+          <w:rStyle w:val="NormalTok"/>
+        </w:rPr>
+        <w:t xml:space="preserve"> </w:t>
+      </w:r>
+      <w:r>
+        <w:rPr>
+          <w:rStyle w:val="FunctionTok"/>
+        </w:rPr>
+        <w:t xml:space="preserve">as.matrix</w:t>
+      </w:r>
+      <w:r>
+        <w:rPr>
+          <w:rStyle w:val="NormalTok"/>
+        </w:rPr>
+        <w:t xml:space="preserve">(stan_fit, </w:t>
+      </w:r>
+      <w:r>
+        <w:rPr>
+          <w:rStyle w:val="AttributeTok"/>
+        </w:rPr>
+        <w:t xml:space="preserve">pars =</w:t>
+      </w:r>
+      <w:r>
+        <w:rPr>
+          <w:rStyle w:val="NormalTok"/>
+        </w:rPr>
+        <w:t xml:space="preserve"> </w:t>
+      </w:r>
+      <w:r>
+        <w:rPr>
+          <w:rStyle w:val="StringTok"/>
+        </w:rPr>
+        <w:t xml:space="preserve">"p"</w:t>
+      </w:r>
+      <w:r>
+        <w:rPr>
+          <w:rStyle w:val="NormalTok"/>
+        </w:rPr>
+        <w:t xml:space="preserve">)[, </w:t>
+      </w:r>
+      <w:r>
+        <w:rPr>
+          <w:rStyle w:val="StringTok"/>
+        </w:rPr>
+        <w:t xml:space="preserve">"p"</w:t>
+      </w:r>
+      <w:r>
+        <w:rPr>
+          <w:rStyle w:val="NormalTok"/>
+        </w:rPr>
+        <w:t xml:space="preserve">]</w:t>
+      </w:r>
+      <w:r>
+        <w:br/>
+      </w:r>
+      <w:r>
+        <w:rPr>
+          <w:rStyle w:val="NormalTok"/>
+        </w:rPr>
+        <w:t xml:space="preserve">stan_summary </w:t>
+      </w:r>
+      <w:r>
+        <w:rPr>
+          <w:rStyle w:val="OtherTok"/>
+        </w:rPr>
+        <w:t xml:space="preserve">&lt;-</w:t>
+      </w:r>
+      <w:r>
+        <w:rPr>
+          <w:rStyle w:val="NormalTok"/>
+        </w:rPr>
+        <w:t xml:space="preserve"> rstan</w:t>
+      </w:r>
+      <w:r>
+        <w:rPr>
+          <w:rStyle w:val="SpecialCharTok"/>
+        </w:rPr>
+        <w:t xml:space="preserve">::</w:t>
+      </w:r>
+      <w:r>
+        <w:rPr>
+          <w:rStyle w:val="FunctionTok"/>
+        </w:rPr>
+        <w:t xml:space="preserve">summary</w:t>
+      </w:r>
+      <w:r>
+        <w:rPr>
+          <w:rStyle w:val="NormalTok"/>
+        </w:rPr>
+        <w:t xml:space="preserve">(stan_fit, </w:t>
+      </w:r>
+      <w:r>
+        <w:rPr>
+          <w:rStyle w:val="AttributeTok"/>
+        </w:rPr>
+        <w:t xml:space="preserve">pars =</w:t>
+      </w:r>
+      <w:r>
+        <w:rPr>
+          <w:rStyle w:val="NormalTok"/>
+        </w:rPr>
+        <w:t xml:space="preserve"> </w:t>
+      </w:r>
+      <w:r>
+        <w:rPr>
+          <w:rStyle w:val="StringTok"/>
+        </w:rPr>
+        <w:t xml:space="preserve">"p"</w:t>
+      </w:r>
+      <w:r>
+        <w:rPr>
+          <w:rStyle w:val="NormalTok"/>
+        </w:rPr>
+        <w:t xml:space="preserve">)</w:t>
+      </w:r>
+      <w:r>
+        <w:rPr>
+          <w:rStyle w:val="SpecialCharTok"/>
+        </w:rPr>
+        <w:t xml:space="preserve">$</w:t>
+      </w:r>
+      <w:r>
+        <w:rPr>
+          <w:rStyle w:val="NormalTok"/>
+        </w:rPr>
+        <w:t xml:space="preserve">summary</w:t>
+      </w:r>
+      <w:r>
+        <w:br/>
+      </w:r>
+      <w:r>
+        <w:rPr>
+          <w:rStyle w:val="FunctionTok"/>
+        </w:rPr>
+        <w:t xml:space="preserve">round</w:t>
+      </w:r>
+      <w:r>
+        <w:rPr>
+          <w:rStyle w:val="NormalTok"/>
+        </w:rPr>
+        <w:t xml:space="preserve">(stan_summary[, </w:t>
+      </w:r>
+      <w:r>
+        <w:rPr>
+          <w:rStyle w:val="FunctionTok"/>
+        </w:rPr>
+        <w:t xml:space="preserve">c</w:t>
+      </w:r>
+      <w:r>
+        <w:rPr>
+          <w:rStyle w:val="NormalTok"/>
+        </w:rPr>
+        <w:t xml:space="preserve">(</w:t>
+      </w:r>
+      <w:r>
+        <w:rPr>
+          <w:rStyle w:val="StringTok"/>
+        </w:rPr>
+        <w:t xml:space="preserve">"mean"</w:t>
+      </w:r>
+      <w:r>
+        <w:rPr>
+          <w:rStyle w:val="NormalTok"/>
+        </w:rPr>
+        <w:t xml:space="preserve">, </w:t>
+      </w:r>
+      <w:r>
+        <w:rPr>
+          <w:rStyle w:val="StringTok"/>
+        </w:rPr>
+        <w:t xml:space="preserve">"2.5%"</w:t>
+      </w:r>
+      <w:r>
+        <w:rPr>
+          <w:rStyle w:val="NormalTok"/>
+        </w:rPr>
+        <w:t xml:space="preserve">, </w:t>
+      </w:r>
+      <w:r>
+        <w:rPr>
+          <w:rStyle w:val="StringTok"/>
+        </w:rPr>
+        <w:t xml:space="preserve">"97.5%"</w:t>
+      </w:r>
+      <w:r>
+        <w:rPr>
+          <w:rStyle w:val="NormalTok"/>
+        </w:rPr>
+        <w:t xml:space="preserve">, </w:t>
+      </w:r>
+      <w:r>
+        <w:rPr>
+          <w:rStyle w:val="StringTok"/>
+        </w:rPr>
+        <w:t xml:space="preserve">"Rhat"</w:t>
+      </w:r>
+      <w:r>
+        <w:rPr>
+          <w:rStyle w:val="NormalTok"/>
+        </w:rPr>
+        <w:t xml:space="preserve">)], </w:t>
+      </w:r>
+      <w:r>
+        <w:rPr>
+          <w:rStyle w:val="DecValTok"/>
+        </w:rPr>
+        <w:t xml:space="preserve">3</w:t>
+      </w:r>
+      <w:r>
+        <w:rPr>
+          <w:rStyle w:val="NormalTok"/>
+        </w:rPr>
+        <w:t xml:space="preserve">)</w:t>
+      </w:r>
+      <w:r>
+        <w:br/>
+      </w:r>
+      <w:r>
+        <w:rPr>
+          <w:rStyle w:val="CommentTok"/>
+        </w:rPr>
+        <w:t xml:space="preserve">#&gt;  mean  2.5% 97.5%  Rhat </w:t>
+      </w:r>
+      <w:r>
+        <w:br/>
+      </w:r>
+      <w:r>
+        <w:rPr>
+          <w:rStyle w:val="CommentTok"/>
+        </w:rPr>
+        <w:t xml:space="preserve">#&gt; 0.602 0.501 0.698 1.000</w:t>
+      </w:r>
+    </w:p>
+    <w:bookmarkEnd w:id="27"/>
+    <w:p>
+      <w:pPr>
+        <w:pStyle w:val="FirstParagraph"/>
+      </w:pPr>
+      <w:hyperlink w:anchor="tbl-stan-jags-proportion">
+        <w:r>
+          <w:rPr>
+            <w:rStyle w:val="Hyperlink"/>
+          </w:rPr>
+          <w:t xml:space="preserve">Table 2</w:t>
+        </w:r>
+      </w:hyperlink>
+      <w:r>
+        <w:t xml:space="preserve"> </w:t>
+      </w:r>
+      <w:r>
+        <w:t xml:space="preserve">puts the two programs beside the</w:t>
+      </w:r>
+      <w:r>
+        <w:t xml:space="preserve"> </w:t>
+      </w:r>
+      <w:hyperlink r:id="rId15">
+        <w:r>
+          <w:rPr>
+            <w:rStyle w:val="Hyperlink"/>
+          </w:rPr>
+          <w:t xml:space="preserve">posterior</w:t>
+        </w:r>
+      </w:hyperlink>
+      <w:r>
+        <w:t xml:space="preserve"> </w:t>
+      </w:r>
+      <w:r>
+        <w:t xml:space="preserve">of</w:t>
+      </w:r>
+      <w:r>
+        <w:t xml:space="preserve"> </w:t>
+      </w:r>
+      <w:hyperlink r:id="rId11">
+        <w:r>
+          <w:rPr>
+            <w:rStyle w:val="Hyperlink"/>
+          </w:rPr>
+          <w:t xml:space="preserve">the Beta-Bernoulli example</w:t>
+        </w:r>
+      </w:hyperlink>
+      <w:r>
+        <w:t xml:space="preserve">,</w:t>
+      </w:r>
+      <w:r>
+        <w:t xml:space="preserve"> </w:t>
+      </w:r>
+      <w:r>
+        <w:t xml:space="preserve">whose Beta parameters come from the number of successes and failures:</w:t>
+      </w:r>
+    </w:p>
+    <w:tbl>
+      <w:tblPr>
+        <w:tblStyle w:val="Table"/>
+        <w:tblW w:type="pct" w:w="5000"/>
+        <w:tblLayout w:type="fixed"/>
+        <w:tblLook w:firstRow="0" w:lastRow="0" w:firstColumn="0" w:lastColumn="0" w:noHBand="0" w:noVBand="0" w:val="0000"/>
+      </w:tblPr>
+      <w:tblGrid>
+        <w:gridCol w:w="7920"/>
+      </w:tblGrid>
+      <w:tr>
+        <w:tc>
+          <w:tcPr/>
+          <w:bookmarkStart w:id="28" w:name="tbl-stan-jags-proportion"/>
+          <w:p>
+            <w:pPr>
+              <w:jc w:val="center"/>
+            </w:pPr>
+            <w:pPr>
+              <w:jc w:val="left"/>
+              <w:spacing w:before="200"/>
+              <w:pStyle w:val="ImageCaption"/>
+            </w:pPr>
+            <w:r>
+              <w:t xml:space="preserve">Table 2: Posterior of the proportion from JAGS, Stan and the Beta posterior</w:t>
+            </w:r>
+          </w:p>
+          <w:tbl>
+            <w:tblPr>
+              <w:tblStyle w:val="Table"/>
+              <w:tblW w:type="auto" w:w="0"/>
+              <w:tblLook w:firstRow="1" w:lastRow="0" w:firstColumn="0" w:lastColumn="0" w:noHBand="0" w:noVBand="0" w:val="0020"/>
+            </w:tblPr>
+            <w:tblGrid>
+              <w:gridCol w:w="1980"/>
+              <w:gridCol w:w="1980"/>
+              <w:gridCol w:w="1980"/>
+              <w:gridCol w:w="1980"/>
+            </w:tblGrid>
+            <w:tr>
+              <w:trPr>
+                <w:tblHeader w:val="on"/>
+              </w:trPr>
+              <w:tc>
+                <w:tcPr/>
+                <w:p>
+                  <w:pPr>
+                    <w:pStyle w:val="Compact"/>
+                  </w:pPr>
+                </w:p>
+              </w:tc>
+              <w:tc>
+                <w:tcPr/>
+                <w:p>
+                  <w:pPr>
+                    <w:pStyle w:val="Compact"/>
+                    <w:jc w:val="right"/>
+                    <w:jc w:val="center"/>
+                  </w:pPr>
+                  <w:r>
+                    <w:t xml:space="preserve">Mean</w:t>
+                  </w:r>
+                </w:p>
+              </w:tc>
+              <w:tc>
+                <w:tcPr/>
+                <w:p>
+                  <w:pPr>
+                    <w:pStyle w:val="Compact"/>
+                    <w:jc w:val="right"/>
+                    <w:jc w:val="center"/>
+                  </w:pPr>
+                  <w:r>
+                    <w:t xml:space="preserve">2.5%</w:t>
+                  </w:r>
+                </w:p>
+              </w:tc>
+              <w:tc>
+                <w:tcPr/>
+                <w:p>
+                  <w:pPr>
+                    <w:pStyle w:val="Compact"/>
+                    <w:jc w:val="right"/>
+                    <w:jc w:val="center"/>
+                  </w:pPr>
+                  <w:r>
+                    <w:t xml:space="preserve">97.5%</w:t>
+                  </w:r>
+                </w:p>
+              </w:tc>
+            </w:tr>
+            <w:tr>
+              <w:tc>
+                <w:tcPr/>
+                <w:p>
+                  <w:pPr>
+                    <w:pStyle w:val="Compact"/>
+                    <w:jc w:val="left"/>
+                    <w:jc w:val="center"/>
+                  </w:pPr>
+                  <w:r>
+                    <w:t xml:space="preserve">JAGS</w:t>
+                  </w:r>
+                </w:p>
+              </w:tc>
+              <w:tc>
+                <w:tcPr/>
+                <w:p>
+                  <w:pPr>
+                    <w:pStyle w:val="Compact"/>
+                    <w:jc w:val="right"/>
+                    <w:jc w:val="center"/>
+                  </w:pPr>
+                  <w:r>
+                    <w:t xml:space="preserve">0.601</w:t>
+                  </w:r>
+                </w:p>
+              </w:tc>
+              <w:tc>
+                <w:tcPr/>
+                <w:p>
+                  <w:pPr>
+                    <w:pStyle w:val="Compact"/>
+                    <w:jc w:val="right"/>
+                    <w:jc w:val="center"/>
+                  </w:pPr>
+                  <w:r>
+                    <w:t xml:space="preserve">0.499</w:t>
+                  </w:r>
+                </w:p>
+              </w:tc>
+              <w:tc>
+                <w:tcPr/>
+                <w:p>
+                  <w:pPr>
+                    <w:pStyle w:val="Compact"/>
+                    <w:jc w:val="right"/>
+                    <w:jc w:val="center"/>
+                  </w:pPr>
+                  <w:r>
+                    <w:t xml:space="preserve">0.698</w:t>
+                  </w:r>
+                </w:p>
+              </w:tc>
+            </w:tr>
+            <w:tr>
+              <w:tc>
+                <w:tcPr/>
+                <w:p>
+                  <w:pPr>
+                    <w:pStyle w:val="Compact"/>
+                    <w:jc w:val="left"/>
+                    <w:jc w:val="center"/>
+                  </w:pPr>
+                  <w:r>
+                    <w:t xml:space="preserve">Stan</w:t>
+                  </w:r>
+                </w:p>
+              </w:tc>
+              <w:tc>
+                <w:tcPr/>
+                <w:p>
+                  <w:pPr>
+                    <w:pStyle w:val="Compact"/>
+                    <w:jc w:val="right"/>
+                    <w:jc w:val="center"/>
+                  </w:pPr>
+                  <w:r>
+                    <w:t xml:space="preserve">0.602</w:t>
+                  </w:r>
+                </w:p>
+              </w:tc>
+              <w:tc>
+                <w:tcPr/>
+                <w:p>
+                  <w:pPr>
+                    <w:pStyle w:val="Compact"/>
+                    <w:jc w:val="right"/>
+                    <w:jc w:val="center"/>
+                  </w:pPr>
+                  <w:r>
+                    <w:t xml:space="preserve">0.501</w:t>
+                  </w:r>
+                </w:p>
+              </w:tc>
+              <w:tc>
+                <w:tcPr/>
+                <w:p>
+                  <w:pPr>
+                    <w:pStyle w:val="Compact"/>
+                    <w:jc w:val="right"/>
+                    <w:jc w:val="center"/>
+                  </w:pPr>
+                  <w:r>
+                    <w:t xml:space="preserve">0.698</w:t>
+                  </w:r>
+                </w:p>
+              </w:tc>
+            </w:tr>
+            <w:tr>
+              <w:tc>
+                <w:tcPr/>
+                <w:p>
+                  <w:pPr>
+                    <w:pStyle w:val="Compact"/>
+                    <w:jc w:val="left"/>
+                    <w:jc w:val="center"/>
+                  </w:pPr>
+                  <w:r>
+                    <w:t xml:space="preserve">Beta</w:t>
+                  </w:r>
+                </w:p>
+              </w:tc>
+              <w:tc>
+                <w:tcPr/>
+                <w:p>
+                  <w:pPr>
+                    <w:pStyle w:val="Compact"/>
+                    <w:jc w:val="right"/>
+                    <w:jc w:val="center"/>
+                  </w:pPr>
+                  <w:r>
+                    <w:t xml:space="preserve">0.602</w:t>
+                  </w:r>
+                </w:p>
+              </w:tc>
+              <w:tc>
+                <w:tcPr/>
+                <w:p>
+                  <w:pPr>
+                    <w:pStyle w:val="Compact"/>
+                    <w:jc w:val="right"/>
+                    <w:jc w:val="center"/>
+                  </w:pPr>
+                  <w:r>
+                    <w:t xml:space="preserve">0.501</w:t>
+                  </w:r>
+                </w:p>
+              </w:tc>
+              <w:tc>
+                <w:tcPr/>
+                <w:p>
+                  <w:pPr>
+                    <w:pStyle w:val="Compact"/>
+                    <w:jc w:val="right"/>
+                    <w:jc w:val="center"/>
+                  </w:pPr>
+                  <w:r>
+                    <w:t xml:space="preserve">0.699</w:t>
+                  </w:r>
+                </w:p>
+              </w:tc>
+            </w:tr>
+          </w:tbl>
+          <w:bookmarkEnd w:id="28"/>
+          <w:p/>
+        </w:tc>
+      </w:tr>
+    </w:tbl>
+    <w:p>
+      <w:pPr>
+        <w:pStyle w:val="BodyText"/>
+      </w:pPr>
+      <w:r>
+        <w:t xml:space="preserve">Stan’s split</w:t>
+      </w:r>
+      <w:r>
+        <w:t xml:space="preserve"> </w:t>
+      </w:r>
+      <w:hyperlink r:id="rId12">
+        <w:r>
+          <w:rPr>
+            <w:rStyle w:val="Hyperlink"/>
+          </w:rPr>
+          <w:t xml:space="preserve">potential scale reduction factor</w:t>
+        </w:r>
+      </w:hyperlink>
+      <w:r>
+        <w:t xml:space="preserve"> </w:t>
+      </w:r>
+      <w:r>
+        <w:t xml:space="preserve">is</w:t>
+      </w:r>
+      <w:r>
+        <w:t xml:space="preserve"> </w:t>
+      </w:r>
+      <w:r>
+        <w:t xml:space="preserve">1,</w:t>
+      </w:r>
+      <w:r>
+        <w:t xml:space="preserve"> </w:t>
+      </w:r>
+      <w:r>
+        <w:t xml:space="preserve">and the sampler reports</w:t>
+      </w:r>
+      <w:r>
+        <w:t xml:space="preserve"> </w:t>
+      </w:r>
+      <w:r>
+        <w:t xml:space="preserve">0</w:t>
+      </w:r>
+      <w:r>
+        <w:t xml:space="preserve"> </w:t>
+      </w:r>
+      <w:r>
+        <w:t xml:space="preserve">divergent transitions.</w:t>
+      </w:r>
+      <w:r>
+        <w:t xml:space="preserve"> </w:t>
+      </w:r>
+      <w:r>
+        <w:t xml:space="preserve">As</w:t>
+      </w:r>
+      <w:r>
+        <w:t xml:space="preserve"> </w:t>
+      </w:r>
+      <w:hyperlink w:anchor="tbl-stan-jags-proportion">
+        <w:r>
+          <w:rPr>
+            <w:rStyle w:val="Hyperlink"/>
+          </w:rPr>
+          <w:t xml:space="preserve">Table 2</w:t>
+        </w:r>
+      </w:hyperlink>
+      <w:r>
+        <w:t xml:space="preserve"> </w:t>
+      </w:r>
+      <w:r>
+        <w:t xml:space="preserve">shows,</w:t>
+      </w:r>
+      <w:r>
+        <w:t xml:space="preserve"> </w:t>
+      </w:r>
+      <w:r>
+        <w:t xml:space="preserve">the mean and the interval endpoints from each program differ from those of the Beta</w:t>
+      </w:r>
+      <w:r>
+        <w:t xml:space="preserve"> </w:t>
+      </w:r>
+      <w:hyperlink r:id="rId15">
+        <w:r>
+          <w:rPr>
+            <w:rStyle w:val="Hyperlink"/>
+          </w:rPr>
+          <w:t xml:space="preserve">posterior</w:t>
+        </w:r>
+      </w:hyperlink>
+      <w:r>
+        <w:t xml:space="preserve"> </w:t>
+      </w:r>
+      <w:r>
+        <w:t xml:space="preserve">by at most 0.002.</w:t>
+      </w:r>
+      <w:r>
+        <w:t xml:space="preserve"> </w:t>
+      </w:r>
+      <w:r>
+        <w:t xml:space="preserve">The programs differ in the model code:</w:t>
+      </w:r>
+      <w:r>
+        <w:t xml:space="preserve"> </w:t>
+      </w:r>
+      <w:r>
+        <w:t xml:space="preserve">the Stan program carries the types and ranges of its variables,</w:t>
+      </w:r>
+      <w:r>
+        <w:t xml:space="preserve"> </w:t>
+      </w:r>
+      <w:r>
+        <w:t xml:space="preserve">and it is compiled before it draws.</w:t>
+      </w:r>
+    </w:p>
+    <w:bookmarkEnd w:id="29"/>
+    <w:bookmarkStart w:id="34" w:name="sec-bayes-examples-logistic"/>
+    <w:p>
+      <w:pPr>
+        <w:pStyle w:val="Heading2"/>
+      </w:pPr>
+      <w:r>
+        <w:t xml:space="preserve">3 Binary outcomes: logistic regression</w:t>
       </w:r>
     </w:p>
     <w:p>
@@ -1694,7 +3789,7 @@
       <w:r>
         <w:t xml:space="preserve"> </w:t>
       </w:r>
-      <w:hyperlink r:id="rId15">
+      <w:hyperlink r:id="rId30">
         <w:r>
           <w:rPr>
             <w:rStyle w:val="Hyperlink"/>
@@ -1871,7 +3966,7 @@
       <w:r>
         <w:t xml:space="preserve"> </w:t>
       </w:r>
-      <w:hyperlink r:id="rId16">
+      <w:hyperlink r:id="rId31">
         <w:r>
           <w:rPr>
             <w:rStyle w:val="Hyperlink"/>
@@ -1888,7 +3983,7 @@
         <w:t xml:space="preserve">(Statistical Rethinking 2026, Lecture A09).</w:t>
       </w:r>
     </w:p>
-    <w:bookmarkStart w:id="18" w:name="exm-bayes-logistic"/>
+    <w:bookmarkStart w:id="33" w:name="exm-bayes-logistic"/>
     <w:p>
       <w:pPr>
         <w:pStyle w:val="BodyText"/>
@@ -1898,7 +3993,7 @@
           <w:b/>
           <w:bCs/>
         </w:rPr>
-        <w:t xml:space="preserve">Example 2 (Logistic regression fitted by Bayesian inference)</w:t>
+        <w:t xml:space="preserve">Example 3 (Logistic regression fitted by Bayesian inference)</w:t>
       </w:r>
       <w:r>
         <w:t xml:space="preserve"> </w:t>
@@ -3645,7 +5740,7 @@
       <w:r>
         <w:t xml:space="preserve"> </w:t>
       </w:r>
-      <w:hyperlink r:id="rId17">
+      <w:hyperlink r:id="rId32">
         <w:r>
           <w:rPr>
             <w:rStyle w:val="Hyperlink"/>
@@ -3827,15 +5922,15 @@
         <w:t xml:space="preserve">#&gt;      -0.647       1.183</w:t>
       </w:r>
     </w:p>
-    <w:bookmarkEnd w:id="18"/>
-    <w:bookmarkEnd w:id="19"/>
-    <w:bookmarkStart w:id="22" w:name="sec-bayes-examples-survival"/>
+    <w:bookmarkEnd w:id="33"/>
+    <w:bookmarkEnd w:id="34"/>
+    <w:bookmarkStart w:id="37" w:name="sec-bayes-examples-survival"/>
     <w:p>
       <w:pPr>
         <w:pStyle w:val="Heading2"/>
       </w:pPr>
       <w:r>
-        <w:t xml:space="preserve">3 Survival analysis</w:t>
+        <w:t xml:space="preserve">4 Survival analysis</w:t>
       </w:r>
     </w:p>
     <w:p>
@@ -3893,7 +5988,7 @@
       <w:r>
         <w:t xml:space="preserve"> </w:t>
       </w:r>
-      <w:hyperlink r:id="rId20">
+      <w:hyperlink r:id="rId35">
         <w:r>
           <w:rPr>
             <w:rStyle w:val="Hyperlink"/>
@@ -4655,7 +6750,7 @@
         <w:t xml:space="preserve">positive.</w:t>
       </w:r>
     </w:p>
-    <w:bookmarkStart w:id="21" w:name="exm-bayes-survival"/>
+    <w:bookmarkStart w:id="36" w:name="exm-bayes-survival"/>
     <w:p>
       <w:pPr>
         <w:pStyle w:val="BodyText"/>
@@ -4665,7 +6760,7 @@
           <w:b/>
           <w:bCs/>
         </w:rPr>
-        <w:t xml:space="preserve">Example 3 (Exponential survival regression fitted by Bayesian inference)</w:t>
+        <w:t xml:space="preserve">Example 4 (Exponential survival regression fitted by Bayesian inference)</w:t>
       </w:r>
       <w:r>
         <w:t xml:space="preserve"> </w:t>
@@ -7437,15 +9532,15 @@
         <w:t xml:space="preserve">gives the hazard ratio and its credible interval directly.</w:t>
       </w:r>
     </w:p>
-    <w:bookmarkEnd w:id="21"/>
-    <w:bookmarkEnd w:id="22"/>
-    <w:bookmarkStart w:id="29" w:name="sec-bayes-examples-random-effects"/>
+    <w:bookmarkEnd w:id="36"/>
+    <w:bookmarkEnd w:id="37"/>
+    <w:bookmarkStart w:id="43" w:name="sec-bayes-examples-random-effects"/>
     <w:p>
       <w:pPr>
         <w:pStyle w:val="Heading2"/>
       </w:pPr>
       <w:r>
-        <w:t xml:space="preserve">4 Random effects</w:t>
+        <w:t xml:space="preserve">5 Random effects</w:t>
       </w:r>
     </w:p>
     <w:p>
@@ -7458,7 +9553,7 @@
       <w:r>
         <w:t xml:space="preserve"> </w:t>
       </w:r>
-      <w:hyperlink r:id="rId23">
+      <w:hyperlink r:id="rId38">
         <w:r>
           <w:rPr>
             <w:rStyle w:val="Hyperlink"/>
@@ -7475,7 +9570,7 @@
       <w:r>
         <w:t xml:space="preserve"> </w:t>
       </w:r>
-      <w:hyperlink r:id="rId24">
+      <w:hyperlink r:id="rId39">
         <w:r>
           <w:rPr>
             <w:rStyle w:val="Hyperlink"/>
@@ -7584,7 +9679,7 @@
         <w:t xml:space="preserve"> </w:t>
       </w:r>
       <w:r>
-        <w:t xml:space="preserve">[2]</w:t>
+        <w:t xml:space="preserve">[7]</w:t>
       </w:r>
       <w:r>
         <w:t xml:space="preserve">.</w:t>
@@ -7701,7 +9796,7 @@
         <w:t xml:space="preserve">into every group-level summary.</w:t>
       </w:r>
     </w:p>
-    <w:bookmarkStart w:id="28" w:name="exm-bayes-random-effects"/>
+    <w:bookmarkStart w:id="42" w:name="exm-bayes-random-effects"/>
     <w:p>
       <w:pPr>
         <w:pStyle w:val="BodyText"/>
@@ -7711,7 +9806,7 @@
           <w:b/>
           <w:bCs/>
         </w:rPr>
-        <w:t xml:space="preserve">Example 4 (A random-intercept model fitted by Bayesian inference)</w:t>
+        <w:t xml:space="preserve">Example 5 (A random-intercept model fitted by Bayesian inference)</w:t>
       </w:r>
       <w:r>
         <w:t xml:space="preserve"> </w:t>
@@ -7942,7 +10037,7 @@
       <w:r>
         <w:t xml:space="preserve"> </w:t>
       </w:r>
-      <w:hyperlink r:id="rId25">
+      <w:hyperlink r:id="rId24">
         <w:r>
           <w:rPr>
             <w:rStyle w:val="Hyperlink"/>
@@ -8031,7 +10126,7 @@
       <w:r>
         <w:t xml:space="preserve"> </w:t>
       </w:r>
-      <w:hyperlink r:id="rId26">
+      <w:hyperlink r:id="rId40">
         <w:r>
           <w:rPr>
             <w:rStyle w:val="Hyperlink"/>
@@ -10181,7 +12276,7 @@
       <w:r>
         <w:t xml:space="preserve"> </w:t>
       </w:r>
-      <w:hyperlink r:id="rId27">
+      <w:hyperlink r:id="rId41">
         <w:r>
           <w:rPr>
             <w:rStyle w:val="Hyperlink"/>
@@ -10205,15 +12300,15 @@
         <w:t xml:space="preserve">is pulled furthest toward the overall mean.</w:t>
       </w:r>
     </w:p>
-    <w:bookmarkEnd w:id="28"/>
-    <w:bookmarkEnd w:id="29"/>
-    <w:bookmarkStart w:id="38" w:name="sec-bayes-examples-bma"/>
+    <w:bookmarkEnd w:id="42"/>
+    <w:bookmarkEnd w:id="43"/>
+    <w:bookmarkStart w:id="52" w:name="sec-bayes-examples-bma"/>
     <w:p>
       <w:pPr>
         <w:pStyle w:val="Heading2"/>
       </w:pPr>
       <w:r>
-        <w:t xml:space="preserve">5 Bayesian model averaging</w:t>
+        <w:t xml:space="preserve">6 Bayesian model averaging</w:t>
       </w:r>
     </w:p>
     <w:p>
@@ -10305,7 +12400,7 @@
       <w:r>
         <w:t xml:space="preserve"> </w:t>
       </w:r>
-      <w:hyperlink r:id="rId30">
+      <w:hyperlink r:id="rId44">
         <w:r>
           <w:rPr>
             <w:rStyle w:val="Hyperlink"/>
@@ -10317,7 +12412,7 @@
         <w:t xml:space="preserve">.</w:t>
       </w:r>
     </w:p>
-    <w:bookmarkStart w:id="32" w:name="def-posterior-model-probability"/>
+    <w:bookmarkStart w:id="46" w:name="def-posterior-model-probability"/>
     <w:p>
       <w:pPr>
         <w:pStyle w:val="BodyText"/>
@@ -10456,7 +12551,7 @@
       <w:r>
         <w:t xml:space="preserve"> </w:t>
       </w:r>
-      <w:hyperlink r:id="rId31">
+      <w:hyperlink r:id="rId45">
         <w:r>
           <w:rPr>
             <w:rStyle w:val="Hyperlink"/>
@@ -10547,8 +12642,8 @@
     $$</w:t>
       </w:r>
     </w:p>
-    <w:bookmarkEnd w:id="32"/>
-    <w:bookmarkStart w:id="33" w:name="exm-posterior-model-probability"/>
+    <w:bookmarkEnd w:id="46"/>
+    <w:bookmarkStart w:id="47" w:name="exm-posterior-model-probability"/>
     <w:p>
       <w:pPr>
         <w:pStyle w:val="FirstParagraph"/>
@@ -10558,7 +12653,7 @@
           <w:b/>
           <w:bCs/>
         </w:rPr>
-        <w:t xml:space="preserve">Example 5 (Posterior probabilities of two models)</w:t>
+        <w:t xml:space="preserve">Example 6 (Posterior probabilities of two models)</w:t>
       </w:r>
       <w:r>
         <w:t xml:space="preserve"> </w:t>
@@ -10728,8 +12823,8 @@
         <w:t xml:space="preserve">.</w:t>
       </w:r>
     </w:p>
-    <w:bookmarkEnd w:id="33"/>
-    <w:bookmarkStart w:id="34" w:name="def-bma"/>
+    <w:bookmarkEnd w:id="47"/>
+    <w:bookmarkStart w:id="48" w:name="def-bma"/>
     <w:p>
       <w:pPr>
         <w:pStyle w:val="BodyText"/>
@@ -10870,8 +12965,8 @@
     $$</w:t>
       </w:r>
     </w:p>
-    <w:bookmarkEnd w:id="34"/>
-    <w:bookmarkStart w:id="35" w:name="def-pip"/>
+    <w:bookmarkEnd w:id="48"/>
+    <w:bookmarkStart w:id="49" w:name="def-pip"/>
     <w:p>
       <w:pPr>
         <w:pStyle w:val="FirstParagraph"/>
@@ -10935,8 +13030,8 @@
         <w:t xml:space="preserve">is the total posterior probability of the models that include it.</w:t>
       </w:r>
     </w:p>
-    <w:bookmarkEnd w:id="35"/>
-    <w:bookmarkStart w:id="37" w:name="exm-bayes-bma"/>
+    <w:bookmarkEnd w:id="49"/>
+    <w:bookmarkStart w:id="51" w:name="exm-bayes-bma"/>
     <w:p>
       <w:pPr>
         <w:pStyle w:val="BodyText"/>
@@ -10946,7 +13041,7 @@
           <w:b/>
           <w:bCs/>
         </w:rPr>
-        <w:t xml:space="preserve">Example 6 (A BIC approximation to Bayesian model averaging)</w:t>
+        <w:t xml:space="preserve">Example 7 (A BIC approximation to Bayesian model averaging)</w:t>
       </w:r>
       <w:r>
         <w:t xml:space="preserve"> </w:t>
@@ -10969,7 +13064,7 @@
       <w:r>
         <w:t xml:space="preserve"> </w:t>
       </w:r>
-      <w:hyperlink r:id="rId36">
+      <w:hyperlink r:id="rId50">
         <w:r>
           <w:rPr>
             <w:rStyle w:val="Hyperlink"/>
@@ -10987,13 +13082,13 @@
         <w:t xml:space="preserve"> </w:t>
       </w:r>
       <w:r>
-        <w:t xml:space="preserve">[3]</w:t>
-      </w:r>
-      <w:r>
-        <w:t xml:space="preserve"> </w:t>
-      </w:r>
-      <w:r>
-        <w:t xml:space="preserve">[4]</w:t>
+        <w:t xml:space="preserve">[8]</w:t>
+      </w:r>
+      <w:r>
+        <w:t xml:space="preserve"> </w:t>
+      </w:r>
+      <w:r>
+        <w:t xml:space="preserve">[9]</w:t>
       </w:r>
       <w:r>
         <w:t xml:space="preserve">:</w:t>
@@ -13647,9 +15742,9 @@
         <w:t xml:space="preserve">not because of the averaging.</w:t>
       </w:r>
     </w:p>
-    <w:bookmarkEnd w:id="37"/>
-    <w:bookmarkEnd w:id="38"/>
-    <w:bookmarkStart w:id="48" w:name="references"/>
+    <w:bookmarkEnd w:id="51"/>
+    <w:bookmarkEnd w:id="52"/>
+    <w:bookmarkStart w:id="72" w:name="references"/>
     <w:p>
       <w:pPr>
         <w:pStyle w:val="Heading2"/>
@@ -13658,8 +15753,8 @@
         <w:t xml:space="preserve">References</w:t>
       </w:r>
     </w:p>
-    <w:bookmarkStart w:id="47" w:name="refs"/>
-    <w:bookmarkStart w:id="40" w:name="ref-dobson4e"/>
+    <w:bookmarkStart w:id="71" w:name="refs"/>
+    <w:bookmarkStart w:id="54" w:name="ref-dobson4e"/>
     <w:p>
       <w:pPr>
         <w:pStyle w:val="Bibliography"/>
@@ -13692,7 +15787,7 @@
       <w:r>
         <w:t xml:space="preserve"> </w:t>
       </w:r>
-      <w:hyperlink r:id="rId39">
+      <w:hyperlink r:id="rId53">
         <w:r>
           <w:rPr>
             <w:rStyle w:val="Hyperlink"/>
@@ -13704,8 +15799,8 @@
         <w:t xml:space="preserve">.</w:t>
       </w:r>
     </w:p>
-    <w:bookmarkEnd w:id="40"/>
-    <w:bookmarkStart w:id="42" w:name="Xea103239a4db138db144761a8bb4f764e3355fe"/>
+    <w:bookmarkEnd w:id="54"/>
+    <w:bookmarkStart w:id="56" w:name="ref-carpenter2017stan"/>
     <w:p>
       <w:pPr>
         <w:pStyle w:val="Bibliography"/>
@@ -13720,6 +15815,326 @@
         <w:t xml:space="preserve">	</w:t>
       </w:r>
       <w:r>
+        <w:t xml:space="preserve">B. Carpenter</w:t>
+      </w:r>
+      <w:r>
+        <w:t xml:space="preserve"> </w:t>
+      </w:r>
+      <w:r>
+        <w:rPr>
+          <w:i/>
+          <w:iCs/>
+        </w:rPr>
+        <w:t xml:space="preserve">et al.</w:t>
+      </w:r>
+      <w:r>
+        <w:t xml:space="preserve">,</w:t>
+      </w:r>
+      <w:r>
+        <w:t xml:space="preserve"> </w:t>
+      </w:r>
+      <w:r>
+        <w:t xml:space="preserve">“Stan: A probabilistic programming language,”</w:t>
+      </w:r>
+      <w:r>
+        <w:t xml:space="preserve"> </w:t>
+      </w:r>
+      <w:r>
+        <w:rPr>
+          <w:i/>
+          <w:iCs/>
+        </w:rPr>
+        <w:t xml:space="preserve">Journal of Statistical Software</w:t>
+      </w:r>
+      <w:r>
+        <w:t xml:space="preserve">, vol. 76, no. 1, pp. 1–32, 2017, doi:</w:t>
+      </w:r>
+      <w:r>
+        <w:t xml:space="preserve"> </w:t>
+      </w:r>
+      <w:hyperlink r:id="rId55">
+        <w:r>
+          <w:rPr>
+            <w:rStyle w:val="Hyperlink"/>
+          </w:rPr>
+          <w:t xml:space="preserve">10.18637/jss.v076.i01</w:t>
+        </w:r>
+      </w:hyperlink>
+      <w:r>
+        <w:t xml:space="preserve">.</w:t>
+      </w:r>
+    </w:p>
+    <w:bookmarkEnd w:id="56"/>
+    <w:bookmarkStart w:id="58" w:name="ref-plummer2003jags"/>
+    <w:p>
+      <w:pPr>
+        <w:pStyle w:val="Bibliography"/>
+      </w:pPr>
+      <w:r>
+        <w:t xml:space="preserve">[3]</w:t>
+      </w:r>
+      <w:r>
+        <w:t xml:space="preserve"> </w:t>
+      </w:r>
+      <w:r>
+        <w:t xml:space="preserve">	</w:t>
+      </w:r>
+      <w:r>
+        <w:t xml:space="preserve">M. Plummer,</w:t>
+      </w:r>
+      <w:r>
+        <w:t xml:space="preserve"> </w:t>
+      </w:r>
+      <w:r>
+        <w:t xml:space="preserve">“</w:t>
+      </w:r>
+      <w:r>
+        <w:t xml:space="preserve">JAGS</w:t>
+      </w:r>
+      <w:r>
+        <w:t xml:space="preserve">: A program for analysis of</w:t>
+      </w:r>
+      <w:r>
+        <w:t xml:space="preserve"> </w:t>
+      </w:r>
+      <w:r>
+        <w:t xml:space="preserve">Bayesian</w:t>
+      </w:r>
+      <w:r>
+        <w:t xml:space="preserve"> </w:t>
+      </w:r>
+      <w:r>
+        <w:t xml:space="preserve">graphical models using</w:t>
+      </w:r>
+      <w:r>
+        <w:t xml:space="preserve"> </w:t>
+      </w:r>
+      <w:r>
+        <w:t xml:space="preserve">Gibbs</w:t>
+      </w:r>
+      <w:r>
+        <w:t xml:space="preserve"> </w:t>
+      </w:r>
+      <w:r>
+        <w:t xml:space="preserve">sampling,”</w:t>
+      </w:r>
+      <w:r>
+        <w:t xml:space="preserve"> </w:t>
+      </w:r>
+      <w:r>
+        <w:t xml:space="preserve">in</w:t>
+      </w:r>
+      <w:r>
+        <w:t xml:space="preserve"> </w:t>
+      </w:r>
+      <w:r>
+        <w:rPr>
+          <w:i/>
+          <w:iCs/>
+        </w:rPr>
+        <w:t xml:space="preserve">Proceedings of the 3rd international workshop on distributed statistical computing</w:t>
+      </w:r>
+      <w:r>
+        <w:t xml:space="preserve">, 2003. Available:</w:t>
+      </w:r>
+      <w:r>
+        <w:t xml:space="preserve"> </w:t>
+      </w:r>
+      <w:hyperlink r:id="rId57">
+        <w:r>
+          <w:rPr>
+            <w:rStyle w:val="Hyperlink"/>
+          </w:rPr>
+          <w:t xml:space="preserve">https://www.r-project.org/conferences/DSC-2003/Proceedings/Plummer.pdf</w:t>
+        </w:r>
+      </w:hyperlink>
+    </w:p>
+    <w:bookmarkEnd w:id="58"/>
+    <w:bookmarkStart w:id="60" w:name="ref-plummer2017jagsmanual"/>
+    <w:p>
+      <w:pPr>
+        <w:pStyle w:val="Bibliography"/>
+      </w:pPr>
+      <w:r>
+        <w:t xml:space="preserve">[4]</w:t>
+      </w:r>
+      <w:r>
+        <w:t xml:space="preserve"> </w:t>
+      </w:r>
+      <w:r>
+        <w:t xml:space="preserve">	</w:t>
+      </w:r>
+      <w:r>
+        <w:t xml:space="preserve">M. Plummer,</w:t>
+      </w:r>
+      <w:r>
+        <w:t xml:space="preserve"> </w:t>
+      </w:r>
+      <w:r>
+        <w:rPr>
+          <w:i/>
+          <w:iCs/>
+        </w:rPr>
+        <w:t xml:space="preserve">JAGS</w:t>
+      </w:r>
+      <w:r>
+        <w:rPr>
+          <w:i/>
+          <w:iCs/>
+        </w:rPr>
+        <w:t xml:space="preserve"> </w:t>
+      </w:r>
+      <w:r>
+        <w:rPr>
+          <w:i/>
+          <w:iCs/>
+        </w:rPr>
+        <w:t xml:space="preserve">version 4.3.0 user manual</w:t>
+      </w:r>
+      <w:r>
+        <w:t xml:space="preserve">. 2017. Available:</w:t>
+      </w:r>
+      <w:r>
+        <w:t xml:space="preserve"> </w:t>
+      </w:r>
+      <w:hyperlink r:id="rId59">
+        <w:r>
+          <w:rPr>
+            <w:rStyle w:val="Hyperlink"/>
+          </w:rPr>
+          <w:t xml:space="preserve">https://sourceforge.net/projects/mcmc-jags/files/Manuals/4.x/</w:t>
+        </w:r>
+      </w:hyperlink>
+    </w:p>
+    <w:bookmarkEnd w:id="60"/>
+    <w:bookmarkStart w:id="62" w:name="ref-hoffman2014nuts"/>
+    <w:p>
+      <w:pPr>
+        <w:pStyle w:val="Bibliography"/>
+      </w:pPr>
+      <w:r>
+        <w:t xml:space="preserve">[5]</w:t>
+      </w:r>
+      <w:r>
+        <w:t xml:space="preserve"> </w:t>
+      </w:r>
+      <w:r>
+        <w:t xml:space="preserve">	</w:t>
+      </w:r>
+      <w:r>
+        <w:t xml:space="preserve">M. D. Hoffman and A. Gelman,</w:t>
+      </w:r>
+      <w:r>
+        <w:t xml:space="preserve"> </w:t>
+      </w:r>
+      <w:r>
+        <w:t xml:space="preserve">“The</w:t>
+      </w:r>
+      <w:r>
+        <w:t xml:space="preserve"> </w:t>
+      </w:r>
+      <w:r>
+        <w:t xml:space="preserve">No-U-Turn</w:t>
+      </w:r>
+      <w:r>
+        <w:t xml:space="preserve"> </w:t>
+      </w:r>
+      <w:r>
+        <w:t xml:space="preserve">sampler: Adaptively setting path lengths in</w:t>
+      </w:r>
+      <w:r>
+        <w:t xml:space="preserve"> </w:t>
+      </w:r>
+      <w:r>
+        <w:t xml:space="preserve">Hamiltonian Monte Carlo</w:t>
+      </w:r>
+      <w:r>
+        <w:t xml:space="preserve">,”</w:t>
+      </w:r>
+      <w:r>
+        <w:t xml:space="preserve"> </w:t>
+      </w:r>
+      <w:r>
+        <w:rPr>
+          <w:i/>
+          <w:iCs/>
+        </w:rPr>
+        <w:t xml:space="preserve">Journal of Machine Learning Research</w:t>
+      </w:r>
+      <w:r>
+        <w:t xml:space="preserve">, vol. 15, no. 47, pp. 1593–1623, 2014, Available:</w:t>
+      </w:r>
+      <w:r>
+        <w:t xml:space="preserve"> </w:t>
+      </w:r>
+      <w:hyperlink r:id="rId61">
+        <w:r>
+          <w:rPr>
+            <w:rStyle w:val="Hyperlink"/>
+          </w:rPr>
+          <w:t xml:space="preserve">https://jmlr.org/papers/v15/hoffman14a.html</w:t>
+        </w:r>
+      </w:hyperlink>
+    </w:p>
+    <w:bookmarkEnd w:id="62"/>
+    <w:bookmarkStart w:id="64" w:name="ref-stanusersguide"/>
+    <w:p>
+      <w:pPr>
+        <w:pStyle w:val="Bibliography"/>
+      </w:pPr>
+      <w:r>
+        <w:t xml:space="preserve">[6]</w:t>
+      </w:r>
+      <w:r>
+        <w:t xml:space="preserve"> </w:t>
+      </w:r>
+      <w:r>
+        <w:t xml:space="preserve">	</w:t>
+      </w:r>
+      <w:r>
+        <w:t xml:space="preserve">Stan Development Team,</w:t>
+      </w:r>
+      <w:r>
+        <w:t xml:space="preserve"> </w:t>
+      </w:r>
+      <w:r>
+        <w:rPr>
+          <w:i/>
+          <w:iCs/>
+        </w:rPr>
+        <w:t xml:space="preserve">Stan user’s guide</w:t>
+      </w:r>
+      <w:r>
+        <w:t xml:space="preserve">. 2026. Available:</w:t>
+      </w:r>
+      <w:r>
+        <w:t xml:space="preserve"> </w:t>
+      </w:r>
+      <w:hyperlink r:id="rId63">
+        <w:r>
+          <w:rPr>
+            <w:rStyle w:val="Hyperlink"/>
+          </w:rPr>
+          <w:t xml:space="preserve">https://mc-stan.org/docs/stan-users-guide/</w:t>
+        </w:r>
+      </w:hyperlink>
+    </w:p>
+    <w:bookmarkEnd w:id="64"/>
+    <w:bookmarkStart w:id="66" w:name="Xea103239a4db138db144761a8bb4f764e3355fe"/>
+    <w:p>
+      <w:pPr>
+        <w:pStyle w:val="Bibliography"/>
+      </w:pPr>
+      <w:r>
+        <w:t xml:space="preserve">[7]</w:t>
+      </w:r>
+      <w:r>
+        <w:t xml:space="preserve"> </w:t>
+      </w:r>
+      <w:r>
+        <w:t xml:space="preserve">	</w:t>
+      </w:r>
+      <w:r>
         <w:t xml:space="preserve">Wikipedia contributors,</w:t>
       </w:r>
       <w:r>
@@ -13752,7 +16167,7 @@
       <w:r>
         <w:t xml:space="preserve"> </w:t>
       </w:r>
-      <w:hyperlink r:id="rId41">
+      <w:hyperlink r:id="rId65">
         <w:r>
           <w:rPr>
             <w:rStyle w:val="Hyperlink"/>
@@ -13761,14 +16176,14 @@
         </w:r>
       </w:hyperlink>
     </w:p>
-    <w:bookmarkEnd w:id="42"/>
-    <w:bookmarkStart w:id="44" w:name="ref-schwarz1978estimating"/>
+    <w:bookmarkEnd w:id="66"/>
+    <w:bookmarkStart w:id="68" w:name="ref-schwarz1978estimating"/>
     <w:p>
       <w:pPr>
         <w:pStyle w:val="Bibliography"/>
       </w:pPr>
       <w:r>
-        <w:t xml:space="preserve">[3]</w:t>
+        <w:t xml:space="preserve">[8]</w:t>
       </w:r>
       <w:r>
         <w:t xml:space="preserve"> </w:t>
@@ -13801,7 +16216,7 @@
       <w:r>
         <w:t xml:space="preserve"> </w:t>
       </w:r>
-      <w:hyperlink r:id="rId43">
+      <w:hyperlink r:id="rId67">
         <w:r>
           <w:rPr>
             <w:rStyle w:val="Hyperlink"/>
@@ -13813,14 +16228,14 @@
         <w:t xml:space="preserve">.</w:t>
       </w:r>
     </w:p>
-    <w:bookmarkEnd w:id="44"/>
-    <w:bookmarkStart w:id="46" w:name="Xa584536cae7abc3c1159cccbd47cc37873a4d27"/>
+    <w:bookmarkEnd w:id="68"/>
+    <w:bookmarkStart w:id="70" w:name="Xa584536cae7abc3c1159cccbd47cc37873a4d27"/>
     <w:p>
       <w:pPr>
         <w:pStyle w:val="Bibliography"/>
       </w:pPr>
       <w:r>
-        <w:t xml:space="preserve">[4]</w:t>
+        <w:t xml:space="preserve">[9]</w:t>
       </w:r>
       <w:r>
         <w:t xml:space="preserve"> </w:t>
@@ -13861,7 +16276,7 @@
       <w:r>
         <w:t xml:space="preserve"> </w:t>
       </w:r>
-      <w:hyperlink r:id="rId45">
+      <w:hyperlink r:id="rId69">
         <w:r>
           <w:rPr>
             <w:rStyle w:val="Hyperlink"/>
@@ -13870,9 +16285,9 @@
         </w:r>
       </w:hyperlink>
     </w:p>
-    <w:bookmarkEnd w:id="46"/>
-    <w:bookmarkEnd w:id="47"/>
-    <w:bookmarkEnd w:id="48"/>
+    <w:bookmarkEnd w:id="70"/>
+    <w:bookmarkEnd w:id="71"/>
+    <w:bookmarkEnd w:id="72"/>
     <w:sectPr>
       <w:footnotePr>
         <w:numRestart w:val="eachSect"/>

</xml_diff>